<commit_message>
Reconstrucción tras las correcciones del panel; punto 43 del registro y ESTADO.md al día
./construir.sh: 166 páginas (162 de cuerpo), TOC 40/40 estable entre pasadas, cotejo de figuras sin derivas y
comprobar.py con 0 problemas (162 referencias, 15 figuras, cero comillas rectas). Las páginas corregidas se revisaron
en el PDF. lector/libro.json reconstruido: 1065 bloques, 34 marcados como cambiados.

README: punto 43 con las correcciones. ESTADO.md: cifras nuevas (58.414 palabras), la evaluación vigente (6,1, panel
de seis expertos) y las cuatro decisiones que dejó para el autor (la madrugada de Carmen, la página legal, la viñeta
5, la saturación del Taller 2B), además de lo que más subiría la nota.

Co-Authored-By: Claude Opus 5.5 <noreply@anthropic.com>
Claude-Session: https://claude.ai/code/session_01SPkhDdVzUCxJwqq61ddeLW
</commit_message>
<xml_diff>
--- a/Hechos_inferencias_incertidumbre_edicion_revisada.docx
+++ b/Hechos_inferencias_incertidumbre_edicion_revisada.docx
@@ -2877,7 +2877,7 @@
         <w:pStyle w:val="BodyJ"/>
       </w:pPr>
       <w:r>
-        <w:t xml:space="preserve">El diagnóstico no aparece contenido dentro del dato. Se propone como la explicación que mejor organiza un conjunto de hallazgos. Peirce describió este movimiento —que en 1878 llamó «hipótesis» y en sus lecciones de 1903 bautizó «abducción»— como la operación por la cual formulamos una conjetura capaz de hacer inteligible un hecho sorprendente. La deducción deriva consecuencias de una regla; la inducción aprende regularidades desde casos; la abducción pregunta qué explicación, si fuera verdadera, volvería esperable lo observado (Peirce, 1878).</w:t>
+        <w:t xml:space="preserve">El diagnóstico no aparece contenido dentro del dato. Se propone como la explicación que mejor organiza un conjunto de hallazgos. Peirce describió este movimiento —que en 1878 llamó «hipótesis» (Peirce, 1878) y en sus lecciones de 1903 bautizó «abducción»— como la operación por la cual formulamos una conjetura capaz de hacer inteligible un hecho sorprendente. La deducción deriva consecuencias de una regla; la inducción aprende regularidades desde casos; la abducción pregunta qué explicación, si fuera verdadera, volvería esperable lo observado (Peirce, 1934, CP 5.189).</w:t>
       </w:r>
     </w:p>
     <w:p>
@@ -3037,37 +3037,6 @@
     </w:p>
     <w:p>
       <w:pPr>
-        <w:pStyle w:val="TallerHead"/>
-      </w:pPr>
-      <w:r>
-        <w:t xml:space="preserve">Taller 2B. Cinco hipótesis en tres minutos</w:t>
-      </w:r>
-    </w:p>
-    <w:p>
-      <w:pPr>
-        <w:pStyle w:val="BodyJ"/>
-      </w:pPr>
-      <w:r>
-        <w:t xml:space="preserve">Un paciente con EPOC conocido consulta por disnea que no ha respondido a dos rondas de broncodilatadores en urgencias. La saturación es 89%, la auscultación muestra escasas sibilancias. Tome tres minutos y un papel: (a) genere al menos cinco hipótesis sin censurar ninguna, (b) escriba una reformulación del problema que no use la palabra «EPOC», (c) recién entonces pode con las cuatro preguntas de la prueba de resistencia.</w:t>
-      </w:r>
-    </w:p>
-    <w:p>
-      <w:pPr>
-        <w:pStyle w:val="BodyJ"/>
-      </w:pPr>
-      <w:r>
-        <w:rPr>
-          <w:i/>
-          <w:iCs/>
-        </w:rPr>
-        <w:t xml:space="preserve">Solución comentada.</w:t>
-      </w:r>
-      <w:r>
-        <w:t xml:space="preserve"> Una lista generativa sin censura inicial incluye: tromboembolismo pulmonar (el EPOC y la inmovilidad aumentan el riesgo, y la escasez de sibilancias no explica una saturación de 89%), neumotórax secundario a ruptura de bula, edema pulmonar cardiogénico, neumonía basal oculta, síndrome coronario agudo con equivalente disneico, anemia severa o fatiga muscular respiratoria. La reformulación que replantea el problema (problem setting) es: «insuficiencia respiratoria hipoxémica aguda desproporcionada al broncoespasmo auscultado». Ese giro lingüístico desactiva el reflejo de indicar una tercera tanda de nebulizaciones y abre el espacio mental donde viven el TEP y el neumotórax. Nótese la secuencia: primero volumen divergente sin filtro —pues la autocensura temprana es el motor del cierre prematuro— y recién después poda severa contra los datos del caso. Tres minutos de generación libre cuestan mucho menos que veinticuatro horas de anclaje.</w:t>
-      </w:r>
-    </w:p>
-    <w:p>
-      <w:pPr>
         <w:pStyle w:val="Heading3"/>
         <w:spacing w:after="120" w:before="280"/>
       </w:pPr>
@@ -3153,7 +3122,7 @@
         <w:pStyle w:val="BodyJ"/>
       </w:pPr>
       <w:r>
-        <w:t xml:space="preserve">La abducción elige la explicación más plausible; la predicción pregunta qué debería observarse después; la decisión evalúa qué acción es preferible aun si la explicación permanece abierta. En ocasiones varias etiologías convergen en el mismo manejo inicial. En otras, una pequeña diferencia causal cambia por completo la conducta. El diagnóstico diferencial debe organizarse, entonces, según discriminación clínica y no sólo semejanza nominal.</w:t>
+        <w:t xml:space="preserve">La abducción propone las explicaciones y la prueba de resistencia retiene la más plausible; la predicción pregunta qué debería observarse después; la decisión evalúa qué acción es preferible aun si la explicación permanece abierta. En ocasiones varias etiologías convergen en el mismo manejo inicial. En otras, una pequeña diferencia causal cambia por completo la conducta. El diagnóstico diferencial debe organizarse, entonces, según discriminación clínica y no sólo semejanza nominal.</w:t>
       </w:r>
     </w:p>
     <w:p>
@@ -3209,6 +3178,37 @@
       </w:pPr>
       <w:r>
         <w:t xml:space="preserve">La diferencia es operativa: «TAC descarta complicación» apaga las alarmas del equipo; la reescritura especifica qué amenaza sigue viva, qué parámetros obligan a reevaluar (reaparición del dolor, defensa abdominal, ascenso del lactato) y qué autoriza realmente el examen (no entrar a pabellón esta madrugada, no archivar el problema quirúrgico). Nótese el patrón general: el hallazgo negativo se limita al rendimiento del método y al momento; la conducta se justifica por umbral, no por exclusión ontológica.</w:t>
+      </w:r>
+    </w:p>
+    <w:p>
+      <w:pPr>
+        <w:pStyle w:val="TallerHead"/>
+      </w:pPr>
+      <w:r>
+        <w:t xml:space="preserve">Taller 2B. Cinco hipótesis en tres minutos</w:t>
+      </w:r>
+    </w:p>
+    <w:p>
+      <w:pPr>
+        <w:pStyle w:val="BodyJ"/>
+      </w:pPr>
+      <w:r>
+        <w:t xml:space="preserve">Un paciente con EPOC conocido consulta por disnea que no ha respondido a dos rondas de broncodilatadores en urgencias. La saturación es 89%, la auscultación muestra escasas sibilancias. Tome tres minutos y un papel: (a) genere al menos cinco hipótesis sin censurar ninguna, (b) escriba una reformulación del problema que no use la palabra «EPOC», (c) recién entonces pode con las cuatro preguntas de la prueba de resistencia.</w:t>
+      </w:r>
+    </w:p>
+    <w:p>
+      <w:pPr>
+        <w:pStyle w:val="BodyJ"/>
+      </w:pPr>
+      <w:r>
+        <w:rPr>
+          <w:i/>
+          <w:iCs/>
+        </w:rPr>
+        <w:t xml:space="preserve">Solución comentada.</w:t>
+      </w:r>
+      <w:r>
+        <w:t xml:space="preserve"> Una lista generativa sin censura inicial incluye: tromboembolismo pulmonar (el EPOC y la inmovilidad aumentan el riesgo, y la escasez de sibilancias no explica una saturación de 89%), neumotórax secundario a ruptura de bula, edema pulmonar cardiogénico, neumonía basal oculta, síndrome coronario agudo con equivalente disneico, anemia severa o fatiga muscular respiratoria. La reformulación que replantea el problema (problem setting) es: «insuficiencia respiratoria hipoxémica aguda desproporcionada al broncoespasmo auscultado». Ese giro lingüístico desactiva el reflejo de indicar una tercera tanda de nebulizaciones y abre el espacio mental donde viven el TEP y el neumotórax. Nótese la secuencia: primero volumen divergente sin filtro —pues la autocensura temprana es el motor del cierre prematuro— y recién después poda severa contra los datos del caso. Tres minutos de generación libre cuestan mucho menos que veinticuatro horas de anclaje. La poda, con las cuatro preguntas de la prueba de resistencia: el dato más difícil de explicar con otra exacerbación de EPOC es una disnea que no cede con dos rondas de broncodilatadores y casi sin sibilancias, que es justo el hallazgo que la exacerbación haría esperar y no está. El tromboembolismo pulmonar y el neumotórax explican ambos datos y cambiarían la conducta (anticoagular, drenar), así que encabezan la lista; la neumonía, el edema pulmonar, el síndrome coronario y la anemia quedan a una radiografía, un electrocardiograma con troponina y un hemograma de distancia. También queda escrito qué cambiaría la jerarquía: un neumotórax en la radiografía la resuelve; su ausencia deja arriba al tromboembolismo.</w:t>
       </w:r>
     </w:p>
     <w:p>
@@ -5269,7 +5269,7 @@
         <w:pStyle w:val="BodyJ"/>
       </w:pPr>
       <w:r>
-        <w:t xml:space="preserve">La calibración compara confianza y desempeño a lo largo de múltiples decisiones. Es difícil obtenerla en clínica porque el desenlace puede tardar, permanecer ambiguo o no regresar al médico. La falta de retroalimentación favorece una ilusión de competencia: recordamos diagnósticos confirmados y perdemos de vista casos que evolucionaron en otro lugar. La National Academies destacó la necesidad de sistemas que entreguen feedback diagnóstico y permitan aprender de errores y casi errores (National Academies of Sciences, Engineering, and Medicine, 2015).</w:t>
+        <w:t xml:space="preserve">La calibración compara confianza y desempeño a lo largo de múltiples decisiones. Es difícil obtenerla en clínica porque el desenlace puede tardar, permanecer ambiguo o no regresar al médico. La falta de retroalimentación favorece una ilusión de competencia: recordamos diagnósticos confirmados y perdemos de vista casos que evolucionaron en otro lugar. Las National Academies destacaron la necesidad de sistemas que entreguen feedback diagnóstico y permitan aprender de errores y casi errores (National Academies of Sciences, Engineering, and Medicine, 2015).</w:t>
       </w:r>
     </w:p>
     <w:tbl>
@@ -6006,7 +6006,7 @@
         <w:pStyle w:val="BodyJ"/>
       </w:pPr>
       <w:r>
-        <w:t xml:space="preserve">Los estudios de errores diagnósticos muestran combinaciones de fallas en historia, examen, interpretación, seguimiento y comunicación (Graber et al., 2005; Schiff et al., 2009). La National Academies definió el diagnóstico como un proceso iterativo y de equipo, no como un acto mental instantáneo (National Academies of Sciences, Engineering, and Medicine, 2015). El error debe reconstruirse como trayectoria: qué información existía, quién la recibió, cómo fue representada, qué decisiones se tomaron, qué feedback faltó y cuándo habría sido posible corregir.</w:t>
+        <w:t xml:space="preserve">Los estudios de errores diagnósticos muestran combinaciones de fallas en historia, examen, interpretación, seguimiento y comunicación (Graber et al., 2005; Schiff et al., 2009). Las National Academies definieron el diagnóstico como un proceso iterativo y de equipo, no como un acto mental instantáneo (National Academies of Sciences, Engineering, and Medicine, 2015). El error debe reconstruirse como trayectoria: qué información existía, quién la recibió, cómo fue representada, qué decisiones se tomaron, qué feedback faltó y cuándo habría sido posible corregir.</w:t>
       </w:r>
     </w:p>
     <w:p>
@@ -6858,7 +6858,7 @@
         <w:t xml:space="preserve">Solución comentada.</w:t>
       </w:r>
       <w:r>
-        <w:t xml:space="preserve"> El ejercicio funciona por sustracción: la etiqueta organiza la percepción, y quitarla obliga a re-observar. En el caso de la cama 12, la reformulación hizo visible que (a) los «síntomas urinarios» eran inevaluables —dato clave que la palabra «pielonefritis» ocultaba—, (b) los marcadores inflamatorios tenían una explicación alternativa activa (neoplasia), y (c) la «buena respuesta» era atribuible al menos a dos causas. Nada de eso exige cambiar el tratamiento hoy; exige saber qué se vigila y qué reabriría el caso. Si al hacer el ejercicio con su propio paciente no reaparece ningún dato, enhorabuena: la etiqueta probablemente está bien puesta. El costo fueron cinco minutos; el beneficio, saberlo.</w:t>
+        <w:t xml:space="preserve"> El ejercicio funciona por sustracción: la etiqueta organiza la percepción, y quitarla obliga a re-observar. En el caso de la cama 12, la reformulación hizo visible que (a) los «síntomas urinarios» eran inevaluables —dato clave que la palabra «pielonefritis» ocultaba—, (b) los marcadores inflamatorios tenían una explicación alternativa activa (neoplasia), y (c) la «buena respuesta» era atribuible al menos a dos causas. En la cama 12 eso cambió el plan: era una bacteriuria asociada a sonda, el antibiótico se suspendió y quedó una vigilancia con criterios de reapertura (capítulo 12). Otras veces el ejercicio no exige cambiar el tratamiento hoy; exige saber qué se vigila y qué reabriría el caso. Si al hacer el ejercicio con su propio paciente no reaparece ningún dato, enhorabuena: la etiqueta probablemente está bien puesta. El costo fueron cinco minutos; el beneficio, saberlo.</w:t>
       </w:r>
     </w:p>
     <w:p>
@@ -7153,7 +7153,7 @@
         <w:pStyle w:val="BodyJ"/>
       </w:pPr>
       <w:r>
-        <w:t xml:space="preserve">En términos HII, un resultado de investigación es un hecho acerca de una población estudiada. Su aplicabilidad al caso es una inferencia. El grado de transportabilidad permanece incierto. La conducta surge al integrar esa incertidumbre con la magnitud del beneficio esperado, el daño posible, la reversibilidad y las preferencias. Confundir esas capas produce frases como «está indicado por evidencia». Lo demostrado es más limitado: «en pacientes comparables, esta estrategia redujo cierto desenlace; en esta paciente el beneficio absoluto probablemente sea menor y debe ponderarse frente a un riesgo adverso mayor».</w:t>
+        <w:t xml:space="preserve">En términos HII, un resultado de investigación es un hecho acerca de una población estudiada. Su aplicabilidad al caso es una inferencia. El grado de transportabilidad permanece incierto. La conducta surge al integrar esa incertidumbre con la magnitud del beneficio esperado, el daño posible, la reversibilidad y las preferencias. Confundir esas capas produce frases como «está indicado por evidencia». Lo demostrado es más limitado: «en pacientes comparables, esta estrategia redujo cierto desenlace; en esta paciente el beneficio absoluto probablemente sea mayor, y debe ponderarse frente a un riesgo adverso también mayor».</w:t>
       </w:r>
     </w:p>
     <w:p>
@@ -7186,7 +7186,7 @@
         <w:pStyle w:val="BodyJ"/>
       </w:pPr>
       <w:r>
-        <w:t xml:space="preserve">La respuesta madura del propio grupo no fue proclamar victoria ni acatar el veredicto: fue refinar la hipótesis —fenotipos hemodinámicos, un algoritmo personalizado— y volver a someterla a una prueba más severa. Seis años después, el segundo ensayo, ahora en 86 centros de 19 países, mostró que la estrategia personalizada guiada por llene capilar era superior al cuidado habitual (Hernández et al., 2025). La saga deja tres lecciones. Un ensayo no se lee solo, porque el marco inferencial es parte de la lectura. «No significativo» no significa «sin efecto», y tratarlos como sinónimos es una decisión con costos. Y la incertidumbre residual no se resuelve con retórica, sino con la siguiente pregunta bien diseñada. Hay una cuarta lección que excede la epistemología: esa ciencia de primera línea se hizo desde América Latina, coordinada desde Chile — el mismo continente clínico desde el que escribo.</w:t>
+        <w:t xml:space="preserve">La respuesta madura del propio grupo no fue proclamar victoria ni acatar el veredicto: fue refinar la hipótesis —fenotipos hemodinámicos, un algoritmo personalizado— y volver a someterla a una prueba más severa. Seis años después, el segundo ensayo, ahora en 86 centros de 19 países, mostró que la estrategia personalizada guiada por llene capilar era superior al cuidado habitual en un desenlace jerárquico que combinaba mortalidad, días de soporte vital y estadía hospitalaria; la ventaja vino de menos días de soporte vital, con la misma mortalidad a 28 días (Hernández et al., 2025). La saga deja tres lecciones. Un ensayo no se lee solo, porque el marco inferencial es parte de la lectura. «No significativo» no significa «sin efecto», y tratarlos como sinónimos es una decisión con costos. Y la incertidumbre residual no se resuelve con retórica, sino con la siguiente pregunta bien diseñada. Hay una cuarta lección que excede la epistemología: esa ciencia de primera línea se hizo desde América Latina, coordinada desde Chile — el mismo continente clínico desde el que escribo.</w:t>
       </w:r>
     </w:p>
     <w:tbl>
@@ -7711,7 +7711,7 @@
         <w:t xml:space="preserve">ya es suficiente</w:t>
       </w:r>
       <w:r>
-        <w:t xml:space="preserve"> exige ponderar qué tan grave sería equivocarse, y esa ponderación es un juicio de valor (Rudner, 1953, p. 2). Heather Douglas llamó a esto riesgo inductivo (inductive risk) y sostuvo que atraviesa toda la ciencia con consecuencias prácticas. Cuánta evidencia se exige antes de afirmar que un compuesto es tóxico depende de qué error —afirmar de más o afirmar de menos— produce más daño (Douglas, 2000, pp. 565-577).</w:t>
+        <w:t xml:space="preserve"> exige ponderar qué tan grave sería equivocarse, y esa ponderación es un juicio de valor (Rudner, 1953, p. 2). Carl Hempel llamó a esto riesgo inductivo (inductive risk; Hempel, 1965). Heather Douglas mostró que ese riesgo no aparece sólo al final, cuando se acepta una conclusión, sino en las etapas internas de la investigación: qué método elegir, cómo caracterizar un dato ambiguo, cómo interpretarlo. En cada una, cuánta evidencia se exige antes de afirmar que un compuesto es tóxico depende de qué error —afirmar de más o afirmar de menos— produce más daño; su caso son las láminas de hígado de rata con que se fijó la toxicidad de la dioxina, leídas por patólogos distintos con resultados distintos (Douglas, 2000, pp. 565-577).</w:t>
       </w:r>
     </w:p>
     <w:p>
@@ -7727,7 +7727,7 @@
         <w:pStyle w:val="BodyJ"/>
       </w:pPr>
       <w:r>
-        <w:t xml:space="preserve">Esta fundamentación tiene una consecuencia liberadora. Reconocer que hay valores dentro del umbral no corrompe la objetividad clínica; la localiza. Los hechos y las probabilidades se estiman con toda la disciplina de la Parte I; el punto de corte se delibera —con el paciente cuando es posible— y se declara. Lo indefendible no es que haya valores en la decisión: es esconderlos detrás de una retórica de pura evidencia.</w:t>
+        <w:t xml:space="preserve">Esta fundamentación tiene una consecuencia liberadora. Reconocer que hay valores dentro del umbral no corrompe la objetividad clínica; la localiza. Los hechos y las probabilidades se estiman con toda la disciplina de la Parte I, aunque tampoco ahí falta el valor: cuánta evidencia se pide antes de dar algo por hecho depende de lo que cuesta equivocarse, y por eso la capa de hechos declara su fuente y su método. El punto de corte se delibera —con el paciente cuando es posible— y se declara. Lo indefendible no es que haya valores en la decisión: es esconderlos detrás de una retórica de pura evidencia.</w:t>
       </w:r>
     </w:p>
     <w:p>
@@ -8531,7 +8531,7 @@
         <w:pStyle w:val="BodyJ"/>
       </w:pPr>
       <w:r>
-        <w:t xml:space="preserve">El copiado automático amenaza esta función. Una formulación inicial se reproduce durante días, aun cuando la evidencia cambió. El registro deja de representar el estado actual y se transforma en fósil narrativo. La magnitud del fenómeno ya fue medida. En 23.630 notas de evolución hospitalarias con trazabilidad de cada carácter, sólo el 18% del texto había sido escrito a mano; el 46% venía copiado de notas previas y el 36% importado automáticamente desde otras partes del registro (Wang et al., 2017). Cuatro de cada cinco palabras de una evolución típica no fueron pensadas el día en que aparecen firmadas. Cada evolución debería responder qué cambió en hechos, interpretación, incertidumbre y plan.</w:t>
+        <w:t xml:space="preserve">El copiado automático amenaza esta función. Una formulación inicial se reproduce durante días, aun cuando la evidencia cambió. El registro deja de representar el estado actual y se transforma en fósil narrativo. La magnitud del fenómeno ya fue medida. En 23.630 notas de evolución hospitalarias con trazabilidad de cada carácter, sólo el 18% del texto había sido escrito a mano; el 46% venía copiado de notas previas y el 36% importado automáticamente desde otras partes del registro (Wang et al., 2017). Cuatro de cada cinco caracteres de una evolución típica, entonces, no se escribieron el día en que aparecen firmados; cuántos se volvieron a leer y a pensar antes de firmar, el estudio no lo midió. Cada evolución debería responder qué cambió en hechos, interpretación, incertidumbre y plan.</w:t>
       </w:r>
     </w:p>
     <w:tbl>
@@ -8754,7 +8754,7 @@
         <w:t xml:space="preserve">Hechos:</w:t>
       </w:r>
       <w:r>
-        <w:t xml:space="preserve"> paciente con lesión medular, vejiga neurogénica y sonda Foley permanente; presenta orina turbia, piuria y urocultivo positivo tras recambio reciente del catéter. Se mantiene afebril, hemodinámicamente estable y sin deterioro respecto de su basal. Parámetros inflamatorios elevados sin curva previa, en contexto de un cáncer renal metastásico activo. Antecedente documentado de colonización previa por enterobacteria multirresistente.</w:t>
+        <w:t xml:space="preserve"> paciente con lesión medular, vejiga neurogénica y sonda Foley permanente; presenta orina turbia, piuria y urocultivo positivo tras recambio reciente del catéter, y cumple tres días de antibiótico indicado como pielonefritis. Se mantiene afebril, hemodinámicamente estable y sin deterioro respecto de su basal. Parámetros inflamatorios elevados, sin valores anteriores al ingreso, en contexto de un cáncer renal metastásico activo. Antecedente documentado de colonización previa por enterobacteria multirresistente.</w:t>
       </w:r>
     </w:p>
     <w:p>
@@ -8799,7 +8799,7 @@
         <w:t xml:space="preserve">Decisión:</w:t>
       </w:r>
       <w:r>
-        <w:t xml:space="preserve"> no iniciar antibióticos ahora. Mantener vigilancia clínica estrecha ante la aparición de fiebre, inestabilidad hemodinámica, aumento de espasticidad o disreflexia autonómica. El antecedente de colonización multirresistente —declarado en la capa de hechos— eleva el daño ecológico e individual de un tratamiento innecesario, y exige un umbral clínico estricto antes de prescribir.</w:t>
+        <w:t xml:space="preserve"> suspender el antibiótico, porque la bacteriuria asintomática no se trata en pacientes con lesión medular (Nicolle et al., 2019). Mantener vigilancia clínica estrecha ante la aparición de fiebre, inestabilidad hemodinámica, aumento de espasticidad o disreflexia autonómica. El antecedente de colonización multirresistente —declarado en la capa de hechos— eleva el daño ecológico e individual de un tratamiento innecesario, y exige un umbral clínico estricto antes de volver a prescribir.</w:t>
       </w:r>
     </w:p>
     <w:p>
@@ -8815,7 +8815,7 @@
         <w:pStyle w:val="BodyJ"/>
       </w:pPr>
       <w:r>
-        <w:t xml:space="preserve">En el caso anterior: «Bacteriuria y piuria tras recambio de sonda Foley en paciente con vejiga neurogénica y antecedente de colonización multirresistente, sin signos sistémicos ni autonómicos que configuren infección activa; se difiere antibioterapia bajo vigilancia dirigida para evitar selección de resistencia.»</w:t>
+        <w:t xml:space="preserve">En el caso anterior: «Bacteriuria y piuria tras recambio de sonda Foley en paciente con vejiga neurogénica y antecedente de colonización multirresistente, sin signos sistémicos ni autonómicos que configuren infección activa; se suspende la antibioterapia bajo vigilancia dirigida para evitar selección de resistencia.»</w:t>
       </w:r>
     </w:p>
     <w:p>
@@ -9309,7 +9309,7 @@
         <w:pStyle w:val="BodyJ"/>
       </w:pPr>
       <w:r>
-        <w:t xml:space="preserve">Ese lenguaje común necesita un sistema que lo sostenga. Un sistema seguro no depende de que cada individuo recuerde cuestionarlo todo. Diseña momentos y artefactos que facilitan detectar discordancias: tendencias visibles, alertas selectivas, listas de problemas actualizadas, criterios de reapertura, acceso a datos fuente y roles claros para escalar preocupación. La National Academies conceptualizó el diagnóstico como un proceso de equipo y aprendizaje continuo, no como un acto aislado (National Academies of Sciences, Engineering, and Medicine, 2015).</w:t>
+        <w:t xml:space="preserve">Ese lenguaje común necesita un sistema que lo sostenga. Un sistema seguro no depende de que cada individuo recuerde cuestionarlo todo. Diseña momentos y artefactos que facilitan detectar discordancias: tendencias visibles, alertas selectivas, listas de problemas actualizadas, criterios de reapertura, acceso a datos fuente y roles claros para escalar preocupación. Las National Academies conceptualizaron el diagnóstico como un proceso de equipo y aprendizaje continuo, no como un acto aislado (National Academies of Sciences, Engineering, and Medicine, 2015).</w:t>
       </w:r>
     </w:p>
     <w:p>
@@ -12075,7 +12075,7 @@
         <w:t xml:space="preserve">Hechos:</w:t>
       </w:r>
       <w:r>
-        <w:t xml:space="preserve"> recambio reciente de sonda; piuria y urocultivo positivo; afebril y estable; síntomas urinarios bajos no evaluables por el nivel lesional; reactantes elevados sin basal, con cáncer renal metastásico activo; colonización documentada por BLEE.</w:t>
+        <w:t xml:space="preserve"> recambio reciente de sonda; piuria y urocultivo positivo; tercer día de antibiótico indicado como pielonefritis; afebril y estable; síntomas urinarios bajos no evaluables por el nivel lesional; reactantes elevados sin basal, con cáncer renal metastásico activo; colonización documentada por BLEE.</w:t>
       </w:r>
     </w:p>
     <w:p>
@@ -12120,7 +12120,7 @@
         <w:t xml:space="preserve">Decisión:</w:t>
       </w:r>
       <w:r>
-        <w:t xml:space="preserve"> no iniciar tratamiento antibiótico empírico. Instaurar vigilancia clínica dirigida a signos equivalentes de respuesta sistémica o autonómica (fiebre nueva, inestabilidad hemodinámica, aumento súbito de espasticidad, sudoración o malestar general inexplicable). Aquí, el antecedente de germen BLEE no es un gatillo para prescribir antes, sino al revés. Como el tratamiento exigiría carbapenémicos, de alto impacto ecológico y toxicidad potencial, el umbral clínico para iniciar antibióticos debe ser más exigente.</w:t>
+        <w:t xml:space="preserve"> suspender el antibiótico empírico. Instaurar vigilancia clínica dirigida a signos equivalentes de respuesta sistémica o autonómica (fiebre nueva, inestabilidad hemodinámica, aumento súbito de espasticidad, sudoración o malestar general inexplicable). Aquí, el antecedente de germen BLEE no es un gatillo para prescribir antes, sino al revés. Como un tratamiento dirigido probablemente exigiría carbapenémicos, de alto impacto ecológico y toxicidad potencial, el umbral clínico para reiniciar antibióticos debe ser más exigente.</w:t>
       </w:r>
     </w:p>
     <w:p>
@@ -12135,7 +12135,7 @@
         <w:t xml:space="preserve">Frase medular:</w:t>
       </w:r>
       <w:r>
-        <w:t xml:space="preserve"> «Urocultivo positivo y piuria tras recambio de sonda Foley en paciente con lesión medular y antecedente de colonización por BLEE, sin respuesta sistémica ni signos autonómicos que configuren infección activa. Se interpreta como bacteriuria asociada a catéter; vigilancia clínica estricta con criterios explícitos de reapertura.»</w:t>
+        <w:t xml:space="preserve"> «Urocultivo positivo y piuria tras recambio de sonda Foley en paciente con lesión medular y antecedente de colonización por BLEE, sin respuesta sistémica ni signos autonómicos que configuren infección activa. Se interpreta como bacteriuria asociada a catéter; se suspende el antibiótico, con vigilancia clínica estricta y criterios explícitos de reapertura.»</w:t>
       </w:r>
     </w:p>
     <w:p>
@@ -12978,7 +12978,7 @@
         <w:pStyle w:val="BodyJ"/>
       </w:pPr>
       <w:r>
-        <w:t xml:space="preserve">La National Academies recomendó educación diagnóstica, trabajo en equipo, tecnologías que apoyen el proceso y mecanismos de feedback y aprendizaje (National Academies of Sciences, Engineering, and Medicine, 2015). Una institución metacognitiva no sólo registra errores; hace visible cómo se piensa y crea momentos para revisar.</w:t>
+        <w:t xml:space="preserve">Las National Academies recomendaron educación diagnóstica, trabajo en equipo, tecnologías que apoyen el proceso y mecanismos de feedback y aprendizaje (National Academies of Sciences, Engineering, and Medicine, 2015). Una institución metacognitiva no sólo registra errores; hace visible cómo se piensa y crea momentos para revisar.</w:t>
       </w:r>
     </w:p>
     <w:p>
@@ -13036,7 +13036,7 @@
         <w:pStyle w:val="BodyJ"/>
       </w:pPr>
       <w:r>
-        <w:t xml:space="preserve">Este libro toma posición en una controversia real de la educación médica, y la declara. De un lado, Croskerry y su tradición sostienen que conocer los sesgos y entrenar estrategias de debiasing mejora el diagnóstico (Croskerry, 2003; Croskerry et al., 2013a, 2013b). Del otro, Norman, Monteiro y colegas han acumulado evidencia incómoda. La mayoría de los errores diagnósticos se asocia a déficits de conocimiento más que a fallas puras de proceso; los cursos de «pensamiento crítico» generalizable transfieren poco; y obligar a reflexionar sistemáticamente sobre casos fáciles no mejora la precisión y consume tiempo (Norman et al., 2017; Monteiro &amp; Norman, 2013; Monteiro et al., 2020).</w:t>
+        <w:t xml:space="preserve">Este libro toma posición en una controversia real de la educación médica, y la declara. De un lado, Croskerry y su tradición sostienen que conocer los sesgos y entrenar estrategias de debiasing mejora el diagnóstico (Croskerry, 2003; Croskerry et al., 2013a, 2013b). Del otro, Norman, Monteiro y colegas han acumulado evidencia incómoda. Los errores nacen tanto del pensamiento rápido como del lento; el vínculo entre los sesgos que se inducen en experimentos y los errores reales no está establecido; enseñar a reconocer sesgos no ha reducido los errores, mientras que reorganizar el conocimiento da beneficios pequeños pero constantes; los cursos de «pensamiento crítico» generalizable transfieren poco; y obligar a reflexionar sistemáticamente sobre casos fáciles no mejora la precisión y consume tiempo (Norman et al., 2017; Monteiro &amp; Norman, 2013; Monteiro et al., 2020).</w:t>
       </w:r>
     </w:p>
     <w:p>
@@ -13373,7 +13373,7 @@
         <w:pStyle w:val="BodyJ"/>
       </w:pPr>
       <w:r>
-        <w:t xml:space="preserve">Pero el dato más instructivo sobre el rol diagnóstico real es otro: un ensayo aleatorizado entregó a internistas un modelo de lenguaje como apoyo para resolver casos clínicos. El grupo con el modelo no diagnosticó mejor que el grupo sin él — y el modelo solo, sin médico, superó a ambos (Goh et al., 2024). La lectura fácil («la máquina ya es mejor») pasa por alto la lección metacognitiva: el eslabón débil no fue el modelo ni el médico, sino la conversación entre ambos. Los clínicos usaron la herramienta como oráculo de confirmación — pegarle el caso y mirar si coincide con lo que ya pensaban — en vez de usarla para lo que mejor hace: ampliar el espacio de hipótesis, proponer el contraejemplo, señalar el dato que no encaja. La generación de alternativas es el momento creativo del diagnóstico; usada ahí, la IA es un multiplicador. Usada como confirmadora rápida, es un espejo del anclaje.</w:t>
+        <w:t xml:space="preserve">Pero el dato más instructivo sobre el rol diagnóstico real es otro: un ensayo aleatorizado entregó a médicos de medicina interna, familiar y de urgencias un modelo de lenguaje como apoyo para resolver casos clínicos. El grupo con el modelo no diagnosticó mejor que el grupo sin él — y el modelo solo, sin médico, superó a ambos (Goh et al., 2024). La lectura fácil («la máquina ya es mejor») pasa por alto la lección metacognitiva: el eslabón débil no fue el modelo ni el médico, sino la conversación entre ambos. El ensayo no midió cómo la usaron; la lectura más plausible, que es una inferencia, es que la usaron como oráculo de confirmación —pegarle el caso y mirar si coincide con lo que ya pensaban— en vez de usarla para lo que mejor hace: ampliar el espacio de hipótesis, proponer el contraejemplo, señalar el dato que no encaja. La generación de alternativas es el momento creativo del diagnóstico; usada ahí, la IA es un multiplicador. Usada como confirmadora rápida, es un espejo del anclaje.</w:t>
       </w:r>
     </w:p>
     <w:p>
@@ -13526,7 +13526,7 @@
         <w:t xml:space="preserve">Sobreconfianza no calibrada.</w:t>
       </w:r>
       <w:r>
-        <w:t xml:space="preserve"> La confianza verbalizada de los modelos tiende a la sobreconfianza sistemática (Kadavath et al., 2022; Xiong et al., 2024): el «estoy bastante seguro» del modelo es tono, no calibración — la sobreconfianza humana, sin siquiera un historial propio de errores que la eduque. Y cuando el modelo «critica» o «revisa» su propia respuesta, esa autocrítica puede ser otra generación entrenada para imitar la evaluación: la pregunta práctica no es si el sistema sabe que sabe, sino si sus señales de confianza están empíricamente calibradas.</w:t>
+        <w:t xml:space="preserve"> La confianza que los modelos expresan con palabras tiende a la sobreconfianza (Xiong et al., 2024), aunque las probabilidades que asignan a sus propias respuestas pueden estar bien calibradas cuando se les pregunta en el formato adecuado (Kadavath et al., 2022): el «estoy bastante seguro» del modelo es tono, no calibración — la sobreconfianza humana, sin siquiera un historial propio de errores que la eduque. Y cuando el modelo «critica» o «revisa» su propia respuesta, esa autocrítica puede ser otra generación entrenada para imitar la evaluación: la pregunta práctica no es si el sistema sabe que sabe, sino si sus señales de confianza están empíricamente calibradas.</w:t>
       </w:r>
     </w:p>
     <w:p>
@@ -14475,7 +14475,7 @@
         <w:t xml:space="preserve">Solución comentada.</w:t>
       </w:r>
       <w:r>
-        <w:t xml:space="preserve"> Ejemplo: «Shock séptico de foco urinario, descartándose foco abdominal». Prueba uno: «de foco urinario» hace florecer una causal (¿demostrada o presunta?), y «descartándose» es un gerundio que promete lo que todavía no ocurrió — dos rosas creadas en nueve palabras. Prueba dos, en lengua parriana: «Shock con urocultivo positivo; foco urinario probable; abdomen aún sin imagen». La segunda versión es menos imponente y más útil: sobrevive a la visita de la mañana. Si su frase pasa las dos pruebas, tiene lo que aquí se entiende por estilo: exactitud que se puede defender en voz alta.</w:t>
+        <w:t xml:space="preserve"> Ejemplo: «Shock séptico de foco urinario, descartándose foco abdominal». Prueba uno: «de foco urinario» hace florecer una causal (¿demostrada o presunta?), y «descartándose» es un gerundio que promete lo que todavía no ocurrió — dos rosas creadas en ocho palabras. Prueba dos, en lengua parriana: «Shock con urocultivo positivo; foco urinario probable; abdomen aún sin imagen». La segunda versión es menos imponente y más útil: sobrevive a la visita de la mañana. Si su frase pasa las dos pruebas, tiene lo que aquí se entiende por estilo: exactitud que se puede defender en voz alta.</w:t>
       </w:r>
     </w:p>
     <w:p>
@@ -16912,7 +16912,7 @@
         <w:pStyle w:val="BodyJ"/>
       </w:pPr>
       <w:r>
-        <w:t xml:space="preserve">Qué talleres usar con quién, en el orden en que rinden más. Cada uno cabe en una reunión de treinta minutos.</w:t>
+        <w:t xml:space="preserve">Qué talleres usar con quién, en el orden en que rinden más. Salvo los que se sostienen en el tiempo (Talleres 5, 15 y 16), cada uno cabe en una reunión de treinta minutos.</w:t>
       </w:r>
     </w:p>
     <w:p>
@@ -16996,7 +16996,7 @@
         <w:pStyle w:val="BodyJ"/>
       </w:pPr>
       <w:r>
-        <w:t xml:space="preserve">Secuencia mínima para un servicio que empieza, alineada con las fases de esta guía: Taller 4 en la semana 1, Taller 11 en la semana 3, Taller 8 en la visita de sala del mes 2 y Taller 12 en el mes 3; el resto, a demanda. Los «errores típicos» anotados en los Talleres 7, 8, 10 y 12B son lo que los grupos suelen responder primero; mostrarlos antes de la solución enseña por contraste.</w:t>
+        <w:t xml:space="preserve">Secuencia mínima para un servicio que empieza, alineada con las fases de esta guía: Taller 4 en las semanas 1–2 (el lenguaje), Talleres 8 y 11 en las semanas 3–4 (la pausa en la visita de sala), Talleres 12 y 12B en el mes 2 (la ficha) y Taller 7 desde el mes 3, junto a la reunión de morbimortalidad; el resto, a demanda. Los «errores típicos» anotados en los Talleres 7, 8, 10 y 12B son lo que los grupos suelen responder primero; mostrarlos antes de la solución enseña por contraste.</w:t>
       </w:r>
     </w:p>
     <w:p>
@@ -18077,6 +18077,21 @@
           <w:b/>
           <w:bCs/>
         </w:rPr>
+        <w:t xml:space="preserve">Contrafactual (counterfactual).</w:t>
+      </w:r>
+      <w:r>
+        <w:t xml:space="preserve"> Escenario comparativo implícito en toda afirmación causal: qué habría ocurrido sin la exposición o la intervención.</w:t>
+      </w:r>
+    </w:p>
+    <w:p>
+      <w:pPr>
+        <w:pStyle w:val="BodyJ"/>
+      </w:pPr>
+      <w:r>
+        <w:rPr>
+          <w:b/>
+          <w:bCs/>
+        </w:rPr>
         <w:t xml:space="preserve">Conversaciones para la acción (conversation for action).</w:t>
       </w:r>
       <w:r>
@@ -18092,21 +18107,6 @@
           <w:b/>
           <w:bCs/>
         </w:rPr>
-        <w:t xml:space="preserve">Contrafactual (counterfactual).</w:t>
-      </w:r>
-      <w:r>
-        <w:t xml:space="preserve"> Escenario comparativo implícito en toda afirmación causal: qué habría ocurrido sin la exposición o la intervención.</w:t>
-      </w:r>
-    </w:p>
-    <w:p>
-      <w:pPr>
-        <w:pStyle w:val="BodyJ"/>
-      </w:pPr>
-      <w:r>
-        <w:rPr>
-          <w:b/>
-          <w:bCs/>
-        </w:rPr>
         <w:t xml:space="preserve">Creatividad clínica∗.</w:t>
       </w:r>
       <w:r>
@@ -18287,6 +18287,21 @@
           <w:b/>
           <w:bCs/>
         </w:rPr>
+        <w:t xml:space="preserve">Estado del razonador∗.</w:t>
+      </w:r>
+      <w:r>
+        <w:t xml:space="preserve"> Condiciones en que se produce un juicio clínico —hora del día, horas de turno, sueño, ánimo, preocupación ajena al caso—, tratadas como un hecho de la capa H sobre la confiabilidad del instrumento que infiere y como disparador de pausa o de segundo lector. Pensar cuesta, y el costo no es constante.</w:t>
+      </w:r>
+    </w:p>
+    <w:p>
+      <w:pPr>
+        <w:pStyle w:val="BodyJ"/>
+      </w:pPr>
+      <w:r>
+        <w:rPr>
+          <w:b/>
+          <w:bCs/>
+        </w:rPr>
         <w:t xml:space="preserve">Ética de la creencia (ethics of belief).</w:t>
       </w:r>
       <w:r>
@@ -18302,21 +18317,6 @@
           <w:b/>
           <w:bCs/>
         </w:rPr>
-        <w:t xml:space="preserve">Estado del razonador∗.</w:t>
-      </w:r>
-      <w:r>
-        <w:t xml:space="preserve"> Condiciones en que se produce un juicio clínico —hora del día, horas de turno, sueño, ánimo, preocupación ajena al caso—, tratadas como un hecho de la capa H sobre la confiabilidad del instrumento que infiere y como disparador de pausa o de segundo lector. Pensar cuesta, y el costo no es constante.</w:t>
-      </w:r>
-    </w:p>
-    <w:p>
-      <w:pPr>
-        <w:pStyle w:val="BodyJ"/>
-      </w:pPr>
-      <w:r>
-        <w:rPr>
-          <w:b/>
-          <w:bCs/>
-        </w:rPr>
         <w:t xml:space="preserve">Ficha de proceso∗.</w:t>
       </w:r>
       <w:r>
@@ -18377,25 +18377,25 @@
           <w:b/>
           <w:bCs/>
         </w:rPr>
+        <w:t xml:space="preserve">HII-D∗.</w:t>
+      </w:r>
+      <w:r>
+        <w:t xml:space="preserve"> Heurística de escritura y deliberación que, a partir de una pregunta operativa, ordena el razonamiento en Hechos, Inferencias, Incertidumbre y Decisión, más un movimiento transversal de reevaluación. No validada como instrumento.</w:t>
+      </w:r>
+    </w:p>
+    <w:p>
+      <w:pPr>
+        <w:pStyle w:val="BodyJ"/>
+      </w:pPr>
+      <w:r>
+        <w:rPr>
+          <w:b/>
+          <w:bCs/>
+        </w:rPr>
         <w:t xml:space="preserve">Hindsight bias (sesgo retrospectivo).</w:t>
       </w:r>
       <w:r>
         <w:t xml:space="preserve"> Tendencia a percibir un desenlace conocido como si hubiera sido predecible, contaminando la evaluación de decisiones pasadas.</w:t>
-      </w:r>
-    </w:p>
-    <w:p>
-      <w:pPr>
-        <w:pStyle w:val="BodyJ"/>
-      </w:pPr>
-      <w:r>
-        <w:rPr>
-          <w:b/>
-          <w:bCs/>
-        </w:rPr>
-        <w:t xml:space="preserve">HII-D∗.</w:t>
-      </w:r>
-      <w:r>
-        <w:t xml:space="preserve"> Heurística de escritura y deliberación que, a partir de una pregunta operativa, ordena el razonamiento en Hechos, Inferencias, Incertidumbre y Decisión, más un movimiento transversal de reevaluación. No validada como instrumento.</w:t>
       </w:r>
     </w:p>
     <w:p>
@@ -20520,6 +20520,24 @@
         <w:pStyle w:val="BodyJ"/>
       </w:pPr>
       <w:r>
+        <w:t xml:space="preserve">Abdulnour, R.-E. E., Akbarialiabad, H., Haghighi, A., &amp; Leachman, S. A. (2026). Crew resource management — Navigating AI's automation paradox. </w:t>
+      </w:r>
+      <w:r>
+        <w:rPr>
+          <w:i/>
+          <w:iCs/>
+        </w:rPr>
+        <w:t xml:space="preserve">New England Journal of Medicine, 395</w:t>
+      </w:r>
+      <w:r>
+        <w:t xml:space="preserve">(8), 731–734.</w:t>
+      </w:r>
+    </w:p>
+    <w:p>
+      <w:pPr>
+        <w:pStyle w:val="BodyJ"/>
+      </w:pPr>
+      <w:r>
         <w:t xml:space="preserve">Abdulnour, R.-E. E., Gin, B., &amp; Boscardin, C. K. (2025). Educational strategies for clinical supervision of artificial intelligence use. </w:t>
       </w:r>
       <w:r>
@@ -20538,24 +20556,6 @@
         <w:pStyle w:val="BodyJ"/>
       </w:pPr>
       <w:r>
-        <w:t xml:space="preserve">Abdulnour, R.-E. E., Akbarialiabad, H., Haghighi, A., &amp; Leachman, S. A. (2026). Crew resource management — Navigating AI's automation paradox. </w:t>
-      </w:r>
-      <w:r>
-        <w:rPr>
-          <w:i/>
-          <w:iCs/>
-        </w:rPr>
-        <w:t xml:space="preserve">New England Journal of Medicine, 395</w:t>
-      </w:r>
-      <w:r>
-        <w:t xml:space="preserve">(8), 731–734.</w:t>
-      </w:r>
-    </w:p>
-    <w:p>
-      <w:pPr>
-        <w:pStyle w:val="BodyJ"/>
-      </w:pPr>
-      <w:r>
         <w:t xml:space="preserve">Akram, A. R., Chalmers, J. D., Taylor, J. K., Rutherford, J., Singanayagam, A., &amp; Hill, A. T. (2013). An evaluation of clinical stability criteria to predict hospital course in community-acquired pneumonia. </w:t>
       </w:r>
       <w:r>
@@ -21600,6 +21600,24 @@
         <w:pStyle w:val="BodyJ"/>
       </w:pPr>
       <w:r>
+        <w:t xml:space="preserve">Greenhalgh, T., Howick, J., &amp; Maskrey, N. (2014). Evidence based medicine: A movement in crisis? </w:t>
+      </w:r>
+      <w:r>
+        <w:rPr>
+          <w:i/>
+          <w:iCs/>
+        </w:rPr>
+        <w:t xml:space="preserve">BMJ, 348</w:t>
+      </w:r>
+      <w:r>
+        <w:t xml:space="preserve">, g3725.</w:t>
+      </w:r>
+    </w:p>
+    <w:p>
+      <w:pPr>
+        <w:pStyle w:val="BodyJ"/>
+      </w:pPr>
+      <w:r>
         <w:t xml:space="preserve">Greenhalgh, T., &amp; Hurwitz, B. (Eds.). (1998). </w:t>
       </w:r>
       <w:r>
@@ -21618,24 +21636,6 @@
         <w:pStyle w:val="BodyJ"/>
       </w:pPr>
       <w:r>
-        <w:t xml:space="preserve">Greenhalgh, T., Howick, J., &amp; Maskrey, N. (2014). Evidence based medicine: A movement in crisis? </w:t>
-      </w:r>
-      <w:r>
-        <w:rPr>
-          <w:i/>
-          <w:iCs/>
-        </w:rPr>
-        <w:t xml:space="preserve">BMJ, 348</w:t>
-      </w:r>
-      <w:r>
-        <w:t xml:space="preserve">, g3725.</w:t>
-      </w:r>
-    </w:p>
-    <w:p>
-      <w:pPr>
-        <w:pStyle w:val="BodyJ"/>
-      </w:pPr>
-      <w:r>
         <w:t xml:space="preserve">Groopman, J. (2007). </w:t>
       </w:r>
       <w:r>
@@ -21672,6 +21672,24 @@
         <w:pStyle w:val="BodyJ"/>
       </w:pPr>
       <w:r>
+        <w:t xml:space="preserve">Hempel, C. G. (1965). Science and human values. In </w:t>
+      </w:r>
+      <w:r>
+        <w:rPr>
+          <w:i/>
+          <w:iCs/>
+        </w:rPr>
+        <w:t xml:space="preserve">Aspects of Scientific Explanation and Other Essays in the Philosophy of Science</w:t>
+      </w:r>
+      <w:r>
+        <w:t xml:space="preserve"> (pp. 81–96). Free Press.</w:t>
+      </w:r>
+    </w:p>
+    <w:p>
+      <w:pPr>
+        <w:pStyle w:val="BodyJ"/>
+      </w:pPr>
+      <w:r>
         <w:t xml:space="preserve">Hernán, M. A., &amp; Robins, J. M. (2020). </w:t>
       </w:r>
       <w:r>
@@ -21726,7 +21744,7 @@
         <w:pStyle w:val="BodyJ"/>
       </w:pPr>
       <w:r>
-        <w:t xml:space="preserve">Hernández, G., Ospina-Tascón, G. A., Kattan, E., et al., por los investigadores de ANDROMEDA-SHOCK-2. (2025). Personalized hemodynamic resuscitation targeting capillary refill time in early septic shock: The ANDROMEDA-SHOCK-2 randomized clinical trial. </w:t>
+        <w:t xml:space="preserve">Hernández, G., Ospina-Tascón, G. A., Kattan, E., Ibarra-Estrada, M., Ramasco, F., Orozco, N., et al., por los investigadores de ANDROMEDA-SHOCK-2. (2025). Personalized hemodynamic resuscitation targeting capillary refill time in early septic shock: The ANDROMEDA-SHOCK-2 randomized clinical trial. </w:t>
       </w:r>
       <w:r>
         <w:rPr>
@@ -22248,6 +22266,34 @@
         <w:pStyle w:val="BodyJ"/>
       </w:pPr>
       <w:r>
+        <w:t xml:space="preserve">Maturana, H. R. (1970). </w:t>
+      </w:r>
+      <w:r>
+        <w:rPr>
+          <w:i/>
+          <w:iCs/>
+        </w:rPr>
+        <w:t xml:space="preserve">Biology of cognition</w:t>
+      </w:r>
+      <w:r>
+        <w:t xml:space="preserve"> (BCL Report 9.0). Biological Computer Laboratory, University of Illinois. Reimpreso en H. R. Maturana &amp; F. J. Varela (1980), </w:t>
+      </w:r>
+      <w:r>
+        <w:rPr>
+          <w:i/>
+          <w:iCs/>
+        </w:rPr>
+        <w:t xml:space="preserve">Autopoiesis and Cognition: The Realization of the Living</w:t>
+      </w:r>
+      <w:r>
+        <w:t xml:space="preserve"> (pp. 5–58). Reidel.</w:t>
+      </w:r>
+    </w:p>
+    <w:p>
+      <w:pPr>
+        <w:pStyle w:val="BodyJ"/>
+      </w:pPr>
+      <w:r>
         <w:t xml:space="preserve">Maturana, H. (1990). </w:t>
       </w:r>
       <w:r>
@@ -22266,34 +22312,6 @@
         <w:pStyle w:val="BodyJ"/>
       </w:pPr>
       <w:r>
-        <w:t xml:space="preserve">Maturana, H. R. (1970). </w:t>
-      </w:r>
-      <w:r>
-        <w:rPr>
-          <w:i/>
-          <w:iCs/>
-        </w:rPr>
-        <w:t xml:space="preserve">Biology of cognition</w:t>
-      </w:r>
-      <w:r>
-        <w:t xml:space="preserve"> (BCL Report 9.0). Biological Computer Laboratory, University of Illinois. Reimpreso en H. R. Maturana &amp; F. J. Varela (1980), </w:t>
-      </w:r>
-      <w:r>
-        <w:rPr>
-          <w:i/>
-          <w:iCs/>
-        </w:rPr>
-        <w:t xml:space="preserve">Autopoiesis and Cognition: The Realization of the Living</w:t>
-      </w:r>
-      <w:r>
-        <w:t xml:space="preserve"> (pp. 5–58). Reidel.</w:t>
-      </w:r>
-    </w:p>
-    <w:p>
-      <w:pPr>
-        <w:pStyle w:val="BodyJ"/>
-      </w:pPr>
-      <w:r>
         <w:t xml:space="preserve">Maturana, H., &amp; Varela, F. (1984). </w:t>
       </w:r>
       <w:r>
@@ -22665,6 +22683,24 @@
       </w:r>
       <w:r>
         <w:t xml:space="preserve">, 470–482.</w:t>
+      </w:r>
+    </w:p>
+    <w:p>
+      <w:pPr>
+        <w:pStyle w:val="BodyJ"/>
+      </w:pPr>
+      <w:r>
+        <w:t xml:space="preserve">Peirce, C. S. (1934). </w:t>
+      </w:r>
+      <w:r>
+        <w:rPr>
+          <w:i/>
+          <w:iCs/>
+        </w:rPr>
+        <w:t xml:space="preserve">Collected Papers of Charles Sanders Peirce: Vol. 5. Pragmatism and Pragmaticism</w:t>
+      </w:r>
+      <w:r>
+        <w:t xml:space="preserve"> (C. Hartshorne &amp; P. Weiss, Eds.). Harvard University Press.</w:t>
       </w:r>
     </w:p>
     <w:p>

</xml_diff>

<commit_message>
Reconstrucción tras el nuevo ingreso de Carmen
./construir.sh --figuras: 166 páginas (162 de cuerpo), TOC 40/40 estable, cotejo de figuras sin derivas y
comprobar.py con 0 problemas; sólo las Figuras 2 y 11 cambiaron. lector/libro.json: 1065 bloques, 16 marcados como
cambiados.

Co-Authored-By: Claude Opus 5.5 <noreply@anthropic.com>
Claude-Session: https://claude.ai/code/session_01SPkhDdVzUCxJwqq61ddeLW
</commit_message>
<xml_diff>
--- a/Hechos_inferencias_incertidumbre_edicion_revisada.docx
+++ b/Hechos_inferencias_incertidumbre_edicion_revisada.docx
@@ -146,7 +146,7 @@
           <w:sz w:val="18"/>
           <w:szCs w:val="18"/>
         </w:rPr>
-        <w:t xml:space="preserve">Edición de trabajo, 2026. Ensayo académico dirigido a profesionales de la salud. Las escenas narradas en primera persona condensan experiencias reales del autor y situaciones clínicas compuestas: conservan el conflicto cognitivo y moral que las originó, pero no reproducen literalmente un único episodio ni permiten identificar pacientes, familiares, profesionales o instituciones. Los datos, circunstancias y trayectorias fueron modificados y combinados con fines docentes. Lo mismo vale para todas las viñetas clínicas del libro. Carmen es un personaje clínico compuesto, construido para acompañar el argumento; no corresponde a una paciente identificable. Este manuscrito fue desarrollado a partir de ideas y formulaciones del autor, con asistencia de inteligencia artificial en investigación, redacción y edición; la responsabilidad por el contenido, las tesis y los errores es del autor. No sustituye guías clínicas, evaluación especializada ni juicio profesional en casos individuales.</w:t>
+        <w:t xml:space="preserve">Edición de trabajo, 2026. Ensayo académico dirigido a profesionales de la salud. Las escenas narradas en primera persona son composiciones docentes: recrean conflictos cognitivos y morales frecuentes en la clínica, pero no reproducen episodios reales ni permiten identificar pacientes, familiares, profesionales o instituciones. Lo mismo vale para todas las viñetas clínicas del libro. Carmen es un personaje clínico compuesto, construido para acompañar el argumento; no corresponde a una paciente identificable. Este manuscrito fue desarrollado a partir de ideas y formulaciones del autor, con asistencia de inteligencia artificial en investigación, redacción y edición; la responsabilidad por el contenido, las tesis y los errores es del autor. No sustituye guías clínicas, evaluación especializada ni juicio profesional en casos individuales.</w:t>
       </w:r>
     </w:p>
     <w:p>
@@ -1067,7 +1067,7 @@
         <w:pStyle w:val="BodyJ"/>
       </w:pPr>
       <w:r>
-        <w:t xml:space="preserve">Escribo desde la práctica y no desde la tribuna. Los errores que analizo en estas páginas incluyen los míos; los he reconstruido como composiciones docentes —igual que todas las viñetas del libro— para proteger a los pacientes y a los equipos, pero no para protegerme a mí. Un libro sobre la lucidez clínica que ocultara la falibilidad de quien lo escribe se refutaría solo.</w:t>
+        <w:t xml:space="preserve">Escribo desde la práctica y no desde la tribuna. Los errores que analizo en estas páginas son de los que yo también he cometido; los he escrito como composiciones docentes —igual que todas las viñetas del libro— para proteger a los pacientes y a los equipos, pero no para protegerme a mí. Un libro sobre la lucidez clínica que ocultara la falibilidad de quien lo escribe se refutaría solo.</w:t>
       </w:r>
     </w:p>
     <w:p>
@@ -1336,7 +1336,7 @@
         <w:pStyle w:val="BodyJ"/>
       </w:pPr>
       <w:r>
-        <w:t xml:space="preserve">Carmen tiene sesenta y un años, treinta de cigarrillo y una cicatriz en la línea media que le cruza el abdomen desde una cirugía de hace una década. Sobre la cicatriz, una hernia incisional que ella conoce mejor que nadie: sabe qué comidas la distienden, sabe dormir de lado cuando «se le aprieta», sabe distinguir la molestia habitual del dolor que la obliga a ir a urgencias. Ha ingresado tres veces en el último año por episodios de suboclusión intestinal que cedieron con reposo digestivo y sonda nasogástrica. Esta madrugada llegó por cuarta vez, y algo es radicalmente distinto: está hipotensa, taquicárdica, con las rodillas moteadas y un lactato de 6 mmol/L. En la nota de ingreso, alguien escribió: «Paciente con hernia complicada conocida, cuadro habitual, se maneja de forma habitual».</w:t>
+        <w:t xml:space="preserve">Carmen tiene sesenta y un años, treinta de cigarrillo y una cicatriz en la línea media que le cruza el abdomen desde una cirugía de hace una década. Sobre la cicatriz, una hernia incisional que ella conoce mejor que nadie: sabe qué comidas la distienden, sabe dormir de lado cuando «se le aprieta», sabe distinguir la molestia habitual del dolor que la obliga a ir a urgencias. Ha ingresado tres veces en el último año por episodios de suboclusión intestinal que cedieron con reposo digestivo y sonda nasogástrica. Esta madrugada llegó por cuarta vez, y algo es radicalmente distinto: está hipotensa (presión arterial media de 55 mmHg) y taquicárdica (112 por minuto), con las rodillas moteadas y un lactato de 3,9 mmol/L. En la nota de ingreso, alguien escribió: «Paciente con hernia complicada conocida, cuadro habitual, se maneja de forma habitual».</w:t>
       </w:r>
     </w:p>
     <w:p>
@@ -1699,7 +1699,7 @@
         <w:pStyle w:val="BodyJ"/>
       </w:pPr>
       <w:r>
-        <w:t xml:space="preserve">Antes de seguir, hay que precisar qué estatuto tiene entonces aquí la palabra «hecho», porque la carga teórica de la observación parece amenazar la distinción que organiza todo lo demás: si toda observación ya contiene conceptos, ¿dónde termina el hecho y empieza la inferencia? La respuesta es pragmática, no ontológica. «Hecho» es el estatus provisional que un equipo concede a una afirmación cuando acuerda no cuestionarla para la decisión en curso. «Lactato 6,0» es un hecho mientras nadie discuta el método ni la hora; deja de serlo en el instante en que la decisión dependa de si la muestra era venosa o estaba hemolizada, y entonces hay que bajar un nivel y volver a mirar. La frontera entre capas no es una línea en la naturaleza, sino una línea que el equipo traza, puede volver a trazar y debe poder mostrar dónde la trazó. Eso —y no compartimentos puros— es lo que la Figura 2 llama separación funcional y gradual.</w:t>
+        <w:t xml:space="preserve">Antes de seguir, hay que precisar qué estatuto tiene entonces aquí la palabra «hecho», porque la carga teórica de la observación parece amenazar la distinción que organiza todo lo demás: si toda observación ya contiene conceptos, ¿dónde termina el hecho y empieza la inferencia? La respuesta es pragmática, no ontológica. «Hecho» es el estatus provisional que un equipo concede a una afirmación cuando acuerda no cuestionarla para la decisión en curso. «Lactato 3,9» es un hecho mientras nadie discuta el método ni la hora; deja de serlo en el instante en que la decisión dependa de si la muestra era venosa o estaba hemolizada, y entonces hay que bajar un nivel y volver a mirar. La frontera entre capas no es una línea en la naturaleza, sino una línea que el equipo traza, puede volver a trazar y debe poder mostrar dónde la trazó. Eso —y no compartimentos puros— es lo que la Figura 2 llama separación funcional y gradual.</w:t>
       </w:r>
     </w:p>
     <w:p>
@@ -1838,7 +1838,7 @@
         <w:pStyle w:val="BodyJ"/>
       </w:pPr>
       <w:r>
-        <w:t xml:space="preserve">Por ello, los hechos se registran de modo trazable en el tiempo. Una etiqueta como «shock séptico abdominal» fusiona estado fisiológico, etiología microbiológica y foco anatómico en un solo bloque. Una formulación limpia separa las capas y sus momentos: al ingreso, hipotensión con requerimiento de noradrenalina, lactato de 6,0 mmol/L y llene capilar de 5 segundos; episodio obstructivo clínico sobre hernia incisional, sin signos tomográficos de perforación ni isquemia; y, a las 14 horas de incubación, hemocultivos periféricos positivos para bacilos gramnegativos. Recién sobre esa arquitectura de datos puede sostenerse el foco abdominal por translocación como hipótesis probable.</w:t>
+        <w:t xml:space="preserve">Por ello, los hechos se registran de modo trazable en el tiempo. Una etiqueta como «shock séptico abdominal» fusiona estado fisiológico, etiología microbiológica y foco anatómico en un solo bloque. Una formulación limpia separa las capas y sus momentos: al ingreso, presión arterial media de 55 mmHg y frecuencia cardiaca de 112 lpm, con requerimiento de noradrenalina pese a 2.000 ml de Ringer lactato en tres horas, lactato de 3,9 mmol/L y llene capilar de 3 a 4 segundos; episodio obstructivo clínico sobre hernia incisional, sin signos tomográficos de perforación ni isquemia; y, a las 12 horas de incubación, hemocultivos periféricos positivos para bacilos gramnegativos. Recién sobre esa arquitectura de datos puede sostenerse el foco abdominal por translocación como hipótesis probable.</w:t>
       </w:r>
     </w:p>
     <w:p>
@@ -1919,7 +1919,7 @@
             <w:r>
               <w:drawing>
                 <wp:inline distT="0" distB="0" distL="0" distR="0">
-                  <wp:extent cx="5619750" cy="2647950"/>
+                  <wp:extent cx="5619750" cy="2600325"/>
                   <wp:effectExtent t="0" r="0" b="0" l="0"/>
                   <wp:docPr id="1" name="" descr="" title=""/>
                   <wp:cNvGraphicFramePr>
@@ -1944,7 +1944,7 @@
                         <pic:spPr bwMode="auto">
                           <a:xfrm>
                             <a:off x="0" y="0"/>
-                            <a:ext cx="5619750" cy="2647950"/>
+                            <a:ext cx="5619750" cy="2600325"/>
                           </a:xfrm>
                           <a:prstGeom prst="rect">
                             <a:avLst/>
@@ -2687,7 +2687,7 @@
         </w:numPr>
       </w:pPr>
       <w:r>
-        <w:t xml:space="preserve">«Lactato 6,0 mmol/L (04:15, arterial).»</w:t>
+        <w:t xml:space="preserve">«Lactato 3,9 mmol/L (04:15, arterial).»</w:t>
       </w:r>
     </w:p>
     <w:p>
@@ -2918,7 +2918,7 @@
         <w:pStyle w:val="BodyJ"/>
       </w:pPr>
       <w:r>
-        <w:t xml:space="preserve">La compresión semántica no debe confundirse con la amputación de datos críticos. «Mujer de 61 años con dolor abdominal» carece de poder discriminativo para activar un illness script específico. En cambio, «mujer de 61 años con hernia incisional y suboclusiones recurrentes autolimitadas, que cursa con un cuarto episodio obstructivo agudo, esta vez complicado con shock séptico por bacilos gramnegativos rápidamente reversible con soporte vasoactivo y antibióticos, sin signos tomográficos actuales de estrangulación ni perforación» conserva los calificadores que guían el razonamiento: temporalidad, cambio de patrón, gravedad fisiológica, microbiología y límites anatómicos.</w:t>
+        <w:t xml:space="preserve">La compresión semántica no debe confundirse con la amputación de datos críticos. «Mujer de 61 años con dolor abdominal» carece de poder discriminativo para activar un illness script específico. En cambio, «mujer de 61 años con hernia incisional y suboclusiones recurrentes autolimitadas, que cursa con un cuarto episodio obstructivo agudo, esta vez complicado con shock séptico por bacilos gramnegativos que respondió a la reanimación con volumen, noradrenalina y antibióticos, sin signos tomográficos actuales de estrangulación ni perforación» conserva los calificadores que guían el razonamiento: temporalidad, cambio de patrón, gravedad fisiológica, microbiología y límites anatómicos.</w:t>
       </w:r>
     </w:p>
     <w:p>
@@ -3784,7 +3784,7 @@
         <w:pStyle w:val="BodyJ"/>
       </w:pPr>
       <w:r>
-        <w:t xml:space="preserve">En la visita médica de la mañana, dos residentes resumen el caso de Carmen con los mismos datos sobre la mesa. El primero dice: «Paciente con hernia complicada y sepsis, actualmente mejor». La segunda presenta: «Cuarto episodio obstructivo en el año por hernia incisional, esta vez debutando con shock séptico y bacteriemia por bacilos gramnegativos, revertido con vasopresores y antibióticos, sin signos tomográficos de isquemia aguda; el salto cualitativo de gravedad modifica el riesgo de mantener una conducta expectante». Ambos dicen la verdad. Sólo una de las dos frases piensa.</w:t>
+        <w:t xml:space="preserve">En la visita médica de la mañana, dos residentes resumen el caso de Carmen con los mismos datos sobre la mesa. El primero dice: «Paciente con hernia complicada y sepsis, actualmente mejor». La segunda presenta: «Cuarto episodio obstructivo en el año por hernia incisional, esta vez debutando con shock séptico y bacteriemia por bacilos gramnegativos, revertido con volumen, vasopresores y antibióticos, sin signos tomográficos de isquemia aguda; el salto cualitativo de gravedad modifica el riesgo de mantener una conducta expectante». Ambos dicen la verdad. Sólo una de las dos frases piensa.</w:t>
       </w:r>
     </w:p>
     <w:p>
@@ -4996,7 +4996,7 @@
         <w:t xml:space="preserve">Hechos.</w:t>
       </w:r>
       <w:r>
-        <w:t xml:space="preserve"> Cuarto episodio obstructivo en doce meses sobre hernia incisional conocida (tres ingresos previos resueltos con manejo conservador según registro clínico). Episodio actual: ingresó de madrugada en shock con requerimiento de noradrenalina por 36 horas, lactato arterial máximo de 6,0 mmol/L (04:15 h del ingreso) y llene capilar de 5 segundos documentado por enfermería en urgencias. Hemocultivos periféricos 2/2 positivos a las 14 h para Escherichia coli multisensible. TAC de abdomen de ingreso con asas dilatadas en saco herniario, sin signos de isquemia, neumatosis ni perforación. Actualmente en su tercer día: afebril, sin vasoactivos desde la tarde de ayer y con débito por sonda en descenso. Relato de ingreso textual: «esta vez la hernia no se dejó acomodar, el dolor era otro». Su hija, que la trajo, agrega lo que ninguna nota recogió: «las otras veces se le pasaba en el día; esta vez aguantó dos días en la casa y no quería venir».</w:t>
+        <w:t xml:space="preserve"> Cuarto episodio obstructivo en doce meses sobre hernia incisional conocida (tres ingresos previos resueltos con manejo conservador según registro clínico). Episodio actual: ingresó de madrugada en shock (presión arterial media 55 mmHg, frecuencia cardiaca 112 lpm, llene capilar de 3 a 4 segundos documentado por enfermería en urgencias, lactato arterial de 3,9 mmol/L a las 04:15 h); recibió 2.000 ml de Ringer lactato en tres horas y, en paralelo, noradrenalina iniciada por vía periférica hasta 0,2 mcg/kg/min, que se mantuvo 36 horas, además de ceftriaxona y metronidazol desde el ingreso. Lactato de control, 2,3 mmol/L. Hemocultivos periféricos 2/2 positivos a las 12 h; luego, Escherichia coli multisensible. TAC de abdomen de ingreso con asas dilatadas en saco herniario, sin signos de isquemia, neumatosis ni perforación. Actualmente en su tercer día: afebril, sin vasoactivos desde la tarde de ayer y con débito por sonda en descenso. Relato de ingreso textual: «esta vez la hernia no se dejó acomodar, el dolor era otro». Su hija, que la trajo, agrega lo que ninguna nota recogió: «las otras veces se le pasaba en el día; esta vez aguantó dos días en la casa y no quería venir».</w:t>
       </w:r>
     </w:p>
     <w:p>
@@ -6976,7 +6976,7 @@
         <w:pStyle w:val="BodyJ"/>
       </w:pPr>
       <w:r>
-        <w:t xml:space="preserve">La internista de la mañana desaceleró, y vale la pena notar por qué. No porque «pensara despacio» en general, sino porque se activaron dos disparadores concretos: la discordancia entre la gravedad fisiológica (shock, lactato 6) y la etiqueta («suboclusión habitual»), y un dato incompatible con la serie previa (nunca había requerido vasoactivos). Su primera acción no fue pedir más exámenes: fue reformular el caso sin la etiqueta. «Mujer con obstrucción mecánica recurrente que hoy está en shock» abre un espacio de hipótesis que «cuadro habitual» cerraba.</w:t>
+        <w:t xml:space="preserve">La internista de la mañana desaceleró, y vale la pena notar por qué. No porque «pensara despacio» en general, sino porque se activaron dos disparadores concretos: la discordancia entre la gravedad fisiológica (shock, lactato 3,9) y la etiqueta («suboclusión habitual»), y un dato incompatible con la serie previa (nunca había requerido vasoactivos). Su primera acción no fue pedir más exámenes: fue reformular el caso sin la etiqueta. «Mujer con obstrucción mecánica recurrente que hoy está en shock» abre un espacio de hipótesis que «cuadro habitual» cerraba.</w:t>
       </w:r>
     </w:p>
     <w:p>
@@ -6992,7 +6992,7 @@
         <w:pStyle w:val="BodyJ"/>
       </w:pPr>
       <w:r>
-        <w:t xml:space="preserve">Y está Marcela, la enfermera de urgencias, que midió el llene capilar de cinco segundos y anotó las rodillas moteadas en su hoja. Durante las primeras horas, esa hoja fue el único lugar de la ficha donde la gravedad existía. Nadie le preguntó qué pensaba hasta que la internista lo hizo en la mañana, y la respuesta no cabía en ninguna casilla: «A mí no me pareció la de siempre; no quiso ni el agua». Fue la primera versión de «esta vez es distinto» que el equipo escuchó, y venía de quien había mirado a Carmen más tiempo que nadie.</w:t>
+        <w:t xml:space="preserve">Y está Marcela, la enfermera de urgencias, que midió el llene capilar de tres a cuatro segundos y anotó las rodillas moteadas en su hoja. Durante las primeras horas, esa hoja fue el único lugar de la ficha donde la gravedad existía. Nadie le preguntó qué pensaba hasta que la internista lo hizo en la mañana, y la respuesta no cabía en ninguna casilla: «A mí no me pareció la de siempre; no quiso ni el agua». Fue la primera versión de «esta vez es distinto» que el equipo escuchó, y venía de quien había mirado a Carmen más tiempo que nadie.</w:t>
       </w:r>
     </w:p>
     <w:p>
@@ -7585,7 +7585,7 @@
         <w:pStyle w:val="BodyJ"/>
       </w:pPr>
       <w:r>
-        <w:t xml:space="preserve">Los dos momentos de Carmen ilustran esta asimetría de costos. En la madrugada del ingreso, con la paciente en shock pero con una tomografía sin necrosis ni perforación libre, entrar a pabellón en plena inestabilidad hemodinámica conllevaba una mortalidad perioperatoria altísima. Como el cuadro cedió rápido con descompresión nasogástrica y antibióticos, el umbral para una cirugía de rescate inmediato era muy alto, y fue prudente no cruzarlo. Días después, con Carmen recuperada en sala, la matriz de consecuencias se invierte. El error más costoso ya no es operar a una paciente inestable, sino enviarla de alta con el anillo herniario intacto. Un quinto atascamiento reproduciría entonces el shock séptico en su casa, lejos de una cama crítica. La anatomía radiológica es la misma; lo que desplazó el umbral terapéutico hacia la reparación electiva fue el nuevo peso pronóstico del error de omisión. La Figura 11 pone los dos momentos uno junto al otro.</w:t>
+        <w:t xml:space="preserve">Los dos momentos de Carmen ilustran esta asimetría de costos. En la madrugada del ingreso, la pregunta era si había indicación de cirugía de urgencia: isquemia, perforación o un abdomen que no respondiera. La reanimación respondió en pocas horas —con 2.000 ml de Ringer lactato y noradrenalina, el llene capilar mejoró, la taquicardia bajó y el dolor abdominal cedió—, el abdomen no tenía signos peritoneales y la tomografía no mostraba isquemia: el umbral para operar de urgencia no se cruzó, y la decisión quedó vigilada, con el abdomen reexaminado y un lactato de control que bajó a 2,3 mmol/L. Días después, con Carmen recuperada en sala, la matriz de consecuencias se invierte. El error más costoso ya no es operar sin indicación, sino enviarla de alta con el anillo herniario intacto. Un quinto atascamiento reproduciría entonces el shock séptico en su casa, lejos de una cama crítica. La anatomía radiológica es la misma; lo que desplazó el umbral terapéutico hacia la reparación electiva fue el nuevo peso pronóstico del error de omisión. La Figura 11 pone los dos momentos uno junto al otro.</w:t>
       </w:r>
     </w:p>
     <w:tbl>
@@ -7668,7 +7668,7 @@
               <w:pStyle w:val="Caption"/>
             </w:pPr>
             <w:r>
-              <w:t xml:space="preserve">Figura 11. La línea de tiempo de Carmen y el umbral que se mueve: en la madrugada, el daño esperado de operar en shock supera al de esperar; al día 7, el daño esperado de un alta sin operar supera al de una cirugía programada. Los hechos anatómicos no cambiaron; cambió el costo del error de omisión.</w:t>
+              <w:t xml:space="preserve">Figura 11. La línea de tiempo de Carmen y el umbral que se mueve: en la madrugada, sin isquemia ni signos peritoneales y con respuesta a la reanimación, el daño esperado de operar de urgencia supera al de reanimar y vigilar; al día 7, el daño esperado de un alta sin operar supera al de una cirugía programada. Los hechos anatómicos no cambiaron; cambió el costo del error de omisión.</w:t>
             </w:r>
           </w:p>
         </w:tc>
@@ -11425,7 +11425,7 @@
         <w:pStyle w:val="BodyJ"/>
       </w:pPr>
       <w:r>
-        <w:t xml:space="preserve">Una técnica útil es escribir primero sin diagnósticos: edad y contexto; temporalidad; fisiología; examen; microbiología; imagen; respuesta; antecedentes que modifican prior. Esta suspensión breve impide que la etiqueta ordene retroactivamente los datos. Los hechos decisivos de Carmen caben en una línea cada uno, con su fuente: cuarto episodio en doce meses; lactato de 6,0 mmol/L a las 04:15; llene capilar de cinco segundos medido por Marcela; hemocultivos positivos a las 14 horas; tomografía sin isquemia; y la frase textual «esta vez la hernia no se dejó acomodar».</w:t>
+        <w:t xml:space="preserve">Una técnica útil es escribir primero sin diagnósticos: edad y contexto; temporalidad; fisiología; examen; microbiología; imagen; respuesta; antecedentes que modifican prior. Esta suspensión breve impide que la etiqueta ordene retroactivamente los datos. Los hechos decisivos de Carmen caben en una línea cada uno, con su fuente: cuarto episodio en doce meses; presión arterial media de 55 mmHg y 112 latidos por minuto; lactato de 3,9 mmol/L a las 04:15 y de 2,3 en el control; llene capilar de tres a cuatro segundos medido por Marcela; hemocultivos positivos a las 12 horas; tomografía sin isquemia; y la frase textual «esta vez la hernia no se dejó acomodar».</w:t>
       </w:r>
     </w:p>
     <w:p>
@@ -11945,7 +11945,7 @@
         <w:pStyle w:val="BodyJ"/>
       </w:pPr>
       <w:r>
-        <w:t xml:space="preserve">Mujer de 61 años con hernia incisional de la línea media y tres hospitalizaciones en el último año por suboclusión intestinal, todas resueltas con manejo médico conservador. Ingresa por un cuarto episodio obstructivo, esta vez asociado a shock séptico, hiperlactatemia (6,0 mmol/L), hipoperfusión periférica (llene capilar de 5 segundos) y bacteriemia por bacilos gramnegativos (2/2 hemocultivos). Evoluciona favorablemente con reposo digestivo, descompresión por sonda nasogástrica, noradrenalina y antibioterapia. La tomografía de abdomen no muestra perforación, isquemia mesentérica ni estrangulación actual.</w:t>
+        <w:t xml:space="preserve">Mujer de 61 años con hernia incisional de la línea media y tres hospitalizaciones en el último año por suboclusión intestinal, todas resueltas con manejo médico conservador. Ingresa por un cuarto episodio obstructivo, esta vez asociado a shock séptico (presión arterial media de 55 mmHg y 112 lpm), hiperlactatemia (3,9 mmol/L), hipoperfusión periférica (llene capilar de 3 a 4 segundos) y bacteriemia por bacilos gramnegativos (2/2 hemocultivos, positivos a las 12 horas). Recibe 2.000 ml de Ringer lactato en tres horas, noradrenalina por vía periférica hasta 0,2 mcg/kg/min, ceftriaxona con metronidazol, reposo digestivo y descompresión por sonda nasogástrica: el llene capilar mejora, la taquicardia cede, el dolor abdominal se resuelve y el lactato de control baja a 2,3 mmol/L. La tomografía de abdomen no muestra perforación, isquemia mesentérica ni estrangulación actual, y el abdomen no tiene signos peritoneales.</w:t>
       </w:r>
     </w:p>
     <w:p>
@@ -11975,7 +11975,7 @@
         <w:t xml:space="preserve">Inferencia:</w:t>
       </w:r>
       <w:r>
-        <w:t xml:space="preserve"> el foco abdominal de la bacteriemia, secundario al evento obstructivo, es altamente probable por secuencia temporal y microbiología compatible, aunque el mecanismo íntimo (translocación bacteriana o microisquemia transitoria) no esté demostrado. La ausencia de estrangulación tomográfica desactiva la urgencia quirúrgica inmediata, pero no mitiga el riesgo acumulado de recurrencia.</w:t>
+        <w:t xml:space="preserve"> el foco abdominal de la bacteriemia, secundario al evento obstructivo, es altamente probable por secuencia temporal y microbiología compatible, aunque el mecanismo íntimo (translocación bacteriana o microisquemia transitoria) no esté demostrado. La tomografía sin isquemia, el abdomen sin signos peritoneales y la respuesta a la reanimación hacen improbable una estrangulación y no indican cirugía de urgencia; no mitigan el riesgo acumulado de recurrencia.</w:t>
       </w:r>
     </w:p>
     <w:p>

</xml_diff>

<commit_message>
Cuaderno de casos: las viñetas 1 y 2 sin repetir lo ya escrito
El panel del 16 de octubre marcó dos ejemplos contados dos veces. La
viñeta 1 repetía en capas el Interludio I, y la viñeta 2, la matriz
HII-D del cap. 12. Ahora remiten a esas versiones y guardan sólo lo
que no tienen: la frase medular de entrega de turno y el epílogo de
Carmen (viñeta 1; 354 → 123 palabras); la frase medular, qué se
vigila y la lectura del antecedente de BLEE al revés (viñeta 2;
347 → 241). La introducción del cuaderno lo dice. La numeración de
las viñetas no cambia.

Co-Authored-By: Claude Opus 5.5 <noreply@anthropic.com>
Claude-Session: https://claude.ai/code/session_01SPkhDdVzUCxJwqq61ddeLW
</commit_message>
<xml_diff>
--- a/Hechos_inferencias_incertidumbre_edicion_revisada.docx
+++ b/Hechos_inferencias_incertidumbre_edicion_revisada.docx
@@ -750,7 +750,7 @@
         <w:rPr>
           <w:color w:val="8A8A8A"/>
         </w:rPr>
-        <w:t xml:space="preserve">106</w:t>
+        <w:t xml:space="preserve">105</w:t>
       </w:r>
     </w:p>
     <w:p>
@@ -771,7 +771,7 @@
         <w:rPr>
           <w:color w:val="8A8A8A"/>
         </w:rPr>
-        <w:t xml:space="preserve">110</w:t>
+        <w:t xml:space="preserve">109</w:t>
       </w:r>
     </w:p>
     <w:p>
@@ -792,7 +792,7 @@
         <w:rPr>
           <w:color w:val="8A8A8A"/>
         </w:rPr>
-        <w:t xml:space="preserve">118</w:t>
+        <w:t xml:space="preserve">117</w:t>
       </w:r>
     </w:p>
     <w:p>
@@ -813,7 +813,7 @@
         <w:rPr>
           <w:color w:val="8A8A8A"/>
         </w:rPr>
-        <w:t xml:space="preserve">121</w:t>
+        <w:t xml:space="preserve">120</w:t>
       </w:r>
     </w:p>
     <w:p>
@@ -834,7 +834,7 @@
         <w:rPr>
           <w:color w:val="8A8A8A"/>
         </w:rPr>
-        <w:t xml:space="preserve">123</w:t>
+        <w:t xml:space="preserve">122</w:t>
       </w:r>
     </w:p>
     <w:p>
@@ -855,7 +855,7 @@
         <w:rPr>
           <w:color w:val="8A8A8A"/>
         </w:rPr>
-        <w:t xml:space="preserve">125</w:t>
+        <w:t xml:space="preserve">124</w:t>
       </w:r>
     </w:p>
     <w:p>
@@ -876,7 +876,7 @@
         <w:rPr>
           <w:color w:val="8A8A8A"/>
         </w:rPr>
-        <w:t xml:space="preserve">127</w:t>
+        <w:t xml:space="preserve">126</w:t>
       </w:r>
     </w:p>
     <w:p>
@@ -897,7 +897,7 @@
         <w:rPr>
           <w:color w:val="8A8A8A"/>
         </w:rPr>
-        <w:t xml:space="preserve">130</w:t>
+        <w:t xml:space="preserve">129</w:t>
       </w:r>
     </w:p>
     <w:p>
@@ -918,7 +918,7 @@
         <w:rPr>
           <w:color w:val="8A8A8A"/>
         </w:rPr>
-        <w:t xml:space="preserve">140</w:t>
+        <w:t xml:space="preserve">139</w:t>
       </w:r>
     </w:p>
     <w:p>
@@ -939,7 +939,7 @@
         <w:rPr>
           <w:color w:val="8A8A8A"/>
         </w:rPr>
-        <w:t xml:space="preserve">144</w:t>
+        <w:t xml:space="preserve">143</w:t>
       </w:r>
     </w:p>
     <w:p>
@@ -960,7 +960,7 @@
         <w:rPr>
           <w:color w:val="8A8A8A"/>
         </w:rPr>
-        <w:t xml:space="preserve">150</w:t>
+        <w:t xml:space="preserve">149</w:t>
       </w:r>
     </w:p>
     <w:p>
@@ -981,7 +981,7 @@
         <w:rPr>
           <w:color w:val="8A8A8A"/>
         </w:rPr>
-        <w:t xml:space="preserve">154</w:t>
+        <w:t xml:space="preserve">153</w:t>
       </w:r>
     </w:p>
     <w:p>
@@ -1002,7 +1002,7 @@
         <w:rPr>
           <w:color w:val="8A8A8A"/>
         </w:rPr>
-        <w:t xml:space="preserve">155</w:t>
+        <w:t xml:space="preserve">154</w:t>
       </w:r>
     </w:p>
     <w:p>
@@ -1023,7 +1023,7 @@
         <w:rPr>
           <w:color w:val="8A8A8A"/>
         </w:rPr>
-        <w:t xml:space="preserve">157</w:t>
+        <w:t xml:space="preserve">156</w:t>
       </w:r>
     </w:p>
     <w:p>
@@ -1044,7 +1044,7 @@
         <w:rPr>
           <w:color w:val="8A8A8A"/>
         </w:rPr>
-        <w:t xml:space="preserve">167</w:t>
+        <w:t xml:space="preserve">166</w:t>
       </w:r>
     </w:p>
     <w:p>
@@ -11939,7 +11939,7 @@
         <w:keepNext w:val="false"/>
       </w:pPr>
       <w:r>
-        <w:t xml:space="preserve">Las viñetas siguientes son composiciones docentes. Cada una se presenta con la estructura HII-D y una frase medular. No son casos «resueltos»: son casos representados. La invitación es leer cada uno dos veces —primero como clínico, buscando la conducta; después como lector metacognitivo, observando qué hace cada capa—.</w:t>
+        <w:t xml:space="preserve">Las viñetas siguientes son composiciones docentes. Cada una se presenta con la estructura HII-D y una frase medular, salvo las dos primeras: vuelven a casos que el libro ya escribió en capas (el Interludio I y el capítulo 12) y guardan sólo lo que esas versiones no tienen. No son casos «resueltos»: son casos representados. La invitación es leer cada uno dos veces —primero como clínico, buscando la conducta; después como lector metacognitivo, observando qué hace cada capa—.</w:t>
       </w:r>
     </w:p>
     <w:p>
@@ -11967,80 +11967,16 @@
         <w:keepNext w:val="false"/>
       </w:pPr>
       <w:r>
-        <w:t xml:space="preserve">La historia de Carmen atraviesa todo este libro; aquí se presenta en su versión condensada, tal como se sintetizaría en una entrega de turno o en una discusión clínica.</w:t>
-      </w:r>
-    </w:p>
-    <w:p>
-      <w:pPr>
-        <w:pStyle w:val="BodyJ"/>
-        <w:keepNext w:val="false"/>
-      </w:pPr>
-      <w:r>
-        <w:t xml:space="preserve">Mujer de 61 años con hernia incisional de la línea media y tres hospitalizaciones en el último año por suboclusión intestinal, todas resueltas con manejo médico conservador. Ingresa por un cuarto episodio obstructivo, esta vez asociado a shock séptico (presión arterial media de 55 mmHg y 112 lpm), hiperlactatemia (3,9 mmol/L), hipoperfusión periférica (llene capilar de 3 a 4 segundos) y bacteriemia por bacilos gramnegativos (2/2 hemocultivos, positivos a las 12 horas). Recibe 2.000 ml de Ringer lactato en tres horas, noradrenalina por vía periférica hasta 0,2 mcg/kg/min, ceftriaxona con metronidazol, reposo digestivo y descompresión por sonda nasogástrica: el llene capilar mejora, la taquicardia cede, el dolor abdominal se resuelve y el lactato de control baja a 2,3 mmol/L. La tomografía de abdomen no muestra perforación, isquemia mesentérica ni estrangulación actual, y el abdomen no tiene signos peritoneales.</w:t>
-      </w:r>
-    </w:p>
-    <w:p>
-      <w:pPr>
-        <w:pStyle w:val="BodyJ"/>
-        <w:keepNext w:val="false"/>
-      </w:pPr>
-      <w:r>
-        <w:rPr>
-          <w:i/>
-          <w:iCs/>
-        </w:rPr>
-        <w:t xml:space="preserve">Hechos:</w:t>
-      </w:r>
-      <w:r>
-        <w:t xml:space="preserve"> recurrencia obstructiva documentada y con intervalos cada vez más cortos; episodio actual con compromiso hemodinámico vital y bacteriemia demostrada; respuesta clínica favorable al soporte intensivo; ausencia de complicación quirúrgica aguda en la tomografía inicial.</w:t>
-      </w:r>
-    </w:p>
-    <w:p>
-      <w:pPr>
-        <w:pStyle w:val="BodyJ"/>
-        <w:keepNext w:val="false"/>
-      </w:pPr>
-      <w:r>
-        <w:rPr>
-          <w:i/>
-          <w:iCs/>
-        </w:rPr>
-        <w:t xml:space="preserve">Inferencia:</w:t>
-      </w:r>
-      <w:r>
-        <w:t xml:space="preserve"> el foco abdominal de la bacteriemia, secundario al evento obstructivo, es altamente probable por secuencia temporal y microbiología compatible, aunque el mecanismo íntimo (translocación bacteriana o microisquemia transitoria) no esté demostrado. La tomografía sin isquemia, el abdomen sin signos peritoneales y la respuesta a la reanimación hacen improbable una estrangulación y no indican cirugía de urgencia; no mitigan el riesgo acumulado de recurrencia.</w:t>
-      </w:r>
-    </w:p>
-    <w:p>
-      <w:pPr>
-        <w:pStyle w:val="BodyJ"/>
-        <w:keepNext w:val="false"/>
-      </w:pPr>
-      <w:r>
-        <w:rPr>
-          <w:i/>
-          <w:iCs/>
-        </w:rPr>
-        <w:t xml:space="preserve">Incertidumbre:</w:t>
-      </w:r>
-      <w:r>
-        <w:t xml:space="preserve"> son inciertos el plazo hasta una quinta obstrucción, la magnitud del daño si ésta ocurre fuera del hospital y la reserva funcional efectiva de la paciente para enfrentar el estrés quirúrgico una vez recuperada.</w:t>
-      </w:r>
-    </w:p>
-    <w:p>
-      <w:pPr>
-        <w:pStyle w:val="BodyJ"/>
-        <w:keepNext w:val="false"/>
-      </w:pPr>
-      <w:r>
-        <w:rPr>
-          <w:i/>
-          <w:iCs/>
-        </w:rPr>
-        <w:t xml:space="preserve">Decisión:</w:t>
-      </w:r>
-      <w:r>
-        <w:t xml:space="preserve"> solicitar evaluación quirúrgica precoz para planificar reparación electiva tras optimización médica y kinésica, documentando una decisión compartida. El fundamento para operar no es que «fracasó el manejo médico» (resolvió el cuadro agudo cuatro veces), sino que la gravedad vital alcanzada en este episodio vuelve inaceptable el riesgo de mantener una conducta expectante.</w:t>
+        <w:t xml:space="preserve">La historia de Carmen atraviesa todo este libro. Sus datos y sus cuatro capas están escritos en el Interludio I, y no se repiten aquí; esta viñeta guarda lo que cabe en una entrega de turno y el final que el libro le debía.</w:t>
+      </w:r>
+    </w:p>
+    <w:p>
+      <w:pPr>
+        <w:pStyle w:val="BodyJ"/>
+        <w:keepNext w:val="false"/>
+      </w:pPr>
+      <w:r>
+        <w:t xml:space="preserve">Mujer de 61 años con hernia incisional de la línea media y tres suboclusiones en el último año, resueltas con manejo médico. Ingresa por un cuarto episodio, esta vez con shock séptico y bacteriemia por gramnegativos, que responde en pocas horas a la reanimación y a los antibióticos; la tomografía no muestra isquemia ni perforación, y el abdomen no tiene signos peritoneales. La cirugía de urgencia no está indicada; la pregunta es otra: qué pasa si vuelve a ocurrir.</w:t>
       </w:r>
     </w:p>
     <w:p>
@@ -12100,7 +12036,7 @@
         <w:keepNext w:val="false"/>
       </w:pPr>
       <w:r>
-        <w:t xml:space="preserve">Es el paciente de la cama 12 del capítulo 8, el mismo cuya ficha el capítulo 12 ordenó en la matriz HII-D; aquí, en la versión que cabe en una entrega de turno. Hombre con lesión medular completa, vejiga neurogénica, sonda Foley permanente y un cáncer renal metastásico en progresión. Tras un recambio traumático de sonda presenta orina turbia, piuria y urocultivo positivo; está afebril, estable y sin cambios respecto de su basal. Los marcadores inflamatorios están elevados, sin valores previos y con el tumor como causa concomitante, y tiene antecedente de colonización por enterobacteria productora de BLEE.</w:t>
+        <w:t xml:space="preserve">Es el paciente de la cama 12 del capítulo 8, cuya ficha el capítulo 12 ordenó entera en la matriz HII-D: hombre con lesión medular completa, sonda Foley permanente y un cáncer renal metastásico en progresión, con orina turbia, piuria y urocultivo positivo tras un recambio traumático de sonda, afebril y estable, y con antecedente de colonización por enterobacteria productora de BLEE. Las cuatro capas no se repiten; esta viñeta guarda lo que cabe en una entrega de turno y una lectura del antecedente que suele hacerse al revés.</w:t>
       </w:r>
     </w:p>
     <w:p>
@@ -12113,10 +12049,10 @@
           <w:i/>
           <w:iCs/>
         </w:rPr>
-        <w:t xml:space="preserve">Hechos:</w:t>
-      </w:r>
-      <w:r>
-        <w:t xml:space="preserve"> recambio reciente de sonda; piuria y urocultivo positivo; tercer día de antibiótico indicado como pielonefritis; afebril y estable; síntomas urinarios bajos no evaluables por el nivel lesional; reactantes elevados sin basal, con cáncer renal metastásico activo; colonización documentada por BLEE.</w:t>
+        <w:t xml:space="preserve">Frase medular:</w:t>
+      </w:r>
+      <w:r>
+        <w:t xml:space="preserve"> «Urocultivo positivo y piuria tras recambio de sonda Foley en paciente con lesión medular y antecedente de colonización por BLEE, sin respuesta sistémica ni signos autonómicos que configuren infección activa. Se interpreta como bacteriuria asociada a catéter; se suspende el antibiótico, con vigilancia clínica estricta y criterios explícitos de reapertura.»</w:t>
       </w:r>
     </w:p>
     <w:p>
@@ -12129,10 +12065,10 @@
           <w:i/>
           <w:iCs/>
         </w:rPr>
-        <w:t xml:space="preserve">Inferencia:</w:t>
-      </w:r>
-      <w:r>
-        <w:t xml:space="preserve"> el cuadro es altamente compatible con una bacteriuria asociada a catéter por colonización crónica (favorecida por el arrastre del recambio) más que con una infección urinaria sintomática asociada a sonda. Por sí solas, ni la turbidez ni la piuria discriminan entre colonización e infección invasiva en pacientes sondados, y la elevación inflamatoria sistémica es explicable por su neoplasia de base.</w:t>
+        <w:t xml:space="preserve">Qué se vigila, por escrito:</w:t>
+      </w:r>
+      <w:r>
+        <w:t xml:space="preserve"> fiebre nueva, inestabilidad hemodinámica, aumento súbito de espasticidad, sudoración o malestar general inexplicable. Son los equivalentes de una respuesta sistémica o autonómica en quien no puede sentir la disuria ni el dolor lumbar.</w:t>
       </w:r>
     </w:p>
     <w:p>
@@ -12145,42 +12081,10 @@
           <w:i/>
           <w:iCs/>
         </w:rPr>
-        <w:t xml:space="preserve">Incertidumbre:</w:t>
-      </w:r>
-      <w:r>
-        <w:t xml:space="preserve"> la denervación medular enmascara la disuria y el dolor lumbar, por lo que persiste la duda de una infección incipiente con expresión clínica atípica.</w:t>
-      </w:r>
-    </w:p>
-    <w:p>
-      <w:pPr>
-        <w:pStyle w:val="BodyJ"/>
-        <w:keepNext w:val="false"/>
-      </w:pPr>
-      <w:r>
-        <w:rPr>
-          <w:i/>
-          <w:iCs/>
-        </w:rPr>
-        <w:t xml:space="preserve">Decisión:</w:t>
-      </w:r>
-      <w:r>
-        <w:t xml:space="preserve"> suspender el antibiótico empírico. Instaurar vigilancia clínica dirigida a signos equivalentes de respuesta sistémica o autonómica (fiebre nueva, inestabilidad hemodinámica, aumento súbito de espasticidad, sudoración o malestar general inexplicable). Aquí, el antecedente de germen BLEE no es un gatillo para prescribir antes, sino al revés. Como un tratamiento dirigido probablemente exigiría carbapenémicos, de alto impacto ecológico y toxicidad potencial, el umbral clínico para reiniciar antibióticos debe ser más exigente.</w:t>
-      </w:r>
-    </w:p>
-    <w:p>
-      <w:pPr>
-        <w:pStyle w:val="BodyJ"/>
-        <w:keepNext w:val="false"/>
-      </w:pPr>
-      <w:r>
-        <w:rPr>
-          <w:i/>
-          <w:iCs/>
-        </w:rPr>
-        <w:t xml:space="preserve">Frase medular:</w:t>
-      </w:r>
-      <w:r>
-        <w:t xml:space="preserve"> «Urocultivo positivo y piuria tras recambio de sonda Foley en paciente con lesión medular y antecedente de colonización por BLEE, sin respuesta sistémica ni signos autonómicos que configuren infección activa. Se interpreta como bacteriuria asociada a catéter; se suspende el antibiótico, con vigilancia clínica estricta y criterios explícitos de reapertura.»</w:t>
+        <w:t xml:space="preserve">Lectura metacognitiva.</w:t>
+      </w:r>
+      <w:r>
+        <w:t xml:space="preserve"> El antecedente de BLEE suele leerse como un gatillo para prescribir antes, y es al revés: como un tratamiento dirigido probablemente exigiría carbapenémicos, de alto impacto ecológico y toxicidad potencial, el umbral para reiniciar antibióticos debe ser más exigente, no menos. Y ni la turbidez ni la piuria discriminan, por sí solas, entre colonización e infección en un paciente sondado.</w:t>
       </w:r>
     </w:p>
     <w:p>

</xml_diff>

<commit_message>
Gelasio como fuente del libro
Decisión del autor tras ver su texto en seis fuentes. Gelasio (OFL,
mismas medidas que Georgia) queda versionada en fuentes/tipografia/
con su licencia; construir.sh se la muestra a LibreOffice con un
fonts.conf temporal, sin instalarla, así la CI y cualquier sesión la
usan igual. El EPUB la pide primero. comprobar.py falla si el PDF
lleva otra fuente (probado con el PDF anterior, en DejaVu Serif).
La marca del glosario «∗» se imprime como «*» y «β-hCG» pasa a
«beta-hCG», los dos caracteres que Gelasio no tiene.

167 páginas (163 de cuerpo), TOC 41/41 estable, 0 problemas.
README punto 50; AGENTS.md y ESTADO.md al día; lector reconstruido.

Co-Authored-By: Claude Opus 5.5 <noreply@anthropic.com>
Claude-Session: https://claude.ai/code/session_01SPkhDdVzUCxJwqq61ddeLW
</commit_message>
<xml_diff>
--- a/Hechos_inferencias_incertidumbre_edicion_revisada.docx
+++ b/Hechos_inferencias_incertidumbre_edicion_revisada.docx
@@ -10,7 +10,7 @@
       </w:pPr>
       <w:r>
         <w:rPr>
-          <w:rFonts w:ascii="Georgia" w:cs="Georgia" w:eastAsia="Georgia" w:hAnsi="Georgia"/>
+          <w:rFonts w:ascii="Gelasio" w:cs="Gelasio" w:eastAsia="Gelasio" w:hAnsi="Gelasio"/>
           <w:b/>
           <w:bCs/>
           <w:color w:val="2B2B2B"/>
@@ -28,7 +28,7 @@
       </w:pPr>
       <w:r>
         <w:rPr>
-          <w:rFonts w:ascii="Georgia" w:cs="Georgia" w:eastAsia="Georgia" w:hAnsi="Georgia"/>
+          <w:rFonts w:ascii="Gelasio" w:cs="Gelasio" w:eastAsia="Gelasio" w:hAnsi="Gelasio"/>
           <w:b/>
           <w:bCs/>
           <w:color w:val="2B2B2B"/>
@@ -46,7 +46,7 @@
       </w:pPr>
       <w:r>
         <w:rPr>
-          <w:rFonts w:ascii="Georgia" w:cs="Georgia" w:eastAsia="Georgia" w:hAnsi="Georgia"/>
+          <w:rFonts w:ascii="Gelasio" w:cs="Gelasio" w:eastAsia="Gelasio" w:hAnsi="Gelasio"/>
           <w:i/>
           <w:iCs/>
           <w:color w:val="3D5A6C"/>
@@ -64,7 +64,7 @@
       </w:pPr>
       <w:r>
         <w:rPr>
-          <w:rFonts w:ascii="Georgia" w:cs="Georgia" w:eastAsia="Georgia" w:hAnsi="Georgia"/>
+          <w:rFonts w:ascii="Gelasio" w:cs="Gelasio" w:eastAsia="Gelasio" w:hAnsi="Gelasio"/>
           <w:color w:val="8A8A8A"/>
           <w:sz w:val="24"/>
           <w:szCs w:val="24"/>
@@ -80,7 +80,7 @@
       </w:pPr>
       <w:r>
         <w:rPr>
-          <w:rFonts w:ascii="Georgia" w:cs="Georgia" w:eastAsia="Georgia" w:hAnsi="Georgia"/>
+          <w:rFonts w:ascii="Gelasio" w:cs="Gelasio" w:eastAsia="Gelasio" w:hAnsi="Gelasio"/>
           <w:b/>
           <w:bCs/>
           <w:color w:val="2B2B2B"/>
@@ -98,7 +98,7 @@
       </w:pPr>
       <w:r>
         <w:rPr>
-          <w:rFonts w:ascii="Georgia" w:cs="Georgia" w:eastAsia="Georgia" w:hAnsi="Georgia"/>
+          <w:rFonts w:ascii="Gelasio" w:cs="Gelasio" w:eastAsia="Gelasio" w:hAnsi="Gelasio"/>
           <w:color w:val="8A8A8A"/>
           <w:sz w:val="22"/>
           <w:szCs w:val="22"/>
@@ -121,7 +121,7 @@
       </w:pPr>
       <w:r>
         <w:rPr>
-          <w:rFonts w:ascii="Georgia" w:cs="Georgia" w:eastAsia="Georgia" w:hAnsi="Georgia"/>
+          <w:rFonts w:ascii="Gelasio" w:cs="Gelasio" w:eastAsia="Gelasio" w:hAnsi="Gelasio"/>
           <w:b/>
           <w:bCs/>
           <w:color w:val="2B2B2B"/>
@@ -138,7 +138,7 @@
       </w:pPr>
       <w:r>
         <w:rPr>
-          <w:rFonts w:ascii="Georgia" w:cs="Georgia" w:eastAsia="Georgia" w:hAnsi="Georgia"/>
+          <w:rFonts w:ascii="Gelasio" w:cs="Gelasio" w:eastAsia="Gelasio" w:hAnsi="Gelasio"/>
           <w:color w:val="2B2B2B"/>
           <w:sz w:val="20"/>
           <w:szCs w:val="20"/>
@@ -176,7 +176,7 @@
       </w:pPr>
       <w:r>
         <w:rPr>
-          <w:rFonts w:ascii="Georgia" w:cs="Georgia" w:eastAsia="Georgia" w:hAnsi="Georgia"/>
+          <w:rFonts w:ascii="Gelasio" w:cs="Gelasio" w:eastAsia="Gelasio" w:hAnsi="Gelasio"/>
           <w:b/>
           <w:bCs/>
           <w:color w:val="2B2B2B"/>
@@ -267,7 +267,7 @@
         <w:rPr>
           <w:color w:val="8A8A8A"/>
         </w:rPr>
-        <w:t xml:space="preserve">9</w:t>
+        <w:t xml:space="preserve">8</w:t>
       </w:r>
     </w:p>
     <w:p>
@@ -288,7 +288,7 @@
         <w:rPr>
           <w:color w:val="8A8A8A"/>
         </w:rPr>
-        <w:t xml:space="preserve">10</w:t>
+        <w:t xml:space="preserve">9</w:t>
       </w:r>
     </w:p>
     <w:p>
@@ -309,7 +309,7 @@
         <w:rPr>
           <w:color w:val="8A8A8A"/>
         </w:rPr>
-        <w:t xml:space="preserve">16</w:t>
+        <w:t xml:space="preserve">14</w:t>
       </w:r>
     </w:p>
     <w:p>
@@ -330,7 +330,7 @@
         <w:rPr>
           <w:color w:val="8A8A8A"/>
         </w:rPr>
-        <w:t xml:space="preserve">21</w:t>
+        <w:t xml:space="preserve">18</w:t>
       </w:r>
     </w:p>
     <w:p>
@@ -351,7 +351,7 @@
         <w:rPr>
           <w:color w:val="8A8A8A"/>
         </w:rPr>
-        <w:t xml:space="preserve">25</w:t>
+        <w:t xml:space="preserve">22</w:t>
       </w:r>
     </w:p>
     <w:p>
@@ -372,7 +372,7 @@
         <w:rPr>
           <w:color w:val="8A8A8A"/>
         </w:rPr>
-        <w:t xml:space="preserve">30</w:t>
+        <w:t xml:space="preserve">27</w:t>
       </w:r>
     </w:p>
     <w:p>
@@ -393,7 +393,7 @@
         <w:rPr>
           <w:color w:val="8A8A8A"/>
         </w:rPr>
-        <w:t xml:space="preserve">32</w:t>
+        <w:t xml:space="preserve">29</w:t>
       </w:r>
     </w:p>
     <w:p>
@@ -414,7 +414,7 @@
         <w:rPr>
           <w:color w:val="8A8A8A"/>
         </w:rPr>
-        <w:t xml:space="preserve">33</w:t>
+        <w:t xml:space="preserve">30</w:t>
       </w:r>
     </w:p>
     <w:p>
@@ -435,7 +435,7 @@
         <w:rPr>
           <w:color w:val="8A8A8A"/>
         </w:rPr>
-        <w:t xml:space="preserve">39</w:t>
+        <w:t xml:space="preserve">36</w:t>
       </w:r>
     </w:p>
     <w:p>
@@ -456,7 +456,7 @@
         <w:rPr>
           <w:color w:val="8A8A8A"/>
         </w:rPr>
-        <w:t xml:space="preserve">43</w:t>
+        <w:t xml:space="preserve">40</w:t>
       </w:r>
     </w:p>
     <w:p>
@@ -477,7 +477,7 @@
         <w:rPr>
           <w:color w:val="8A8A8A"/>
         </w:rPr>
-        <w:t xml:space="preserve">47</w:t>
+        <w:t xml:space="preserve">44</w:t>
       </w:r>
     </w:p>
     <w:p>
@@ -498,7 +498,7 @@
         <w:rPr>
           <w:color w:val="8A8A8A"/>
         </w:rPr>
-        <w:t xml:space="preserve">52</w:t>
+        <w:t xml:space="preserve">49</w:t>
       </w:r>
     </w:p>
     <w:p>
@@ -519,7 +519,7 @@
         <w:rPr>
           <w:color w:val="8A8A8A"/>
         </w:rPr>
-        <w:t xml:space="preserve">54</w:t>
+        <w:t xml:space="preserve">51</w:t>
       </w:r>
     </w:p>
     <w:p>
@@ -540,7 +540,7 @@
         <w:rPr>
           <w:color w:val="8A8A8A"/>
         </w:rPr>
-        <w:t xml:space="preserve">55</w:t>
+        <w:t xml:space="preserve">52</w:t>
       </w:r>
     </w:p>
     <w:p>
@@ -561,7 +561,7 @@
         <w:rPr>
           <w:color w:val="8A8A8A"/>
         </w:rPr>
-        <w:t xml:space="preserve">59</w:t>
+        <w:t xml:space="preserve">56</w:t>
       </w:r>
     </w:p>
     <w:p>
@@ -582,7 +582,7 @@
         <w:rPr>
           <w:color w:val="8A8A8A"/>
         </w:rPr>
-        <w:t xml:space="preserve">65</w:t>
+        <w:t xml:space="preserve">62</w:t>
       </w:r>
     </w:p>
     <w:p>
@@ -603,7 +603,7 @@
         <w:rPr>
           <w:color w:val="8A8A8A"/>
         </w:rPr>
-        <w:t xml:space="preserve">69</w:t>
+        <w:t xml:space="preserve">66</w:t>
       </w:r>
     </w:p>
     <w:p>
@@ -624,7 +624,7 @@
         <w:rPr>
           <w:color w:val="8A8A8A"/>
         </w:rPr>
-        <w:t xml:space="preserve">75</w:t>
+        <w:t xml:space="preserve">72</w:t>
       </w:r>
     </w:p>
     <w:p>
@@ -645,7 +645,7 @@
         <w:rPr>
           <w:color w:val="8A8A8A"/>
         </w:rPr>
-        <w:t xml:space="preserve">80</w:t>
+        <w:t xml:space="preserve">76</w:t>
       </w:r>
     </w:p>
     <w:p>
@@ -666,7 +666,7 @@
         <w:rPr>
           <w:color w:val="8A8A8A"/>
         </w:rPr>
-        <w:t xml:space="preserve">82</w:t>
+        <w:t xml:space="preserve">78</w:t>
       </w:r>
     </w:p>
     <w:p>
@@ -687,7 +687,7 @@
         <w:rPr>
           <w:color w:val="8A8A8A"/>
         </w:rPr>
-        <w:t xml:space="preserve">83</w:t>
+        <w:t xml:space="preserve">79</w:t>
       </w:r>
     </w:p>
     <w:p>
@@ -708,7 +708,7 @@
         <w:rPr>
           <w:color w:val="8A8A8A"/>
         </w:rPr>
-        <w:t xml:space="preserve">89</w:t>
+        <w:t xml:space="preserve">85</w:t>
       </w:r>
     </w:p>
     <w:p>
@@ -729,7 +729,7 @@
         <w:rPr>
           <w:color w:val="8A8A8A"/>
         </w:rPr>
-        <w:t xml:space="preserve">96</w:t>
+        <w:t xml:space="preserve">92</w:t>
       </w:r>
     </w:p>
     <w:p>
@@ -750,7 +750,7 @@
         <w:rPr>
           <w:color w:val="8A8A8A"/>
         </w:rPr>
-        <w:t xml:space="preserve">105</w:t>
+        <w:t xml:space="preserve">101</w:t>
       </w:r>
     </w:p>
     <w:p>
@@ -771,7 +771,7 @@
         <w:rPr>
           <w:color w:val="8A8A8A"/>
         </w:rPr>
-        <w:t xml:space="preserve">109</w:t>
+        <w:t xml:space="preserve">105</w:t>
       </w:r>
     </w:p>
     <w:p>
@@ -792,7 +792,7 @@
         <w:rPr>
           <w:color w:val="8A8A8A"/>
         </w:rPr>
-        <w:t xml:space="preserve">117</w:t>
+        <w:t xml:space="preserve">113</w:t>
       </w:r>
     </w:p>
     <w:p>
@@ -813,7 +813,7 @@
         <w:rPr>
           <w:color w:val="8A8A8A"/>
         </w:rPr>
-        <w:t xml:space="preserve">120</w:t>
+        <w:t xml:space="preserve">116</w:t>
       </w:r>
     </w:p>
     <w:p>
@@ -834,7 +834,7 @@
         <w:rPr>
           <w:color w:val="8A8A8A"/>
         </w:rPr>
-        <w:t xml:space="preserve">122</w:t>
+        <w:t xml:space="preserve">118</w:t>
       </w:r>
     </w:p>
     <w:p>
@@ -855,7 +855,7 @@
         <w:rPr>
           <w:color w:val="8A8A8A"/>
         </w:rPr>
-        <w:t xml:space="preserve">124</w:t>
+        <w:t xml:space="preserve">120</w:t>
       </w:r>
     </w:p>
     <w:p>
@@ -876,7 +876,7 @@
         <w:rPr>
           <w:color w:val="8A8A8A"/>
         </w:rPr>
-        <w:t xml:space="preserve">126</w:t>
+        <w:t xml:space="preserve">122</w:t>
       </w:r>
     </w:p>
     <w:p>
@@ -897,7 +897,7 @@
         <w:rPr>
           <w:color w:val="8A8A8A"/>
         </w:rPr>
-        <w:t xml:space="preserve">129</w:t>
+        <w:t xml:space="preserve">125</w:t>
       </w:r>
     </w:p>
     <w:p>
@@ -918,7 +918,7 @@
         <w:rPr>
           <w:color w:val="8A8A8A"/>
         </w:rPr>
-        <w:t xml:space="preserve">139</w:t>
+        <w:t xml:space="preserve">135</w:t>
       </w:r>
     </w:p>
     <w:p>
@@ -939,7 +939,7 @@
         <w:rPr>
           <w:color w:val="8A8A8A"/>
         </w:rPr>
-        <w:t xml:space="preserve">143</w:t>
+        <w:t xml:space="preserve">139</w:t>
       </w:r>
     </w:p>
     <w:p>
@@ -960,7 +960,7 @@
         <w:rPr>
           <w:color w:val="8A8A8A"/>
         </w:rPr>
-        <w:t xml:space="preserve">149</w:t>
+        <w:t xml:space="preserve">145</w:t>
       </w:r>
     </w:p>
     <w:p>
@@ -981,7 +981,7 @@
         <w:rPr>
           <w:color w:val="8A8A8A"/>
         </w:rPr>
-        <w:t xml:space="preserve">153</w:t>
+        <w:t xml:space="preserve">149</w:t>
       </w:r>
     </w:p>
     <w:p>
@@ -1002,7 +1002,7 @@
         <w:rPr>
           <w:color w:val="8A8A8A"/>
         </w:rPr>
-        <w:t xml:space="preserve">154</w:t>
+        <w:t xml:space="preserve">150</w:t>
       </w:r>
     </w:p>
     <w:p>
@@ -1023,7 +1023,7 @@
         <w:rPr>
           <w:color w:val="8A8A8A"/>
         </w:rPr>
-        <w:t xml:space="preserve">156</w:t>
+        <w:t xml:space="preserve">152</w:t>
       </w:r>
     </w:p>
     <w:p>
@@ -1044,7 +1044,7 @@
         <w:rPr>
           <w:color w:val="8A8A8A"/>
         </w:rPr>
-        <w:t xml:space="preserve">167</w:t>
+        <w:t xml:space="preserve">163</w:t>
       </w:r>
     </w:p>
     <w:p>
@@ -1067,7 +1067,7 @@
       </w:pPr>
       <w:r>
         <w:rPr>
-          <w:rFonts w:ascii="Georgia" w:cs="Georgia" w:eastAsia="Georgia" w:hAnsi="Georgia"/>
+          <w:rFonts w:ascii="Gelasio" w:cs="Gelasio" w:eastAsia="Gelasio" w:hAnsi="Gelasio"/>
           <w:b/>
           <w:bCs/>
           <w:color w:val="2B2B2B"/>
@@ -1185,7 +1185,7 @@
       </w:pPr>
       <w:r>
         <w:rPr>
-          <w:rFonts w:ascii="Georgia" w:cs="Georgia" w:eastAsia="Georgia" w:hAnsi="Georgia"/>
+          <w:rFonts w:ascii="Gelasio" w:cs="Gelasio" w:eastAsia="Gelasio" w:hAnsi="Gelasio"/>
           <w:b/>
           <w:bCs/>
           <w:color w:val="2B2B2B"/>
@@ -1420,7 +1420,7 @@
       </w:pPr>
       <w:r>
         <w:rPr>
-          <w:rFonts w:ascii="Georgia" w:cs="Georgia" w:eastAsia="Georgia" w:hAnsi="Georgia"/>
+          <w:rFonts w:ascii="Gelasio" w:cs="Gelasio" w:eastAsia="Gelasio" w:hAnsi="Gelasio"/>
           <w:b/>
           <w:bCs/>
           <w:color w:val="2B2B2B"/>
@@ -1742,7 +1742,7 @@
       </w:pPr>
       <w:r>
         <w:rPr>
-          <w:rFonts w:ascii="Georgia" w:cs="Georgia" w:eastAsia="Georgia" w:hAnsi="Georgia"/>
+          <w:rFonts w:ascii="Gelasio" w:cs="Gelasio" w:eastAsia="Gelasio" w:hAnsi="Gelasio"/>
           <w:b/>
           <w:bCs/>
           <w:color w:val="8C2F2F"/>
@@ -1753,7 +1753,7 @@
       </w:r>
       <w:r>
         <w:rPr>
-          <w:rFonts w:ascii="Georgia" w:cs="Georgia" w:eastAsia="Georgia" w:hAnsi="Georgia"/>
+          <w:rFonts w:ascii="Gelasio" w:cs="Gelasio" w:eastAsia="Gelasio" w:hAnsi="Gelasio"/>
           <w:b/>
           <w:bCs/>
           <w:color w:val="3D5A6C"/>
@@ -1782,7 +1782,7 @@
       </w:pPr>
       <w:r>
         <w:rPr>
-          <w:rFonts w:ascii="Georgia" w:cs="Georgia" w:eastAsia="Georgia" w:hAnsi="Georgia"/>
+          <w:rFonts w:ascii="Gelasio" w:cs="Gelasio" w:eastAsia="Gelasio" w:hAnsi="Gelasio"/>
           <w:b/>
           <w:bCs/>
           <w:color w:val="2B2B2B"/>
@@ -1846,7 +1846,7 @@
       </w:pPr>
       <w:r>
         <w:rPr>
-          <w:rFonts w:ascii="Georgia" w:cs="Georgia" w:eastAsia="Georgia" w:hAnsi="Georgia"/>
+          <w:rFonts w:ascii="Gelasio" w:cs="Gelasio" w:eastAsia="Gelasio" w:hAnsi="Gelasio"/>
           <w:b/>
           <w:bCs/>
           <w:color w:val="2B2B2B"/>
@@ -1910,7 +1910,7 @@
       </w:pPr>
       <w:r>
         <w:rPr>
-          <w:rFonts w:ascii="Georgia" w:cs="Georgia" w:eastAsia="Georgia" w:hAnsi="Georgia"/>
+          <w:rFonts w:ascii="Gelasio" w:cs="Gelasio" w:eastAsia="Gelasio" w:hAnsi="Gelasio"/>
           <w:b/>
           <w:bCs/>
           <w:color w:val="2B2B2B"/>
@@ -1956,7 +1956,7 @@
       </w:pPr>
       <w:r>
         <w:rPr>
-          <w:rFonts w:ascii="Georgia" w:cs="Georgia" w:eastAsia="Georgia" w:hAnsi="Georgia"/>
+          <w:rFonts w:ascii="Gelasio" w:cs="Gelasio" w:eastAsia="Gelasio" w:hAnsi="Gelasio"/>
           <w:b/>
           <w:bCs/>
           <w:color w:val="2B2B2B"/>
@@ -2010,7 +2010,7 @@
       </w:pPr>
       <w:r>
         <w:rPr>
-          <w:rFonts w:ascii="Georgia" w:cs="Georgia" w:eastAsia="Georgia" w:hAnsi="Georgia"/>
+          <w:rFonts w:ascii="Gelasio" w:cs="Gelasio" w:eastAsia="Gelasio" w:hAnsi="Gelasio"/>
           <w:b/>
           <w:bCs/>
           <w:color w:val="2B2B2B"/>
@@ -2907,7 +2907,7 @@
       </w:pPr>
       <w:r>
         <w:rPr>
-          <w:rFonts w:ascii="Georgia" w:cs="Georgia" w:eastAsia="Georgia" w:hAnsi="Georgia"/>
+          <w:rFonts w:ascii="Gelasio" w:cs="Gelasio" w:eastAsia="Gelasio" w:hAnsi="Gelasio"/>
           <w:b/>
           <w:bCs/>
           <w:color w:val="8C2F2F"/>
@@ -2918,7 +2918,7 @@
       </w:r>
       <w:r>
         <w:rPr>
-          <w:rFonts w:ascii="Georgia" w:cs="Georgia" w:eastAsia="Georgia" w:hAnsi="Georgia"/>
+          <w:rFonts w:ascii="Gelasio" w:cs="Gelasio" w:eastAsia="Gelasio" w:hAnsi="Gelasio"/>
           <w:b/>
           <w:bCs/>
           <w:color w:val="3D5A6C"/>
@@ -2947,7 +2947,7 @@
       </w:pPr>
       <w:r>
         <w:rPr>
-          <w:rFonts w:ascii="Georgia" w:cs="Georgia" w:eastAsia="Georgia" w:hAnsi="Georgia"/>
+          <w:rFonts w:ascii="Gelasio" w:cs="Gelasio" w:eastAsia="Gelasio" w:hAnsi="Gelasio"/>
           <w:b/>
           <w:bCs/>
           <w:color w:val="2B2B2B"/>
@@ -2984,7 +2984,7 @@
       </w:pPr>
       <w:r>
         <w:rPr>
-          <w:rFonts w:ascii="Georgia" w:cs="Georgia" w:eastAsia="Georgia" w:hAnsi="Georgia"/>
+          <w:rFonts w:ascii="Gelasio" w:cs="Gelasio" w:eastAsia="Gelasio" w:hAnsi="Gelasio"/>
           <w:b/>
           <w:bCs/>
           <w:color w:val="2B2B2B"/>
@@ -3030,7 +3030,7 @@
       </w:pPr>
       <w:r>
         <w:rPr>
-          <w:rFonts w:ascii="Georgia" w:cs="Georgia" w:eastAsia="Georgia" w:hAnsi="Georgia"/>
+          <w:rFonts w:ascii="Gelasio" w:cs="Gelasio" w:eastAsia="Gelasio" w:hAnsi="Gelasio"/>
           <w:b/>
           <w:bCs/>
           <w:color w:val="2B2B2B"/>
@@ -3076,7 +3076,7 @@
       </w:pPr>
       <w:r>
         <w:rPr>
-          <w:rFonts w:ascii="Georgia" w:cs="Georgia" w:eastAsia="Georgia" w:hAnsi="Georgia"/>
+          <w:rFonts w:ascii="Gelasio" w:cs="Gelasio" w:eastAsia="Gelasio" w:hAnsi="Gelasio"/>
           <w:b/>
           <w:bCs/>
           <w:color w:val="2B2B2B"/>
@@ -3148,7 +3148,7 @@
       </w:pPr>
       <w:r>
         <w:rPr>
-          <w:rFonts w:ascii="Georgia" w:cs="Georgia" w:eastAsia="Georgia" w:hAnsi="Georgia"/>
+          <w:rFonts w:ascii="Gelasio" w:cs="Gelasio" w:eastAsia="Gelasio" w:hAnsi="Gelasio"/>
           <w:b/>
           <w:bCs/>
           <w:color w:val="2B2B2B"/>
@@ -3211,7 +3211,7 @@
       </w:pPr>
       <w:r>
         <w:rPr>
-          <w:rFonts w:ascii="Georgia" w:cs="Georgia" w:eastAsia="Georgia" w:hAnsi="Georgia"/>
+          <w:rFonts w:ascii="Gelasio" w:cs="Gelasio" w:eastAsia="Gelasio" w:hAnsi="Gelasio"/>
           <w:b/>
           <w:bCs/>
           <w:color w:val="2B2B2B"/>
@@ -3326,7 +3326,7 @@
       </w:pPr>
       <w:r>
         <w:rPr>
-          <w:rFonts w:ascii="Georgia" w:cs="Georgia" w:eastAsia="Georgia" w:hAnsi="Georgia"/>
+          <w:rFonts w:ascii="Gelasio" w:cs="Gelasio" w:eastAsia="Gelasio" w:hAnsi="Gelasio"/>
           <w:b/>
           <w:bCs/>
           <w:color w:val="8C2F2F"/>
@@ -3337,7 +3337,7 @@
       </w:r>
       <w:r>
         <w:rPr>
-          <w:rFonts w:ascii="Georgia" w:cs="Georgia" w:eastAsia="Georgia" w:hAnsi="Georgia"/>
+          <w:rFonts w:ascii="Gelasio" w:cs="Gelasio" w:eastAsia="Gelasio" w:hAnsi="Gelasio"/>
           <w:b/>
           <w:bCs/>
           <w:color w:val="3D5A6C"/>
@@ -3366,7 +3366,7 @@
       </w:pPr>
       <w:r>
         <w:rPr>
-          <w:rFonts w:ascii="Georgia" w:cs="Georgia" w:eastAsia="Georgia" w:hAnsi="Georgia"/>
+          <w:rFonts w:ascii="Gelasio" w:cs="Gelasio" w:eastAsia="Gelasio" w:hAnsi="Gelasio"/>
           <w:b/>
           <w:bCs/>
           <w:color w:val="2B2B2B"/>
@@ -3503,7 +3503,7 @@
       </w:pPr>
       <w:r>
         <w:rPr>
-          <w:rFonts w:ascii="Georgia" w:cs="Georgia" w:eastAsia="Georgia" w:hAnsi="Georgia"/>
+          <w:rFonts w:ascii="Gelasio" w:cs="Gelasio" w:eastAsia="Gelasio" w:hAnsi="Gelasio"/>
           <w:b/>
           <w:bCs/>
           <w:color w:val="2B2B2B"/>
@@ -3549,7 +3549,7 @@
       </w:pPr>
       <w:r>
         <w:rPr>
-          <w:rFonts w:ascii="Georgia" w:cs="Georgia" w:eastAsia="Georgia" w:hAnsi="Georgia"/>
+          <w:rFonts w:ascii="Gelasio" w:cs="Gelasio" w:eastAsia="Gelasio" w:hAnsi="Gelasio"/>
           <w:b/>
           <w:bCs/>
           <w:color w:val="2B2B2B"/>
@@ -3660,7 +3660,7 @@
       </w:pPr>
       <w:r>
         <w:rPr>
-          <w:rFonts w:ascii="Georgia" w:cs="Georgia" w:eastAsia="Georgia" w:hAnsi="Georgia"/>
+          <w:rFonts w:ascii="Gelasio" w:cs="Gelasio" w:eastAsia="Gelasio" w:hAnsi="Gelasio"/>
           <w:b/>
           <w:bCs/>
           <w:color w:val="2B2B2B"/>
@@ -3792,7 +3792,7 @@
       </w:pPr>
       <w:r>
         <w:rPr>
-          <w:rFonts w:ascii="Georgia" w:cs="Georgia" w:eastAsia="Georgia" w:hAnsi="Georgia"/>
+          <w:rFonts w:ascii="Gelasio" w:cs="Gelasio" w:eastAsia="Gelasio" w:hAnsi="Gelasio"/>
           <w:b/>
           <w:bCs/>
           <w:color w:val="8C2F2F"/>
@@ -3803,7 +3803,7 @@
       </w:r>
       <w:r>
         <w:rPr>
-          <w:rFonts w:ascii="Georgia" w:cs="Georgia" w:eastAsia="Georgia" w:hAnsi="Georgia"/>
+          <w:rFonts w:ascii="Gelasio" w:cs="Gelasio" w:eastAsia="Gelasio" w:hAnsi="Gelasio"/>
           <w:b/>
           <w:bCs/>
           <w:color w:val="3D5A6C"/>
@@ -3832,7 +3832,7 @@
       </w:pPr>
       <w:r>
         <w:rPr>
-          <w:rFonts w:ascii="Georgia" w:cs="Georgia" w:eastAsia="Georgia" w:hAnsi="Georgia"/>
+          <w:rFonts w:ascii="Gelasio" w:cs="Gelasio" w:eastAsia="Gelasio" w:hAnsi="Gelasio"/>
           <w:b/>
           <w:bCs/>
           <w:color w:val="2B2B2B"/>
@@ -3869,7 +3869,7 @@
       </w:pPr>
       <w:r>
         <w:rPr>
-          <w:rFonts w:ascii="Georgia" w:cs="Georgia" w:eastAsia="Georgia" w:hAnsi="Georgia"/>
+          <w:rFonts w:ascii="Gelasio" w:cs="Gelasio" w:eastAsia="Gelasio" w:hAnsi="Gelasio"/>
           <w:b/>
           <w:bCs/>
           <w:color w:val="2B2B2B"/>
@@ -4496,7 +4496,7 @@
       </w:pPr>
       <w:r>
         <w:rPr>
-          <w:rFonts w:ascii="Georgia" w:cs="Georgia" w:eastAsia="Georgia" w:hAnsi="Georgia"/>
+          <w:rFonts w:ascii="Gelasio" w:cs="Gelasio" w:eastAsia="Gelasio" w:hAnsi="Gelasio"/>
           <w:b/>
           <w:bCs/>
           <w:color w:val="2B2B2B"/>
@@ -4781,7 +4781,7 @@
       </w:pPr>
       <w:r>
         <w:rPr>
-          <w:rFonts w:ascii="Georgia" w:cs="Georgia" w:eastAsia="Georgia" w:hAnsi="Georgia"/>
+          <w:rFonts w:ascii="Gelasio" w:cs="Gelasio" w:eastAsia="Gelasio" w:hAnsi="Gelasio"/>
           <w:b/>
           <w:bCs/>
           <w:color w:val="2B2B2B"/>
@@ -4844,7 +4844,7 @@
       </w:pPr>
       <w:r>
         <w:rPr>
-          <w:rFonts w:ascii="Georgia" w:cs="Georgia" w:eastAsia="Georgia" w:hAnsi="Georgia"/>
+          <w:rFonts w:ascii="Gelasio" w:cs="Gelasio" w:eastAsia="Gelasio" w:hAnsi="Gelasio"/>
           <w:b/>
           <w:bCs/>
           <w:color w:val="2B2B2B"/>
@@ -4959,7 +4959,7 @@
       </w:pPr>
       <w:r>
         <w:rPr>
-          <w:rFonts w:ascii="Georgia" w:cs="Georgia" w:eastAsia="Georgia" w:hAnsi="Georgia"/>
+          <w:rFonts w:ascii="Gelasio" w:cs="Gelasio" w:eastAsia="Gelasio" w:hAnsi="Gelasio"/>
           <w:b/>
           <w:bCs/>
           <w:color w:val="8C2F2F"/>
@@ -4970,7 +4970,7 @@
       </w:r>
       <w:r>
         <w:rPr>
-          <w:rFonts w:ascii="Georgia" w:cs="Georgia" w:eastAsia="Georgia" w:hAnsi="Georgia"/>
+          <w:rFonts w:ascii="Gelasio" w:cs="Gelasio" w:eastAsia="Gelasio" w:hAnsi="Gelasio"/>
           <w:b/>
           <w:bCs/>
           <w:color w:val="3D5A6C"/>
@@ -5099,7 +5099,7 @@
       </w:pPr>
       <w:r>
         <w:rPr>
-          <w:rFonts w:ascii="Georgia" w:cs="Georgia" w:eastAsia="Georgia" w:hAnsi="Georgia"/>
+          <w:rFonts w:ascii="Gelasio" w:cs="Gelasio" w:eastAsia="Gelasio" w:hAnsi="Gelasio"/>
           <w:b/>
           <w:bCs/>
           <w:color w:val="8C2F2F"/>
@@ -5110,7 +5110,7 @@
       </w:r>
       <w:r>
         <w:rPr>
-          <w:rFonts w:ascii="Georgia" w:cs="Georgia" w:eastAsia="Georgia" w:hAnsi="Georgia"/>
+          <w:rFonts w:ascii="Gelasio" w:cs="Gelasio" w:eastAsia="Gelasio" w:hAnsi="Gelasio"/>
           <w:b/>
           <w:bCs/>
           <w:color w:val="3D5A6C"/>
@@ -5139,7 +5139,7 @@
       </w:pPr>
       <w:r>
         <w:rPr>
-          <w:rFonts w:ascii="Georgia" w:cs="Georgia" w:eastAsia="Georgia" w:hAnsi="Georgia"/>
+          <w:rFonts w:ascii="Gelasio" w:cs="Gelasio" w:eastAsia="Gelasio" w:hAnsi="Gelasio"/>
           <w:b/>
           <w:bCs/>
           <w:color w:val="2B2B2B"/>
@@ -5267,7 +5267,7 @@
       </w:pPr>
       <w:r>
         <w:rPr>
-          <w:rFonts w:ascii="Georgia" w:cs="Georgia" w:eastAsia="Georgia" w:hAnsi="Georgia"/>
+          <w:rFonts w:ascii="Gelasio" w:cs="Gelasio" w:eastAsia="Gelasio" w:hAnsi="Gelasio"/>
           <w:b/>
           <w:bCs/>
           <w:color w:val="2B2B2B"/>
@@ -5432,7 +5432,7 @@
       </w:pPr>
       <w:r>
         <w:rPr>
-          <w:rFonts w:ascii="Georgia" w:cs="Georgia" w:eastAsia="Georgia" w:hAnsi="Georgia"/>
+          <w:rFonts w:ascii="Gelasio" w:cs="Gelasio" w:eastAsia="Gelasio" w:hAnsi="Gelasio"/>
           <w:b/>
           <w:bCs/>
           <w:color w:val="2B2B2B"/>
@@ -5469,7 +5469,7 @@
       </w:pPr>
       <w:r>
         <w:rPr>
-          <w:rFonts w:ascii="Georgia" w:cs="Georgia" w:eastAsia="Georgia" w:hAnsi="Georgia"/>
+          <w:rFonts w:ascii="Gelasio" w:cs="Gelasio" w:eastAsia="Gelasio" w:hAnsi="Gelasio"/>
           <w:b/>
           <w:bCs/>
           <w:color w:val="2B2B2B"/>
@@ -5506,7 +5506,7 @@
       </w:pPr>
       <w:r>
         <w:rPr>
-          <w:rFonts w:ascii="Georgia" w:cs="Georgia" w:eastAsia="Georgia" w:hAnsi="Georgia"/>
+          <w:rFonts w:ascii="Gelasio" w:cs="Gelasio" w:eastAsia="Gelasio" w:hAnsi="Gelasio"/>
           <w:b/>
           <w:bCs/>
           <w:color w:val="2B2B2B"/>
@@ -5629,7 +5629,7 @@
       </w:pPr>
       <w:r>
         <w:rPr>
-          <w:rFonts w:ascii="Georgia" w:cs="Georgia" w:eastAsia="Georgia" w:hAnsi="Georgia"/>
+          <w:rFonts w:ascii="Gelasio" w:cs="Gelasio" w:eastAsia="Gelasio" w:hAnsi="Gelasio"/>
           <w:b/>
           <w:bCs/>
           <w:color w:val="8C2F2F"/>
@@ -5640,7 +5640,7 @@
       </w:r>
       <w:r>
         <w:rPr>
-          <w:rFonts w:ascii="Georgia" w:cs="Georgia" w:eastAsia="Georgia" w:hAnsi="Georgia"/>
+          <w:rFonts w:ascii="Gelasio" w:cs="Gelasio" w:eastAsia="Gelasio" w:hAnsi="Gelasio"/>
           <w:b/>
           <w:bCs/>
           <w:color w:val="3D5A6C"/>
@@ -5669,7 +5669,7 @@
       </w:pPr>
       <w:r>
         <w:rPr>
-          <w:rFonts w:ascii="Georgia" w:cs="Georgia" w:eastAsia="Georgia" w:hAnsi="Georgia"/>
+          <w:rFonts w:ascii="Gelasio" w:cs="Gelasio" w:eastAsia="Gelasio" w:hAnsi="Gelasio"/>
           <w:b/>
           <w:bCs/>
           <w:color w:val="2B2B2B"/>
@@ -5715,7 +5715,7 @@
       </w:pPr>
       <w:r>
         <w:rPr>
-          <w:rFonts w:ascii="Georgia" w:cs="Georgia" w:eastAsia="Georgia" w:hAnsi="Georgia"/>
+          <w:rFonts w:ascii="Gelasio" w:cs="Gelasio" w:eastAsia="Gelasio" w:hAnsi="Gelasio"/>
           <w:b/>
           <w:bCs/>
           <w:color w:val="2B2B2B"/>
@@ -5761,7 +5761,7 @@
       </w:pPr>
       <w:r>
         <w:rPr>
-          <w:rFonts w:ascii="Georgia" w:cs="Georgia" w:eastAsia="Georgia" w:hAnsi="Georgia"/>
+          <w:rFonts w:ascii="Gelasio" w:cs="Gelasio" w:eastAsia="Gelasio" w:hAnsi="Gelasio"/>
           <w:b/>
           <w:bCs/>
           <w:color w:val="2B2B2B"/>
@@ -5816,7 +5816,7 @@
       </w:pPr>
       <w:r>
         <w:rPr>
-          <w:rFonts w:ascii="Georgia" w:cs="Georgia" w:eastAsia="Georgia" w:hAnsi="Georgia"/>
+          <w:rFonts w:ascii="Gelasio" w:cs="Gelasio" w:eastAsia="Gelasio" w:hAnsi="Gelasio"/>
           <w:b/>
           <w:bCs/>
           <w:color w:val="2B2B2B"/>
@@ -5862,7 +5862,7 @@
       </w:pPr>
       <w:r>
         <w:rPr>
-          <w:rFonts w:ascii="Georgia" w:cs="Georgia" w:eastAsia="Georgia" w:hAnsi="Georgia"/>
+          <w:rFonts w:ascii="Gelasio" w:cs="Gelasio" w:eastAsia="Gelasio" w:hAnsi="Gelasio"/>
           <w:b/>
           <w:bCs/>
           <w:color w:val="2B2B2B"/>
@@ -5995,7 +5995,7 @@
       </w:pPr>
       <w:r>
         <w:rPr>
-          <w:rFonts w:ascii="Georgia" w:cs="Georgia" w:eastAsia="Georgia" w:hAnsi="Georgia"/>
+          <w:rFonts w:ascii="Gelasio" w:cs="Gelasio" w:eastAsia="Gelasio" w:hAnsi="Gelasio"/>
           <w:b/>
           <w:bCs/>
           <w:color w:val="8C2F2F"/>
@@ -6006,7 +6006,7 @@
       </w:r>
       <w:r>
         <w:rPr>
-          <w:rFonts w:ascii="Georgia" w:cs="Georgia" w:eastAsia="Georgia" w:hAnsi="Georgia"/>
+          <w:rFonts w:ascii="Gelasio" w:cs="Gelasio" w:eastAsia="Gelasio" w:hAnsi="Gelasio"/>
           <w:b/>
           <w:bCs/>
           <w:color w:val="3D5A6C"/>
@@ -6035,7 +6035,7 @@
       </w:pPr>
       <w:r>
         <w:rPr>
-          <w:rFonts w:ascii="Georgia" w:cs="Georgia" w:eastAsia="Georgia" w:hAnsi="Georgia"/>
+          <w:rFonts w:ascii="Gelasio" w:cs="Gelasio" w:eastAsia="Gelasio" w:hAnsi="Gelasio"/>
           <w:b/>
           <w:bCs/>
           <w:color w:val="2B2B2B"/>
@@ -6190,7 +6190,7 @@
       </w:pPr>
       <w:r>
         <w:rPr>
-          <w:rFonts w:ascii="Georgia" w:cs="Georgia" w:eastAsia="Georgia" w:hAnsi="Georgia"/>
+          <w:rFonts w:ascii="Gelasio" w:cs="Gelasio" w:eastAsia="Gelasio" w:hAnsi="Gelasio"/>
           <w:b/>
           <w:bCs/>
           <w:color w:val="2B2B2B"/>
@@ -6245,7 +6245,7 @@
       </w:pPr>
       <w:r>
         <w:rPr>
-          <w:rFonts w:ascii="Georgia" w:cs="Georgia" w:eastAsia="Georgia" w:hAnsi="Georgia"/>
+          <w:rFonts w:ascii="Gelasio" w:cs="Gelasio" w:eastAsia="Gelasio" w:hAnsi="Gelasio"/>
           <w:b/>
           <w:bCs/>
           <w:color w:val="2B2B2B"/>
@@ -6433,7 +6433,7 @@
       </w:pPr>
       <w:r>
         <w:rPr>
-          <w:rFonts w:ascii="Georgia" w:cs="Georgia" w:eastAsia="Georgia" w:hAnsi="Georgia"/>
+          <w:rFonts w:ascii="Gelasio" w:cs="Gelasio" w:eastAsia="Gelasio" w:hAnsi="Gelasio"/>
           <w:b/>
           <w:bCs/>
           <w:color w:val="8C2F2F"/>
@@ -6444,7 +6444,7 @@
       </w:r>
       <w:r>
         <w:rPr>
-          <w:rFonts w:ascii="Georgia" w:cs="Georgia" w:eastAsia="Georgia" w:hAnsi="Georgia"/>
+          <w:rFonts w:ascii="Gelasio" w:cs="Gelasio" w:eastAsia="Gelasio" w:hAnsi="Gelasio"/>
           <w:b/>
           <w:bCs/>
           <w:color w:val="3D5A6C"/>
@@ -6473,7 +6473,7 @@
       </w:pPr>
       <w:r>
         <w:rPr>
-          <w:rFonts w:ascii="Georgia" w:cs="Georgia" w:eastAsia="Georgia" w:hAnsi="Georgia"/>
+          <w:rFonts w:ascii="Gelasio" w:cs="Gelasio" w:eastAsia="Gelasio" w:hAnsi="Gelasio"/>
           <w:b/>
           <w:bCs/>
           <w:color w:val="2B2B2B"/>
@@ -6528,7 +6528,7 @@
       </w:pPr>
       <w:r>
         <w:rPr>
-          <w:rFonts w:ascii="Georgia" w:cs="Georgia" w:eastAsia="Georgia" w:hAnsi="Georgia"/>
+          <w:rFonts w:ascii="Gelasio" w:cs="Gelasio" w:eastAsia="Gelasio" w:hAnsi="Gelasio"/>
           <w:b/>
           <w:bCs/>
           <w:color w:val="2B2B2B"/>
@@ -6565,7 +6565,7 @@
       </w:pPr>
       <w:r>
         <w:rPr>
-          <w:rFonts w:ascii="Georgia" w:cs="Georgia" w:eastAsia="Georgia" w:hAnsi="Georgia"/>
+          <w:rFonts w:ascii="Gelasio" w:cs="Gelasio" w:eastAsia="Gelasio" w:hAnsi="Gelasio"/>
           <w:b/>
           <w:bCs/>
           <w:color w:val="2B2B2B"/>
@@ -6629,7 +6629,7 @@
       </w:pPr>
       <w:r>
         <w:rPr>
-          <w:rFonts w:ascii="Georgia" w:cs="Georgia" w:eastAsia="Georgia" w:hAnsi="Georgia"/>
+          <w:rFonts w:ascii="Gelasio" w:cs="Gelasio" w:eastAsia="Gelasio" w:hAnsi="Gelasio"/>
           <w:b/>
           <w:bCs/>
           <w:color w:val="2B2B2B"/>
@@ -6740,7 +6740,7 @@
       </w:pPr>
       <w:r>
         <w:rPr>
-          <w:rFonts w:ascii="Georgia" w:cs="Georgia" w:eastAsia="Georgia" w:hAnsi="Georgia"/>
+          <w:rFonts w:ascii="Gelasio" w:cs="Gelasio" w:eastAsia="Gelasio" w:hAnsi="Gelasio"/>
           <w:b/>
           <w:bCs/>
           <w:color w:val="2B2B2B"/>
@@ -6816,7 +6816,7 @@
       </w:pPr>
       <w:r>
         <w:rPr>
-          <w:rFonts w:ascii="Georgia" w:cs="Georgia" w:eastAsia="Georgia" w:hAnsi="Georgia"/>
+          <w:rFonts w:ascii="Gelasio" w:cs="Gelasio" w:eastAsia="Gelasio" w:hAnsi="Gelasio"/>
           <w:b/>
           <w:bCs/>
           <w:color w:val="2B2B2B"/>
@@ -6853,7 +6853,7 @@
       </w:pPr>
       <w:r>
         <w:rPr>
-          <w:rFonts w:ascii="Georgia" w:cs="Georgia" w:eastAsia="Georgia" w:hAnsi="Georgia"/>
+          <w:rFonts w:ascii="Gelasio" w:cs="Gelasio" w:eastAsia="Gelasio" w:hAnsi="Gelasio"/>
           <w:b/>
           <w:bCs/>
           <w:color w:val="2B2B2B"/>
@@ -6976,7 +6976,7 @@
       </w:pPr>
       <w:r>
         <w:rPr>
-          <w:rFonts w:ascii="Georgia" w:cs="Georgia" w:eastAsia="Georgia" w:hAnsi="Georgia"/>
+          <w:rFonts w:ascii="Gelasio" w:cs="Gelasio" w:eastAsia="Gelasio" w:hAnsi="Gelasio"/>
           <w:b/>
           <w:bCs/>
           <w:color w:val="8C2F2F"/>
@@ -6987,7 +6987,7 @@
       </w:r>
       <w:r>
         <w:rPr>
-          <w:rFonts w:ascii="Georgia" w:cs="Georgia" w:eastAsia="Georgia" w:hAnsi="Georgia"/>
+          <w:rFonts w:ascii="Gelasio" w:cs="Gelasio" w:eastAsia="Gelasio" w:hAnsi="Gelasio"/>
           <w:b/>
           <w:bCs/>
           <w:color w:val="3D5A6C"/>
@@ -7097,7 +7097,7 @@
       </w:pPr>
       <w:r>
         <w:rPr>
-          <w:rFonts w:ascii="Georgia" w:cs="Georgia" w:eastAsia="Georgia" w:hAnsi="Georgia"/>
+          <w:rFonts w:ascii="Gelasio" w:cs="Gelasio" w:eastAsia="Gelasio" w:hAnsi="Gelasio"/>
           <w:b/>
           <w:bCs/>
           <w:color w:val="8C2F2F"/>
@@ -7108,7 +7108,7 @@
       </w:r>
       <w:r>
         <w:rPr>
-          <w:rFonts w:ascii="Georgia" w:cs="Georgia" w:eastAsia="Georgia" w:hAnsi="Georgia"/>
+          <w:rFonts w:ascii="Gelasio" w:cs="Gelasio" w:eastAsia="Gelasio" w:hAnsi="Gelasio"/>
           <w:b/>
           <w:bCs/>
           <w:color w:val="3D5A6C"/>
@@ -7137,7 +7137,7 @@
       </w:pPr>
       <w:r>
         <w:rPr>
-          <w:rFonts w:ascii="Georgia" w:cs="Georgia" w:eastAsia="Georgia" w:hAnsi="Georgia"/>
+          <w:rFonts w:ascii="Gelasio" w:cs="Gelasio" w:eastAsia="Gelasio" w:hAnsi="Gelasio"/>
           <w:b/>
           <w:bCs/>
           <w:color w:val="2B2B2B"/>
@@ -7174,7 +7174,7 @@
       </w:pPr>
       <w:r>
         <w:rPr>
-          <w:rFonts w:ascii="Georgia" w:cs="Georgia" w:eastAsia="Georgia" w:hAnsi="Georgia"/>
+          <w:rFonts w:ascii="Gelasio" w:cs="Gelasio" w:eastAsia="Gelasio" w:hAnsi="Gelasio"/>
           <w:b/>
           <w:bCs/>
           <w:color w:val="2B2B2B"/>
@@ -7229,7 +7229,7 @@
       </w:pPr>
       <w:r>
         <w:rPr>
-          <w:rFonts w:ascii="Georgia" w:cs="Georgia" w:eastAsia="Georgia" w:hAnsi="Georgia"/>
+          <w:rFonts w:ascii="Gelasio" w:cs="Gelasio" w:eastAsia="Gelasio" w:hAnsi="Gelasio"/>
           <w:b/>
           <w:bCs/>
           <w:color w:val="2B2B2B"/>
@@ -7357,7 +7357,7 @@
       </w:pPr>
       <w:r>
         <w:rPr>
-          <w:rFonts w:ascii="Georgia" w:cs="Georgia" w:eastAsia="Georgia" w:hAnsi="Georgia"/>
+          <w:rFonts w:ascii="Gelasio" w:cs="Gelasio" w:eastAsia="Gelasio" w:hAnsi="Gelasio"/>
           <w:b/>
           <w:bCs/>
           <w:color w:val="2B2B2B"/>
@@ -7480,7 +7480,7 @@
       </w:pPr>
       <w:r>
         <w:rPr>
-          <w:rFonts w:ascii="Georgia" w:cs="Georgia" w:eastAsia="Georgia" w:hAnsi="Georgia"/>
+          <w:rFonts w:ascii="Gelasio" w:cs="Gelasio" w:eastAsia="Gelasio" w:hAnsi="Gelasio"/>
           <w:b/>
           <w:bCs/>
           <w:color w:val="8C2F2F"/>
@@ -7491,7 +7491,7 @@
       </w:r>
       <w:r>
         <w:rPr>
-          <w:rFonts w:ascii="Georgia" w:cs="Georgia" w:eastAsia="Georgia" w:hAnsi="Georgia"/>
+          <w:rFonts w:ascii="Gelasio" w:cs="Gelasio" w:eastAsia="Gelasio" w:hAnsi="Gelasio"/>
           <w:b/>
           <w:bCs/>
           <w:color w:val="3D5A6C"/>
@@ -7520,7 +7520,7 @@
       </w:pPr>
       <w:r>
         <w:rPr>
-          <w:rFonts w:ascii="Georgia" w:cs="Georgia" w:eastAsia="Georgia" w:hAnsi="Georgia"/>
+          <w:rFonts w:ascii="Gelasio" w:cs="Gelasio" w:eastAsia="Gelasio" w:hAnsi="Gelasio"/>
           <w:b/>
           <w:bCs/>
           <w:color w:val="2B2B2B"/>
@@ -7648,7 +7648,7 @@
       </w:pPr>
       <w:r>
         <w:rPr>
-          <w:rFonts w:ascii="Georgia" w:cs="Georgia" w:eastAsia="Georgia" w:hAnsi="Georgia"/>
+          <w:rFonts w:ascii="Gelasio" w:cs="Gelasio" w:eastAsia="Gelasio" w:hAnsi="Gelasio"/>
           <w:b/>
           <w:bCs/>
           <w:color w:val="2B2B2B"/>
@@ -7886,7 +7886,7 @@
       </w:pPr>
       <w:r>
         <w:rPr>
-          <w:rFonts w:ascii="Georgia" w:cs="Georgia" w:eastAsia="Georgia" w:hAnsi="Georgia"/>
+          <w:rFonts w:ascii="Gelasio" w:cs="Gelasio" w:eastAsia="Gelasio" w:hAnsi="Gelasio"/>
           <w:b/>
           <w:bCs/>
           <w:color w:val="2B2B2B"/>
@@ -7942,7 +7942,7 @@
       </w:pPr>
       <w:r>
         <w:rPr>
-          <w:rFonts w:ascii="Georgia" w:cs="Georgia" w:eastAsia="Georgia" w:hAnsi="Georgia"/>
+          <w:rFonts w:ascii="Gelasio" w:cs="Gelasio" w:eastAsia="Gelasio" w:hAnsi="Gelasio"/>
           <w:b/>
           <w:bCs/>
           <w:color w:val="2B2B2B"/>
@@ -7988,7 +7988,7 @@
       </w:pPr>
       <w:r>
         <w:rPr>
-          <w:rFonts w:ascii="Georgia" w:cs="Georgia" w:eastAsia="Georgia" w:hAnsi="Georgia"/>
+          <w:rFonts w:ascii="Gelasio" w:cs="Gelasio" w:eastAsia="Gelasio" w:hAnsi="Gelasio"/>
           <w:b/>
           <w:bCs/>
           <w:color w:val="2B2B2B"/>
@@ -8111,7 +8111,7 @@
       </w:pPr>
       <w:r>
         <w:rPr>
-          <w:rFonts w:ascii="Georgia" w:cs="Georgia" w:eastAsia="Georgia" w:hAnsi="Georgia"/>
+          <w:rFonts w:ascii="Gelasio" w:cs="Gelasio" w:eastAsia="Gelasio" w:hAnsi="Gelasio"/>
           <w:b/>
           <w:bCs/>
           <w:color w:val="8C2F2F"/>
@@ -8122,7 +8122,7 @@
       </w:r>
       <w:r>
         <w:rPr>
-          <w:rFonts w:ascii="Georgia" w:cs="Georgia" w:eastAsia="Georgia" w:hAnsi="Georgia"/>
+          <w:rFonts w:ascii="Gelasio" w:cs="Gelasio" w:eastAsia="Gelasio" w:hAnsi="Gelasio"/>
           <w:b/>
           <w:bCs/>
           <w:color w:val="3D5A6C"/>
@@ -8151,7 +8151,7 @@
       </w:pPr>
       <w:r>
         <w:rPr>
-          <w:rFonts w:ascii="Georgia" w:cs="Georgia" w:eastAsia="Georgia" w:hAnsi="Georgia"/>
+          <w:rFonts w:ascii="Gelasio" w:cs="Gelasio" w:eastAsia="Gelasio" w:hAnsi="Gelasio"/>
           <w:b/>
           <w:bCs/>
           <w:color w:val="2B2B2B"/>
@@ -8188,7 +8188,7 @@
       </w:pPr>
       <w:r>
         <w:rPr>
-          <w:rFonts w:ascii="Georgia" w:cs="Georgia" w:eastAsia="Georgia" w:hAnsi="Georgia"/>
+          <w:rFonts w:ascii="Gelasio" w:cs="Gelasio" w:eastAsia="Gelasio" w:hAnsi="Gelasio"/>
           <w:b/>
           <w:bCs/>
           <w:color w:val="2B2B2B"/>
@@ -8243,7 +8243,7 @@
       </w:pPr>
       <w:r>
         <w:rPr>
-          <w:rFonts w:ascii="Georgia" w:cs="Georgia" w:eastAsia="Georgia" w:hAnsi="Georgia"/>
+          <w:rFonts w:ascii="Gelasio" w:cs="Gelasio" w:eastAsia="Gelasio" w:hAnsi="Gelasio"/>
           <w:b/>
           <w:bCs/>
           <w:color w:val="2B2B2B"/>
@@ -8289,7 +8289,7 @@
       </w:pPr>
       <w:r>
         <w:rPr>
-          <w:rFonts w:ascii="Georgia" w:cs="Georgia" w:eastAsia="Georgia" w:hAnsi="Georgia"/>
+          <w:rFonts w:ascii="Gelasio" w:cs="Gelasio" w:eastAsia="Gelasio" w:hAnsi="Gelasio"/>
           <w:b/>
           <w:bCs/>
           <w:color w:val="2B2B2B"/>
@@ -8326,7 +8326,7 @@
       </w:pPr>
       <w:r>
         <w:rPr>
-          <w:rFonts w:ascii="Georgia" w:cs="Georgia" w:eastAsia="Georgia" w:hAnsi="Georgia"/>
+          <w:rFonts w:ascii="Gelasio" w:cs="Gelasio" w:eastAsia="Gelasio" w:hAnsi="Gelasio"/>
           <w:b/>
           <w:bCs/>
           <w:color w:val="2B2B2B"/>
@@ -8449,7 +8449,7 @@
       </w:pPr>
       <w:r>
         <w:rPr>
-          <w:rFonts w:ascii="Georgia" w:cs="Georgia" w:eastAsia="Georgia" w:hAnsi="Georgia"/>
+          <w:rFonts w:ascii="Gelasio" w:cs="Gelasio" w:eastAsia="Gelasio" w:hAnsi="Gelasio"/>
           <w:b/>
           <w:bCs/>
           <w:color w:val="8C2F2F"/>
@@ -8460,7 +8460,7 @@
       </w:r>
       <w:r>
         <w:rPr>
-          <w:rFonts w:ascii="Georgia" w:cs="Georgia" w:eastAsia="Georgia" w:hAnsi="Georgia"/>
+          <w:rFonts w:ascii="Gelasio" w:cs="Gelasio" w:eastAsia="Gelasio" w:hAnsi="Gelasio"/>
           <w:b/>
           <w:bCs/>
           <w:color w:val="3D5A6C"/>
@@ -8489,7 +8489,7 @@
       </w:pPr>
       <w:r>
         <w:rPr>
-          <w:rFonts w:ascii="Georgia" w:cs="Georgia" w:eastAsia="Georgia" w:hAnsi="Georgia"/>
+          <w:rFonts w:ascii="Gelasio" w:cs="Gelasio" w:eastAsia="Gelasio" w:hAnsi="Gelasio"/>
           <w:b/>
           <w:bCs/>
           <w:color w:val="2B2B2B"/>
@@ -8553,7 +8553,7 @@
       </w:pPr>
       <w:r>
         <w:rPr>
-          <w:rFonts w:ascii="Georgia" w:cs="Georgia" w:eastAsia="Georgia" w:hAnsi="Georgia"/>
+          <w:rFonts w:ascii="Gelasio" w:cs="Gelasio" w:eastAsia="Gelasio" w:hAnsi="Gelasio"/>
           <w:b/>
           <w:bCs/>
           <w:color w:val="2B2B2B"/>
@@ -8681,7 +8681,7 @@
       </w:pPr>
       <w:r>
         <w:rPr>
-          <w:rFonts w:ascii="Georgia" w:cs="Georgia" w:eastAsia="Georgia" w:hAnsi="Georgia"/>
+          <w:rFonts w:ascii="Gelasio" w:cs="Gelasio" w:eastAsia="Gelasio" w:hAnsi="Gelasio"/>
           <w:b/>
           <w:bCs/>
           <w:color w:val="2B2B2B"/>
@@ -8898,7 +8898,7 @@
       </w:pPr>
       <w:r>
         <w:rPr>
-          <w:rFonts w:ascii="Georgia" w:cs="Georgia" w:eastAsia="Georgia" w:hAnsi="Georgia"/>
+          <w:rFonts w:ascii="Gelasio" w:cs="Gelasio" w:eastAsia="Gelasio" w:hAnsi="Gelasio"/>
           <w:b/>
           <w:bCs/>
           <w:color w:val="2B2B2B"/>
@@ -8935,7 +8935,7 @@
       </w:pPr>
       <w:r>
         <w:rPr>
-          <w:rFonts w:ascii="Georgia" w:cs="Georgia" w:eastAsia="Georgia" w:hAnsi="Georgia"/>
+          <w:rFonts w:ascii="Gelasio" w:cs="Gelasio" w:eastAsia="Gelasio" w:hAnsi="Gelasio"/>
           <w:b/>
           <w:bCs/>
           <w:color w:val="2B2B2B"/>
@@ -8989,7 +8989,7 @@
       </w:pPr>
       <w:r>
         <w:rPr>
-          <w:rFonts w:ascii="Georgia" w:cs="Georgia" w:eastAsia="Georgia" w:hAnsi="Georgia"/>
+          <w:rFonts w:ascii="Gelasio" w:cs="Gelasio" w:eastAsia="Gelasio" w:hAnsi="Gelasio"/>
           <w:b/>
           <w:bCs/>
           <w:color w:val="2B2B2B"/>
@@ -9103,7 +9103,7 @@
       </w:pPr>
       <w:r>
         <w:rPr>
-          <w:rFonts w:ascii="Georgia" w:cs="Georgia" w:eastAsia="Georgia" w:hAnsi="Georgia"/>
+          <w:rFonts w:ascii="Gelasio" w:cs="Gelasio" w:eastAsia="Gelasio" w:hAnsi="Gelasio"/>
           <w:b/>
           <w:bCs/>
           <w:color w:val="8C2F2F"/>
@@ -9114,7 +9114,7 @@
       </w:r>
       <w:r>
         <w:rPr>
-          <w:rFonts w:ascii="Georgia" w:cs="Georgia" w:eastAsia="Georgia" w:hAnsi="Georgia"/>
+          <w:rFonts w:ascii="Gelasio" w:cs="Gelasio" w:eastAsia="Gelasio" w:hAnsi="Gelasio"/>
           <w:b/>
           <w:bCs/>
           <w:color w:val="3D5A6C"/>
@@ -9143,7 +9143,7 @@
       </w:pPr>
       <w:r>
         <w:rPr>
-          <w:rFonts w:ascii="Georgia" w:cs="Georgia" w:eastAsia="Georgia" w:hAnsi="Georgia"/>
+          <w:rFonts w:ascii="Gelasio" w:cs="Gelasio" w:eastAsia="Gelasio" w:hAnsi="Gelasio"/>
           <w:b/>
           <w:bCs/>
           <w:color w:val="2B2B2B"/>
@@ -9189,7 +9189,7 @@
       </w:pPr>
       <w:r>
         <w:rPr>
-          <w:rFonts w:ascii="Georgia" w:cs="Georgia" w:eastAsia="Georgia" w:hAnsi="Georgia"/>
+          <w:rFonts w:ascii="Gelasio" w:cs="Gelasio" w:eastAsia="Gelasio" w:hAnsi="Gelasio"/>
           <w:b/>
           <w:bCs/>
           <w:color w:val="2B2B2B"/>
@@ -9235,7 +9235,7 @@
       </w:pPr>
       <w:r>
         <w:rPr>
-          <w:rFonts w:ascii="Georgia" w:cs="Georgia" w:eastAsia="Georgia" w:hAnsi="Georgia"/>
+          <w:rFonts w:ascii="Gelasio" w:cs="Gelasio" w:eastAsia="Gelasio" w:hAnsi="Gelasio"/>
           <w:b/>
           <w:bCs/>
           <w:color w:val="2B2B2B"/>
@@ -9299,7 +9299,7 @@
       </w:pPr>
       <w:r>
         <w:rPr>
-          <w:rFonts w:ascii="Georgia" w:cs="Georgia" w:eastAsia="Georgia" w:hAnsi="Georgia"/>
+          <w:rFonts w:ascii="Gelasio" w:cs="Gelasio" w:eastAsia="Gelasio" w:hAnsi="Gelasio"/>
           <w:b/>
           <w:bCs/>
           <w:color w:val="2B2B2B"/>
@@ -9443,7 +9443,7 @@
       </w:pPr>
       <w:r>
         <w:rPr>
-          <w:rFonts w:ascii="Georgia" w:cs="Georgia" w:eastAsia="Georgia" w:hAnsi="Georgia"/>
+          <w:rFonts w:ascii="Gelasio" w:cs="Gelasio" w:eastAsia="Gelasio" w:hAnsi="Gelasio"/>
           <w:b/>
           <w:bCs/>
           <w:color w:val="2B2B2B"/>
@@ -9489,7 +9489,7 @@
       </w:pPr>
       <w:r>
         <w:rPr>
-          <w:rFonts w:ascii="Georgia" w:cs="Georgia" w:eastAsia="Georgia" w:hAnsi="Georgia"/>
+          <w:rFonts w:ascii="Gelasio" w:cs="Gelasio" w:eastAsia="Gelasio" w:hAnsi="Gelasio"/>
           <w:b/>
           <w:bCs/>
           <w:color w:val="2B2B2B"/>
@@ -9603,7 +9603,7 @@
       </w:pPr>
       <w:r>
         <w:rPr>
-          <w:rFonts w:ascii="Georgia" w:cs="Georgia" w:eastAsia="Georgia" w:hAnsi="Georgia"/>
+          <w:rFonts w:ascii="Gelasio" w:cs="Gelasio" w:eastAsia="Gelasio" w:hAnsi="Gelasio"/>
           <w:b/>
           <w:bCs/>
           <w:color w:val="8C2F2F"/>
@@ -9614,7 +9614,7 @@
       </w:r>
       <w:r>
         <w:rPr>
-          <w:rFonts w:ascii="Georgia" w:cs="Georgia" w:eastAsia="Georgia" w:hAnsi="Georgia"/>
+          <w:rFonts w:ascii="Gelasio" w:cs="Gelasio" w:eastAsia="Gelasio" w:hAnsi="Gelasio"/>
           <w:b/>
           <w:bCs/>
           <w:color w:val="3D5A6C"/>
@@ -9741,7 +9741,7 @@
       </w:pPr>
       <w:r>
         <w:rPr>
-          <w:rFonts w:ascii="Georgia" w:cs="Georgia" w:eastAsia="Georgia" w:hAnsi="Georgia"/>
+          <w:rFonts w:ascii="Gelasio" w:cs="Gelasio" w:eastAsia="Gelasio" w:hAnsi="Gelasio"/>
           <w:b/>
           <w:bCs/>
           <w:color w:val="8C2F2F"/>
@@ -9752,7 +9752,7 @@
       </w:r>
       <w:r>
         <w:rPr>
-          <w:rFonts w:ascii="Georgia" w:cs="Georgia" w:eastAsia="Georgia" w:hAnsi="Georgia"/>
+          <w:rFonts w:ascii="Gelasio" w:cs="Gelasio" w:eastAsia="Gelasio" w:hAnsi="Gelasio"/>
           <w:b/>
           <w:bCs/>
           <w:color w:val="3D5A6C"/>
@@ -9781,7 +9781,7 @@
       </w:pPr>
       <w:r>
         <w:rPr>
-          <w:rFonts w:ascii="Georgia" w:cs="Georgia" w:eastAsia="Georgia" w:hAnsi="Georgia"/>
+          <w:rFonts w:ascii="Gelasio" w:cs="Gelasio" w:eastAsia="Gelasio" w:hAnsi="Gelasio"/>
           <w:b/>
           <w:bCs/>
           <w:color w:val="2B2B2B"/>
@@ -9837,7 +9837,7 @@
       </w:pPr>
       <w:r>
         <w:rPr>
-          <w:rFonts w:ascii="Georgia" w:cs="Georgia" w:eastAsia="Georgia" w:hAnsi="Georgia"/>
+          <w:rFonts w:ascii="Gelasio" w:cs="Gelasio" w:eastAsia="Gelasio" w:hAnsi="Gelasio"/>
           <w:b/>
           <w:bCs/>
           <w:color w:val="2B2B2B"/>
@@ -9874,7 +9874,7 @@
       </w:pPr>
       <w:r>
         <w:rPr>
-          <w:rFonts w:ascii="Georgia" w:cs="Georgia" w:eastAsia="Georgia" w:hAnsi="Georgia"/>
+          <w:rFonts w:ascii="Gelasio" w:cs="Gelasio" w:eastAsia="Gelasio" w:hAnsi="Gelasio"/>
           <w:b/>
           <w:bCs/>
           <w:color w:val="2B2B2B"/>
@@ -9947,7 +9947,7 @@
       </w:pPr>
       <w:r>
         <w:rPr>
-          <w:rFonts w:ascii="Georgia" w:cs="Georgia" w:eastAsia="Georgia" w:hAnsi="Georgia"/>
+          <w:rFonts w:ascii="Gelasio" w:cs="Gelasio" w:eastAsia="Gelasio" w:hAnsi="Gelasio"/>
           <w:b/>
           <w:bCs/>
           <w:color w:val="2B2B2B"/>
@@ -10002,7 +10002,7 @@
       </w:pPr>
       <w:r>
         <w:rPr>
-          <w:rFonts w:ascii="Georgia" w:cs="Georgia" w:eastAsia="Georgia" w:hAnsi="Georgia"/>
+          <w:rFonts w:ascii="Gelasio" w:cs="Gelasio" w:eastAsia="Gelasio" w:hAnsi="Gelasio"/>
           <w:b/>
           <w:bCs/>
           <w:color w:val="2B2B2B"/>
@@ -10048,7 +10048,7 @@
       </w:pPr>
       <w:r>
         <w:rPr>
-          <w:rFonts w:ascii="Georgia" w:cs="Georgia" w:eastAsia="Georgia" w:hAnsi="Georgia"/>
+          <w:rFonts w:ascii="Gelasio" w:cs="Gelasio" w:eastAsia="Gelasio" w:hAnsi="Gelasio"/>
           <w:b/>
           <w:bCs/>
           <w:color w:val="2B2B2B"/>
@@ -10085,7 +10085,7 @@
       </w:pPr>
       <w:r>
         <w:rPr>
-          <w:rFonts w:ascii="Georgia" w:cs="Georgia" w:eastAsia="Georgia" w:hAnsi="Georgia"/>
+          <w:rFonts w:ascii="Gelasio" w:cs="Gelasio" w:eastAsia="Gelasio" w:hAnsi="Gelasio"/>
           <w:b/>
           <w:bCs/>
           <w:color w:val="2B2B2B"/>
@@ -10226,7 +10226,7 @@
       </w:pPr>
       <w:r>
         <w:rPr>
-          <w:rFonts w:ascii="Georgia" w:cs="Georgia" w:eastAsia="Georgia" w:hAnsi="Georgia"/>
+          <w:rFonts w:ascii="Gelasio" w:cs="Gelasio" w:eastAsia="Gelasio" w:hAnsi="Gelasio"/>
           <w:b/>
           <w:bCs/>
           <w:color w:val="8C2F2F"/>
@@ -10237,7 +10237,7 @@
       </w:r>
       <w:r>
         <w:rPr>
-          <w:rFonts w:ascii="Georgia" w:cs="Georgia" w:eastAsia="Georgia" w:hAnsi="Georgia"/>
+          <w:rFonts w:ascii="Gelasio" w:cs="Gelasio" w:eastAsia="Gelasio" w:hAnsi="Gelasio"/>
           <w:b/>
           <w:bCs/>
           <w:color w:val="3D5A6C"/>
@@ -10266,7 +10266,7 @@
       </w:pPr>
       <w:r>
         <w:rPr>
-          <w:rFonts w:ascii="Georgia" w:cs="Georgia" w:eastAsia="Georgia" w:hAnsi="Georgia"/>
+          <w:rFonts w:ascii="Gelasio" w:cs="Gelasio" w:eastAsia="Gelasio" w:hAnsi="Gelasio"/>
           <w:b/>
           <w:bCs/>
           <w:color w:val="2B2B2B"/>
@@ -10394,7 +10394,7 @@
       </w:pPr>
       <w:r>
         <w:rPr>
-          <w:rFonts w:ascii="Georgia" w:cs="Georgia" w:eastAsia="Georgia" w:hAnsi="Georgia"/>
+          <w:rFonts w:ascii="Gelasio" w:cs="Gelasio" w:eastAsia="Gelasio" w:hAnsi="Gelasio"/>
           <w:b/>
           <w:bCs/>
           <w:color w:val="2B2B2B"/>
@@ -11385,7 +11385,7 @@
       </w:pPr>
       <w:r>
         <w:rPr>
-          <w:rFonts w:ascii="Georgia" w:cs="Georgia" w:eastAsia="Georgia" w:hAnsi="Georgia"/>
+          <w:rFonts w:ascii="Gelasio" w:cs="Gelasio" w:eastAsia="Gelasio" w:hAnsi="Gelasio"/>
           <w:b/>
           <w:bCs/>
           <w:color w:val="2B2B2B"/>
@@ -11422,7 +11422,7 @@
       </w:pPr>
       <w:r>
         <w:rPr>
-          <w:rFonts w:ascii="Georgia" w:cs="Georgia" w:eastAsia="Georgia" w:hAnsi="Georgia"/>
+          <w:rFonts w:ascii="Gelasio" w:cs="Gelasio" w:eastAsia="Gelasio" w:hAnsi="Gelasio"/>
           <w:b/>
           <w:bCs/>
           <w:color w:val="2B2B2B"/>
@@ -11459,7 +11459,7 @@
       </w:pPr>
       <w:r>
         <w:rPr>
-          <w:rFonts w:ascii="Georgia" w:cs="Georgia" w:eastAsia="Georgia" w:hAnsi="Georgia"/>
+          <w:rFonts w:ascii="Gelasio" w:cs="Gelasio" w:eastAsia="Gelasio" w:hAnsi="Gelasio"/>
           <w:b/>
           <w:bCs/>
           <w:color w:val="2B2B2B"/>
@@ -11496,7 +11496,7 @@
       </w:pPr>
       <w:r>
         <w:rPr>
-          <w:rFonts w:ascii="Georgia" w:cs="Georgia" w:eastAsia="Georgia" w:hAnsi="Georgia"/>
+          <w:rFonts w:ascii="Gelasio" w:cs="Gelasio" w:eastAsia="Gelasio" w:hAnsi="Gelasio"/>
           <w:b/>
           <w:bCs/>
           <w:color w:val="2B2B2B"/>
@@ -11533,7 +11533,7 @@
       </w:pPr>
       <w:r>
         <w:rPr>
-          <w:rFonts w:ascii="Georgia" w:cs="Georgia" w:eastAsia="Georgia" w:hAnsi="Georgia"/>
+          <w:rFonts w:ascii="Gelasio" w:cs="Gelasio" w:eastAsia="Gelasio" w:hAnsi="Gelasio"/>
           <w:b/>
           <w:bCs/>
           <w:color w:val="2B2B2B"/>
@@ -11678,7 +11678,7 @@
       </w:pPr>
       <w:r>
         <w:rPr>
-          <w:rFonts w:ascii="Georgia" w:cs="Georgia" w:eastAsia="Georgia" w:hAnsi="Georgia"/>
+          <w:rFonts w:ascii="Gelasio" w:cs="Gelasio" w:eastAsia="Gelasio" w:hAnsi="Gelasio"/>
           <w:b/>
           <w:bCs/>
           <w:color w:val="2B2B2B"/>
@@ -11733,7 +11733,7 @@
       </w:pPr>
       <w:r>
         <w:rPr>
-          <w:rFonts w:ascii="Georgia" w:cs="Georgia" w:eastAsia="Georgia" w:hAnsi="Georgia"/>
+          <w:rFonts w:ascii="Gelasio" w:cs="Gelasio" w:eastAsia="Gelasio" w:hAnsi="Gelasio"/>
           <w:b/>
           <w:bCs/>
           <w:color w:val="2B2B2B"/>
@@ -11806,7 +11806,7 @@
       </w:pPr>
       <w:r>
         <w:rPr>
-          <w:rFonts w:ascii="Georgia" w:cs="Georgia" w:eastAsia="Georgia" w:hAnsi="Georgia"/>
+          <w:rFonts w:ascii="Gelasio" w:cs="Gelasio" w:eastAsia="Gelasio" w:hAnsi="Gelasio"/>
           <w:b/>
           <w:bCs/>
           <w:color w:val="2B2B2B"/>
@@ -11920,7 +11920,7 @@
       </w:pPr>
       <w:r>
         <w:rPr>
-          <w:rFonts w:ascii="Georgia" w:cs="Georgia" w:eastAsia="Georgia" w:hAnsi="Georgia"/>
+          <w:rFonts w:ascii="Gelasio" w:cs="Gelasio" w:eastAsia="Gelasio" w:hAnsi="Gelasio"/>
           <w:b/>
           <w:bCs/>
           <w:color w:val="8C2F2F"/>
@@ -11931,7 +11931,7 @@
       </w:r>
       <w:r>
         <w:rPr>
-          <w:rFonts w:ascii="Georgia" w:cs="Georgia" w:eastAsia="Georgia" w:hAnsi="Georgia"/>
+          <w:rFonts w:ascii="Gelasio" w:cs="Gelasio" w:eastAsia="Gelasio" w:hAnsi="Gelasio"/>
           <w:b/>
           <w:bCs/>
           <w:color w:val="3D5A6C"/>
@@ -11960,7 +11960,7 @@
       </w:pPr>
       <w:r>
         <w:rPr>
-          <w:rFonts w:ascii="Georgia" w:cs="Georgia" w:eastAsia="Georgia" w:hAnsi="Georgia"/>
+          <w:rFonts w:ascii="Gelasio" w:cs="Gelasio" w:eastAsia="Gelasio" w:hAnsi="Gelasio"/>
           <w:b/>
           <w:bCs/>
           <w:color w:val="2B2B2B"/>
@@ -12029,7 +12029,7 @@
       </w:pPr>
       <w:r>
         <w:rPr>
-          <w:rFonts w:ascii="Georgia" w:cs="Georgia" w:eastAsia="Georgia" w:hAnsi="Georgia"/>
+          <w:rFonts w:ascii="Gelasio" w:cs="Gelasio" w:eastAsia="Gelasio" w:hAnsi="Gelasio"/>
           <w:b/>
           <w:bCs/>
           <w:color w:val="2B2B2B"/>
@@ -12105,7 +12105,7 @@
       </w:pPr>
       <w:r>
         <w:rPr>
-          <w:rFonts w:ascii="Georgia" w:cs="Georgia" w:eastAsia="Georgia" w:hAnsi="Georgia"/>
+          <w:rFonts w:ascii="Gelasio" w:cs="Gelasio" w:eastAsia="Gelasio" w:hAnsi="Gelasio"/>
           <w:b/>
           <w:bCs/>
           <w:color w:val="2B2B2B"/>
@@ -12229,7 +12229,7 @@
       </w:pPr>
       <w:r>
         <w:rPr>
-          <w:rFonts w:ascii="Georgia" w:cs="Georgia" w:eastAsia="Georgia" w:hAnsi="Georgia"/>
+          <w:rFonts w:ascii="Gelasio" w:cs="Gelasio" w:eastAsia="Gelasio" w:hAnsi="Gelasio"/>
           <w:b/>
           <w:bCs/>
           <w:color w:val="2B2B2B"/>
@@ -12353,7 +12353,7 @@
       </w:pPr>
       <w:r>
         <w:rPr>
-          <w:rFonts w:ascii="Georgia" w:cs="Georgia" w:eastAsia="Georgia" w:hAnsi="Georgia"/>
+          <w:rFonts w:ascii="Gelasio" w:cs="Gelasio" w:eastAsia="Gelasio" w:hAnsi="Gelasio"/>
           <w:b/>
           <w:bCs/>
           <w:color w:val="2B2B2B"/>
@@ -12477,7 +12477,7 @@
       </w:pPr>
       <w:r>
         <w:rPr>
-          <w:rFonts w:ascii="Georgia" w:cs="Georgia" w:eastAsia="Georgia" w:hAnsi="Georgia"/>
+          <w:rFonts w:ascii="Gelasio" w:cs="Gelasio" w:eastAsia="Gelasio" w:hAnsi="Gelasio"/>
           <w:b/>
           <w:bCs/>
           <w:color w:val="2B2B2B"/>
@@ -12662,7 +12662,7 @@
       </w:pPr>
       <w:r>
         <w:rPr>
-          <w:rFonts w:ascii="Georgia" w:cs="Georgia" w:eastAsia="Georgia" w:hAnsi="Georgia"/>
+          <w:rFonts w:ascii="Gelasio" w:cs="Gelasio" w:eastAsia="Gelasio" w:hAnsi="Gelasio"/>
           <w:b/>
           <w:bCs/>
           <w:color w:val="2B2B2B"/>
@@ -12786,7 +12786,7 @@
       </w:pPr>
       <w:r>
         <w:rPr>
-          <w:rFonts w:ascii="Georgia" w:cs="Georgia" w:eastAsia="Georgia" w:hAnsi="Georgia"/>
+          <w:rFonts w:ascii="Gelasio" w:cs="Gelasio" w:eastAsia="Gelasio" w:hAnsi="Gelasio"/>
           <w:b/>
           <w:bCs/>
           <w:color w:val="2B2B2B"/>
@@ -12910,7 +12910,7 @@
       </w:pPr>
       <w:r>
         <w:rPr>
-          <w:rFonts w:ascii="Georgia" w:cs="Georgia" w:eastAsia="Georgia" w:hAnsi="Georgia"/>
+          <w:rFonts w:ascii="Gelasio" w:cs="Gelasio" w:eastAsia="Gelasio" w:hAnsi="Gelasio"/>
           <w:b/>
           <w:bCs/>
           <w:color w:val="2B2B2B"/>
@@ -12939,7 +12939,7 @@
       </w:pPr>
       <w:r>
         <w:rPr>
-          <w:rFonts w:ascii="Georgia" w:cs="Georgia" w:eastAsia="Georgia" w:hAnsi="Georgia"/>
+          <w:rFonts w:ascii="Gelasio" w:cs="Gelasio" w:eastAsia="Gelasio" w:hAnsi="Gelasio"/>
           <w:b/>
           <w:bCs/>
           <w:color w:val="8C2F2F"/>
@@ -12950,7 +12950,7 @@
       </w:r>
       <w:r>
         <w:rPr>
-          <w:rFonts w:ascii="Georgia" w:cs="Georgia" w:eastAsia="Georgia" w:hAnsi="Georgia"/>
+          <w:rFonts w:ascii="Gelasio" w:cs="Gelasio" w:eastAsia="Gelasio" w:hAnsi="Gelasio"/>
           <w:b/>
           <w:bCs/>
           <w:color w:val="3D5A6C"/>
@@ -12979,7 +12979,7 @@
       </w:pPr>
       <w:r>
         <w:rPr>
-          <w:rFonts w:ascii="Georgia" w:cs="Georgia" w:eastAsia="Georgia" w:hAnsi="Georgia"/>
+          <w:rFonts w:ascii="Gelasio" w:cs="Gelasio" w:eastAsia="Gelasio" w:hAnsi="Gelasio"/>
           <w:b/>
           <w:bCs/>
           <w:color w:val="2B2B2B"/>
@@ -13016,7 +13016,7 @@
       </w:pPr>
       <w:r>
         <w:rPr>
-          <w:rFonts w:ascii="Georgia" w:cs="Georgia" w:eastAsia="Georgia" w:hAnsi="Georgia"/>
+          <w:rFonts w:ascii="Gelasio" w:cs="Gelasio" w:eastAsia="Gelasio" w:hAnsi="Gelasio"/>
           <w:b/>
           <w:bCs/>
           <w:color w:val="2B2B2B"/>
@@ -13053,7 +13053,7 @@
       </w:pPr>
       <w:r>
         <w:rPr>
-          <w:rFonts w:ascii="Georgia" w:cs="Georgia" w:eastAsia="Georgia" w:hAnsi="Georgia"/>
+          <w:rFonts w:ascii="Gelasio" w:cs="Gelasio" w:eastAsia="Gelasio" w:hAnsi="Gelasio"/>
           <w:b/>
           <w:bCs/>
           <w:color w:val="2B2B2B"/>
@@ -13090,7 +13090,7 @@
       </w:pPr>
       <w:r>
         <w:rPr>
-          <w:rFonts w:ascii="Georgia" w:cs="Georgia" w:eastAsia="Georgia" w:hAnsi="Georgia"/>
+          <w:rFonts w:ascii="Gelasio" w:cs="Gelasio" w:eastAsia="Gelasio" w:hAnsi="Gelasio"/>
           <w:b/>
           <w:bCs/>
           <w:color w:val="2B2B2B"/>
@@ -13181,7 +13181,7 @@
       </w:pPr>
       <w:r>
         <w:rPr>
-          <w:rFonts w:ascii="Georgia" w:cs="Georgia" w:eastAsia="Georgia" w:hAnsi="Georgia"/>
+          <w:rFonts w:ascii="Gelasio" w:cs="Gelasio" w:eastAsia="Gelasio" w:hAnsi="Gelasio"/>
           <w:b/>
           <w:bCs/>
           <w:color w:val="2B2B2B"/>
@@ -13304,7 +13304,7 @@
       </w:pPr>
       <w:r>
         <w:rPr>
-          <w:rFonts w:ascii="Georgia" w:cs="Georgia" w:eastAsia="Georgia" w:hAnsi="Georgia"/>
+          <w:rFonts w:ascii="Gelasio" w:cs="Gelasio" w:eastAsia="Gelasio" w:hAnsi="Gelasio"/>
           <w:b/>
           <w:bCs/>
           <w:color w:val="8C2F2F"/>
@@ -13315,7 +13315,7 @@
       </w:r>
       <w:r>
         <w:rPr>
-          <w:rFonts w:ascii="Georgia" w:cs="Georgia" w:eastAsia="Georgia" w:hAnsi="Georgia"/>
+          <w:rFonts w:ascii="Gelasio" w:cs="Gelasio" w:eastAsia="Gelasio" w:hAnsi="Gelasio"/>
           <w:b/>
           <w:bCs/>
           <w:color w:val="3D5A6C"/>
@@ -13344,7 +13344,7 @@
       </w:pPr>
       <w:r>
         <w:rPr>
-          <w:rFonts w:ascii="Georgia" w:cs="Georgia" w:eastAsia="Georgia" w:hAnsi="Georgia"/>
+          <w:rFonts w:ascii="Gelasio" w:cs="Gelasio" w:eastAsia="Gelasio" w:hAnsi="Gelasio"/>
           <w:b/>
           <w:bCs/>
           <w:color w:val="2B2B2B"/>
@@ -13381,7 +13381,7 @@
       </w:pPr>
       <w:r>
         <w:rPr>
-          <w:rFonts w:ascii="Georgia" w:cs="Georgia" w:eastAsia="Georgia" w:hAnsi="Georgia"/>
+          <w:rFonts w:ascii="Gelasio" w:cs="Gelasio" w:eastAsia="Gelasio" w:hAnsi="Gelasio"/>
           <w:b/>
           <w:bCs/>
           <w:color w:val="2B2B2B"/>
@@ -13418,7 +13418,7 @@
       </w:pPr>
       <w:r>
         <w:rPr>
-          <w:rFonts w:ascii="Georgia" w:cs="Georgia" w:eastAsia="Georgia" w:hAnsi="Georgia"/>
+          <w:rFonts w:ascii="Gelasio" w:cs="Gelasio" w:eastAsia="Gelasio" w:hAnsi="Gelasio"/>
           <w:b/>
           <w:bCs/>
           <w:color w:val="2B2B2B"/>
@@ -13455,7 +13455,7 @@
       </w:pPr>
       <w:r>
         <w:rPr>
-          <w:rFonts w:ascii="Georgia" w:cs="Georgia" w:eastAsia="Georgia" w:hAnsi="Georgia"/>
+          <w:rFonts w:ascii="Gelasio" w:cs="Gelasio" w:eastAsia="Gelasio" w:hAnsi="Gelasio"/>
           <w:b/>
           <w:bCs/>
           <w:color w:val="2B2B2B"/>
@@ -13703,7 +13703,7 @@
       </w:pPr>
       <w:r>
         <w:rPr>
-          <w:rFonts w:ascii="Georgia" w:cs="Georgia" w:eastAsia="Georgia" w:hAnsi="Georgia"/>
+          <w:rFonts w:ascii="Gelasio" w:cs="Gelasio" w:eastAsia="Gelasio" w:hAnsi="Gelasio"/>
           <w:b/>
           <w:bCs/>
           <w:color w:val="2B2B2B"/>
@@ -13788,7 +13788,7 @@
       </w:pPr>
       <w:r>
         <w:rPr>
-          <w:rFonts w:ascii="Georgia" w:cs="Georgia" w:eastAsia="Georgia" w:hAnsi="Georgia"/>
+          <w:rFonts w:ascii="Gelasio" w:cs="Gelasio" w:eastAsia="Gelasio" w:hAnsi="Gelasio"/>
           <w:b/>
           <w:bCs/>
           <w:color w:val="2B2B2B"/>
@@ -13825,7 +13825,7 @@
       </w:pPr>
       <w:r>
         <w:rPr>
-          <w:rFonts w:ascii="Georgia" w:cs="Georgia" w:eastAsia="Georgia" w:hAnsi="Georgia"/>
+          <w:rFonts w:ascii="Gelasio" w:cs="Gelasio" w:eastAsia="Gelasio" w:hAnsi="Gelasio"/>
           <w:b/>
           <w:bCs/>
           <w:color w:val="2B2B2B"/>
@@ -14069,7 +14069,7 @@
       </w:pPr>
       <w:r>
         <w:rPr>
-          <w:rFonts w:ascii="Georgia" w:cs="Georgia" w:eastAsia="Georgia" w:hAnsi="Georgia"/>
+          <w:rFonts w:ascii="Gelasio" w:cs="Gelasio" w:eastAsia="Gelasio" w:hAnsi="Gelasio"/>
           <w:b/>
           <w:bCs/>
           <w:color w:val="2B2B2B"/>
@@ -14294,7 +14294,7 @@
       </w:pPr>
       <w:r>
         <w:rPr>
-          <w:rFonts w:ascii="Georgia" w:cs="Georgia" w:eastAsia="Georgia" w:hAnsi="Georgia"/>
+          <w:rFonts w:ascii="Gelasio" w:cs="Gelasio" w:eastAsia="Gelasio" w:hAnsi="Gelasio"/>
           <w:b/>
           <w:bCs/>
           <w:color w:val="8C2F2F"/>
@@ -14305,7 +14305,7 @@
       </w:r>
       <w:r>
         <w:rPr>
-          <w:rFonts w:ascii="Georgia" w:cs="Georgia" w:eastAsia="Georgia" w:hAnsi="Georgia"/>
+          <w:rFonts w:ascii="Gelasio" w:cs="Gelasio" w:eastAsia="Gelasio" w:hAnsi="Gelasio"/>
           <w:b/>
           <w:bCs/>
           <w:color w:val="3D5A6C"/>
@@ -14334,7 +14334,7 @@
       </w:pPr>
       <w:r>
         <w:rPr>
-          <w:rFonts w:ascii="Georgia" w:cs="Georgia" w:eastAsia="Georgia" w:hAnsi="Georgia"/>
+          <w:rFonts w:ascii="Gelasio" w:cs="Gelasio" w:eastAsia="Gelasio" w:hAnsi="Gelasio"/>
           <w:b/>
           <w:bCs/>
           <w:color w:val="2B2B2B"/>
@@ -14371,7 +14371,7 @@
       </w:pPr>
       <w:r>
         <w:rPr>
-          <w:rFonts w:ascii="Georgia" w:cs="Georgia" w:eastAsia="Georgia" w:hAnsi="Georgia"/>
+          <w:rFonts w:ascii="Gelasio" w:cs="Gelasio" w:eastAsia="Gelasio" w:hAnsi="Gelasio"/>
           <w:b/>
           <w:bCs/>
           <w:color w:val="2B2B2B"/>
@@ -14408,7 +14408,7 @@
       </w:pPr>
       <w:r>
         <w:rPr>
-          <w:rFonts w:ascii="Georgia" w:cs="Georgia" w:eastAsia="Georgia" w:hAnsi="Georgia"/>
+          <w:rFonts w:ascii="Gelasio" w:cs="Gelasio" w:eastAsia="Gelasio" w:hAnsi="Gelasio"/>
           <w:b/>
           <w:bCs/>
           <w:color w:val="2B2B2B"/>
@@ -14445,7 +14445,7 @@
       </w:pPr>
       <w:r>
         <w:rPr>
-          <w:rFonts w:ascii="Georgia" w:cs="Georgia" w:eastAsia="Georgia" w:hAnsi="Georgia"/>
+          <w:rFonts w:ascii="Gelasio" w:cs="Gelasio" w:eastAsia="Gelasio" w:hAnsi="Gelasio"/>
           <w:b/>
           <w:bCs/>
           <w:color w:val="2B2B2B"/>
@@ -14491,7 +14491,7 @@
       </w:pPr>
       <w:r>
         <w:rPr>
-          <w:rFonts w:ascii="Georgia" w:cs="Georgia" w:eastAsia="Georgia" w:hAnsi="Georgia"/>
+          <w:rFonts w:ascii="Gelasio" w:cs="Gelasio" w:eastAsia="Gelasio" w:hAnsi="Gelasio"/>
           <w:b/>
           <w:bCs/>
           <w:color w:val="2B2B2B"/>
@@ -14605,7 +14605,7 @@
       </w:pPr>
       <w:r>
         <w:rPr>
-          <w:rFonts w:ascii="Georgia" w:cs="Georgia" w:eastAsia="Georgia" w:hAnsi="Georgia"/>
+          <w:rFonts w:ascii="Gelasio" w:cs="Gelasio" w:eastAsia="Gelasio" w:hAnsi="Gelasio"/>
           <w:b/>
           <w:bCs/>
           <w:color w:val="2B2B2B"/>
@@ -14804,7 +14804,7 @@
       </w:pPr>
       <w:r>
         <w:rPr>
-          <w:rFonts w:ascii="Georgia" w:cs="Georgia" w:eastAsia="Georgia" w:hAnsi="Georgia"/>
+          <w:rFonts w:ascii="Gelasio" w:cs="Gelasio" w:eastAsia="Gelasio" w:hAnsi="Gelasio"/>
           <w:b/>
           <w:bCs/>
           <w:color w:val="2B2B2B"/>
@@ -14851,7 +14851,7 @@
       </w:pPr>
       <w:r>
         <w:rPr>
-          <w:rFonts w:ascii="Georgia" w:cs="Georgia" w:eastAsia="Georgia" w:hAnsi="Georgia"/>
+          <w:rFonts w:ascii="Gelasio" w:cs="Gelasio" w:eastAsia="Gelasio" w:hAnsi="Gelasio"/>
           <w:b/>
           <w:bCs/>
           <w:color w:val="2B2B2B"/>
@@ -15337,7 +15337,7 @@
       </w:pPr>
       <w:r>
         <w:rPr>
-          <w:rFonts w:ascii="Georgia" w:cs="Georgia" w:eastAsia="Georgia" w:hAnsi="Georgia"/>
+          <w:rFonts w:ascii="Gelasio" w:cs="Gelasio" w:eastAsia="Gelasio" w:hAnsi="Gelasio"/>
           <w:b/>
           <w:bCs/>
           <w:color w:val="2B2B2B"/>
@@ -15356,7 +15356,7 @@
       </w:pPr>
       <w:r>
         <w:rPr>
-          <w:rFonts w:ascii="Georgia" w:cs="Georgia" w:eastAsia="Georgia" w:hAnsi="Georgia"/>
+          <w:rFonts w:ascii="Gelasio" w:cs="Gelasio" w:eastAsia="Gelasio" w:hAnsi="Gelasio"/>
           <w:b/>
           <w:bCs/>
           <w:color w:val="2B2B2B"/>
@@ -16478,7 +16478,7 @@
                 <w:sz w:val="17"/>
                 <w:szCs w:val="17"/>
               </w:rPr>
-              <w:t xml:space="preserve">«Se descarta embarazo (β-hCG negativa)»</w:t>
+              <w:t xml:space="preserve">«Se descarta embarazo (beta-hCG negativa)»</w:t>
             </w:r>
           </w:p>
         </w:tc>
@@ -16623,7 +16623,7 @@
       </w:pPr>
       <w:r>
         <w:rPr>
-          <w:rFonts w:ascii="Georgia" w:cs="Georgia" w:eastAsia="Georgia" w:hAnsi="Georgia"/>
+          <w:rFonts w:ascii="Gelasio" w:cs="Gelasio" w:eastAsia="Gelasio" w:hAnsi="Gelasio"/>
           <w:b/>
           <w:bCs/>
           <w:color w:val="2B2B2B"/>
@@ -16799,7 +16799,7 @@
       </w:pPr>
       <w:r>
         <w:rPr>
-          <w:rFonts w:ascii="Georgia" w:cs="Georgia" w:eastAsia="Georgia" w:hAnsi="Georgia"/>
+          <w:rFonts w:ascii="Gelasio" w:cs="Gelasio" w:eastAsia="Gelasio" w:hAnsi="Gelasio"/>
           <w:b/>
           <w:bCs/>
           <w:color w:val="2B2B2B"/>
@@ -16827,7 +16827,7 @@
       </w:pPr>
       <w:r>
         <w:rPr>
-          <w:rFonts w:ascii="Georgia" w:cs="Georgia" w:eastAsia="Georgia" w:hAnsi="Georgia"/>
+          <w:rFonts w:ascii="Gelasio" w:cs="Gelasio" w:eastAsia="Gelasio" w:hAnsi="Gelasio"/>
           <w:b/>
           <w:bCs/>
           <w:color w:val="2B2B2B"/>
@@ -16885,7 +16885,7 @@
       </w:pPr>
       <w:r>
         <w:rPr>
-          <w:rFonts w:ascii="Georgia" w:cs="Georgia" w:eastAsia="Georgia" w:hAnsi="Georgia"/>
+          <w:rFonts w:ascii="Gelasio" w:cs="Gelasio" w:eastAsia="Gelasio" w:hAnsi="Gelasio"/>
           <w:b/>
           <w:bCs/>
           <w:color w:val="2B2B2B"/>
@@ -16943,7 +16943,7 @@
       </w:pPr>
       <w:r>
         <w:rPr>
-          <w:rFonts w:ascii="Georgia" w:cs="Georgia" w:eastAsia="Georgia" w:hAnsi="Georgia"/>
+          <w:rFonts w:ascii="Gelasio" w:cs="Gelasio" w:eastAsia="Gelasio" w:hAnsi="Gelasio"/>
           <w:b/>
           <w:bCs/>
           <w:color w:val="2B2B2B"/>
@@ -17001,7 +17001,7 @@
       </w:pPr>
       <w:r>
         <w:rPr>
-          <w:rFonts w:ascii="Georgia" w:cs="Georgia" w:eastAsia="Georgia" w:hAnsi="Georgia"/>
+          <w:rFonts w:ascii="Gelasio" w:cs="Gelasio" w:eastAsia="Gelasio" w:hAnsi="Gelasio"/>
           <w:b/>
           <w:bCs/>
           <w:color w:val="2B2B2B"/>
@@ -17059,7 +17059,7 @@
       </w:pPr>
       <w:r>
         <w:rPr>
-          <w:rFonts w:ascii="Georgia" w:cs="Georgia" w:eastAsia="Georgia" w:hAnsi="Georgia"/>
+          <w:rFonts w:ascii="Gelasio" w:cs="Gelasio" w:eastAsia="Gelasio" w:hAnsi="Gelasio"/>
           <w:b/>
           <w:bCs/>
           <w:color w:val="2B2B2B"/>
@@ -17087,7 +17087,7 @@
       </w:pPr>
       <w:r>
         <w:rPr>
-          <w:rFonts w:ascii="Georgia" w:cs="Georgia" w:eastAsia="Georgia" w:hAnsi="Georgia"/>
+          <w:rFonts w:ascii="Gelasio" w:cs="Gelasio" w:eastAsia="Gelasio" w:hAnsi="Gelasio"/>
           <w:b/>
           <w:bCs/>
           <w:color w:val="2B2B2B"/>
@@ -17205,7 +17205,7 @@
       </w:pPr>
       <w:r>
         <w:rPr>
-          <w:rFonts w:ascii="Georgia" w:cs="Georgia" w:eastAsia="Georgia" w:hAnsi="Georgia"/>
+          <w:rFonts w:ascii="Gelasio" w:cs="Gelasio" w:eastAsia="Gelasio" w:hAnsi="Gelasio"/>
           <w:b/>
           <w:bCs/>
           <w:color w:val="2B2B2B"/>
@@ -18197,7 +18197,7 @@
       </w:pPr>
       <w:r>
         <w:rPr>
-          <w:rFonts w:ascii="Georgia" w:cs="Georgia" w:eastAsia="Georgia" w:hAnsi="Georgia"/>
+          <w:rFonts w:ascii="Gelasio" w:cs="Gelasio" w:eastAsia="Gelasio" w:hAnsi="Gelasio"/>
           <w:b/>
           <w:bCs/>
           <w:color w:val="2B2B2B"/>
@@ -19214,7 +19214,7 @@
       </w:pPr>
       <w:r>
         <w:rPr>
-          <w:rFonts w:ascii="Georgia" w:cs="Georgia" w:eastAsia="Georgia" w:hAnsi="Georgia"/>
+          <w:rFonts w:ascii="Gelasio" w:cs="Gelasio" w:eastAsia="Gelasio" w:hAnsi="Gelasio"/>
           <w:b/>
           <w:bCs/>
           <w:color w:val="2B2B2B"/>
@@ -19230,7 +19230,7 @@
         <w:keepNext w:val="false"/>
       </w:pPr>
       <w:r>
-        <w:t xml:space="preserve">Los términos marcados con ∗ son propuestas de este libro; los demás se toman de la literatura, con su autor entre paréntesis cuando corresponde. Cuando el concepto tiene un nombre establecido en inglés, va entre paréntesis para que pueda buscarse en la literatura.</w:t>
+        <w:t xml:space="preserve">Los términos marcados con * son propuestas de este libro; los demás se toman de la literatura, con su autor entre paréntesis cuando corresponde. Cuando el concepto tiene un nombre establecido en inglés, va entre paréntesis para que pueda buscarse en la literatura.</w:t>
       </w:r>
     </w:p>
     <w:p>
@@ -19291,7 +19291,7 @@
           <w:b/>
           <w:bCs/>
         </w:rPr>
-        <w:t xml:space="preserve">Captura cognitiva∗.</w:t>
+        <w:t xml:space="preserve">Captura cognitiva*.</w:t>
       </w:r>
       <w:r>
         <w:t xml:space="preserve"> Condicionamiento de la búsqueda de hipótesis, la lectura de los datos y la ponderación por una respuesta vista antes de razonar —típicamente la de un asistente de IA—. No exige que la respuesta sea errónea: una hipótesis correcta entregada demasiado pronto también sustituye las operaciones que forman el juicio.</w:t>
@@ -19387,7 +19387,7 @@
           <w:b/>
           <w:bCs/>
         </w:rPr>
-        <w:t xml:space="preserve">Creatividad clínica∗.</w:t>
+        <w:t xml:space="preserve">Creatividad clínica*.</w:t>
       </w:r>
       <w:r>
         <w:t xml:space="preserve"> Momento generativo del juicio: conjeturar hipótesis (abducción), re-plantear el problema y crear opciones de manejo. Casi siempre es creatividad psicológica y exploratoria (Boden): nueva para el caso, no para la humanidad. Se ejerce en la generación y se corrige en la selección.</w:t>
@@ -19403,7 +19403,7 @@
           <w:b/>
           <w:bCs/>
         </w:rPr>
-        <w:t xml:space="preserve">Criterio de reapertura∗.</w:t>
+        <w:t xml:space="preserve">Criterio de reapertura*.</w:t>
       </w:r>
       <w:r>
         <w:t xml:space="preserve"> Cambio clínico, resultado pendiente, plazo o evento que, escrito antes de cerrar el caso y con un responsable, obliga a reabrirlo («reevaluar si…; responsable: …; plazo: …»). Es la reevaluación de HII-D vuelta cláusula concreta y el compromiso del equipo, distinto de la red de seguridad, que es lo que el paciente vigila en su casa. Sin él, la decisión queda sin fecha de vencimiento.</w:t>
@@ -19467,7 +19467,7 @@
           <w:b/>
           <w:bCs/>
         </w:rPr>
-        <w:t xml:space="preserve">Densidad epistémica∗.</w:t>
+        <w:t xml:space="preserve">Densidad epistémica*.</w:t>
       </w:r>
       <w:r>
         <w:t xml:space="preserve"> Propiedad de una formulación clínica que conserva lo que una frase pierde con más frecuencia —procedencia, temporalidad, transparencia inferencial, calibración modal, relevancia decisional y revisabilidad: las seis dimensiones de auditoría del capítulo 4— en lugar de sólo abreviar.</w:t>
@@ -19579,7 +19579,7 @@
           <w:b/>
           <w:bCs/>
         </w:rPr>
-        <w:t xml:space="preserve">Estado del razonador∗.</w:t>
+        <w:t xml:space="preserve">Estado del razonador*.</w:t>
       </w:r>
       <w:r>
         <w:t xml:space="preserve"> Condiciones en que se produce un juicio clínico —hora del día, horas de turno, sueño, ánimo, preocupación ajena al caso—, tratadas como un hecho de la capa H sobre la confiabilidad del instrumento que infiere y como disparador de pausa o de segundo lector. Pensar cuesta, y el costo no es constante.</w:t>
@@ -19611,7 +19611,7 @@
           <w:b/>
           <w:bCs/>
         </w:rPr>
-        <w:t xml:space="preserve">Ficha de proceso∗.</w:t>
+        <w:t xml:space="preserve">Ficha de proceso*.</w:t>
       </w:r>
       <w:r>
         <w:t xml:space="preserve"> Registro que, además de conclusiones y acciones (ficha de resultados), conjuga los verbos del razonamiento: sospechado, dudado, descartado, priorizado, inferido, realizado, repetido, comprobado, aprendido. Cada verbo cae en una capa de HII-D; «Neumonía. Ceftriaxona» no conjuga ninguno.</w:t>
@@ -19643,7 +19643,7 @@
           <w:b/>
           <w:bCs/>
         </w:rPr>
-        <w:t xml:space="preserve">Frase medular∗.</w:t>
+        <w:t xml:space="preserve">Frase medular*.</w:t>
       </w:r>
       <w:r>
         <w:t xml:space="preserve"> Formulación breve que condensa la naturaleza del evento, la inferencia con su grado, la incertidumbre crítica y el efecto sobre la conducta: las cuatro capas de HII-D en una o dos frases.</w:t>
@@ -19675,7 +19675,7 @@
           <w:b/>
           <w:bCs/>
         </w:rPr>
-        <w:t xml:space="preserve">HII-D∗.</w:t>
+        <w:t xml:space="preserve">HII-D*.</w:t>
       </w:r>
       <w:r>
         <w:t xml:space="preserve"> Heurística de escritura y deliberación que, a partir de una pregunta operativa, ordena el razonamiento en Hechos, Inferencias, Incertidumbre y Decisión, más un movimiento transversal de reevaluación. No validada como instrumento.</w:t>
@@ -19787,7 +19787,7 @@
           <w:b/>
           <w:bCs/>
         </w:rPr>
-        <w:t xml:space="preserve">Léxico de certeza∗.</w:t>
+        <w:t xml:space="preserve">Léxico de certeza*.</w:t>
       </w:r>
       <w:r>
         <w:t xml:space="preserve"> Escala verbal con la que toda inferencia escrita declara cuánto derecho tiene a afirmarse —demostrado, altamente probable, probable, posible, no demostrado—, junto a las expresiones de ausencia y de exclusión que no deben confundirse con ella (sin evidencia actual de, no evaluable, se descarta), definidas en el Apéndice B. Es un caso particular de la modalidad epistémica, fijado para que el equipo use las mismas palabras con el mismo significado.</w:t>
@@ -20059,7 +20059,7 @@
           <w:b/>
           <w:bCs/>
         </w:rPr>
-        <w:t xml:space="preserve">Segundo lector∗.</w:t>
+        <w:t xml:space="preserve">Segundo lector*.</w:t>
       </w:r>
       <w:r>
         <w:t xml:space="preserve"> Otro médico, un especialista, un equipo interdisciplinario o una herramienta de apoyo que revisa el juicio antes de que se fije y aporta una representación distinta del mismo caso. Lo activan disparadores clínicos (reconsulta, evolución discordante, transferencia) y también el estado del razonador: turno largo, madrugada, ánimo alterado. No sustituye a la segunda opinión formal; la precede y cuesta menos.</w:t>
@@ -20187,7 +20187,7 @@
       </w:pPr>
       <w:r>
         <w:rPr>
-          <w:rFonts w:ascii="Georgia" w:cs="Georgia" w:eastAsia="Georgia" w:hAnsi="Georgia"/>
+          <w:rFonts w:ascii="Gelasio" w:cs="Gelasio" w:eastAsia="Gelasio" w:hAnsi="Gelasio"/>
           <w:b/>
           <w:bCs/>
           <w:color w:val="2B2B2B"/>
@@ -21646,7 +21646,7 @@
       </w:pPr>
       <w:r>
         <w:rPr>
-          <w:rFonts w:ascii="Georgia" w:cs="Georgia" w:eastAsia="Georgia" w:hAnsi="Georgia"/>
+          <w:rFonts w:ascii="Gelasio" w:cs="Gelasio" w:eastAsia="Gelasio" w:hAnsi="Gelasio"/>
           <w:b/>
           <w:bCs/>
           <w:color w:val="2B2B2B"/>
@@ -21861,7 +21861,7 @@
       </w:pPr>
       <w:r>
         <w:rPr>
-          <w:rFonts w:ascii="Georgia" w:cs="Georgia" w:eastAsia="Georgia" w:hAnsi="Georgia"/>
+          <w:rFonts w:ascii="Gelasio" w:cs="Gelasio" w:eastAsia="Gelasio" w:hAnsi="Gelasio"/>
           <w:b/>
           <w:bCs/>
           <w:color w:val="2B2B2B"/>
@@ -22023,7 +22023,7 @@
       </w:pPr>
       <w:r>
         <w:rPr>
-          <w:rFonts w:ascii="Georgia" w:cs="Georgia" w:eastAsia="Georgia" w:hAnsi="Georgia"/>
+          <w:rFonts w:ascii="Gelasio" w:cs="Gelasio" w:eastAsia="Gelasio" w:hAnsi="Gelasio"/>
           <w:b/>
           <w:bCs/>
           <w:color w:val="2B2B2B"/>
@@ -25464,7 +25464,7 @@
       </w:pPr>
       <w:r>
         <w:rPr>
-          <w:rFonts w:ascii="Georgia" w:cs="Georgia" w:eastAsia="Georgia" w:hAnsi="Georgia"/>
+          <w:rFonts w:ascii="Gelasio" w:cs="Gelasio" w:eastAsia="Gelasio" w:hAnsi="Gelasio"/>
           <w:b/>
           <w:bCs/>
           <w:color w:val="2B2B2B"/>
@@ -25789,7 +25789,7 @@
     </w:pPr>
     <w:r>
       <w:rPr>
-        <w:rFonts w:ascii="Georgia" w:cs="Georgia" w:eastAsia="Georgia" w:hAnsi="Georgia"/>
+        <w:rFonts w:ascii="Gelasio" w:cs="Gelasio" w:eastAsia="Gelasio" w:hAnsi="Gelasio"/>
         <w:color w:val="8A8A8A"/>
         <w:sz w:val="18"/>
         <w:szCs w:val="18"/>
@@ -25849,7 +25849,7 @@
     </w:pPr>
     <w:r>
       <w:rPr>
-        <w:rFonts w:ascii="Georgia" w:cs="Georgia" w:eastAsia="Georgia" w:hAnsi="Georgia"/>
+        <w:rFonts w:ascii="Gelasio" w:cs="Gelasio" w:eastAsia="Gelasio" w:hAnsi="Gelasio"/>
         <w:color w:val="8A8A8A"/>
         <w:spacing w:val="30"/>
         <w:sz w:val="15"/>
@@ -26447,7 +26447,7 @@
   <w:docDefaults>
     <w:rPrDefault>
       <w:rPr>
-        <w:rFonts w:ascii="Georgia" w:cs="Georgia" w:eastAsia="Georgia" w:hAnsi="Georgia"/>
+        <w:rFonts w:ascii="Gelasio" w:cs="Gelasio" w:eastAsia="Gelasio" w:hAnsi="Gelasio"/>
         <w:color w:val="2B2B2B"/>
         <w:sz w:val="22"/>
         <w:szCs w:val="22"/>
@@ -26648,7 +26648,7 @@
       <w:jc w:val="both"/>
     </w:pPr>
     <w:rPr>
-      <w:rFonts w:ascii="Georgia" w:cs="Georgia" w:eastAsia="Georgia" w:hAnsi="Georgia"/>
+      <w:rFonts w:ascii="Gelasio" w:cs="Gelasio" w:eastAsia="Gelasio" w:hAnsi="Gelasio"/>
       <w:color w:val="2B2B2B"/>
       <w:sz w:val="22"/>
       <w:szCs w:val="22"/>
@@ -26663,7 +26663,7 @@
       <w:jc w:val="center"/>
     </w:pPr>
     <w:rPr>
-      <w:rFonts w:ascii="Georgia" w:cs="Georgia" w:eastAsia="Georgia" w:hAnsi="Georgia"/>
+      <w:rFonts w:ascii="Gelasio" w:cs="Gelasio" w:eastAsia="Gelasio" w:hAnsi="Gelasio"/>
       <w:b/>
       <w:bCs/>
       <w:color w:val="8C2F2F"/>
@@ -26681,7 +26681,7 @@
       <w:jc w:val="center"/>
     </w:pPr>
     <w:rPr>
-      <w:rFonts w:ascii="Georgia" w:cs="Georgia" w:eastAsia="Georgia" w:hAnsi="Georgia"/>
+      <w:rFonts w:ascii="Gelasio" w:cs="Gelasio" w:eastAsia="Gelasio" w:hAnsi="Gelasio"/>
       <w:b/>
       <w:bCs/>
       <w:color w:val="2B2B2B"/>
@@ -26698,7 +26698,7 @@
       <w:jc w:val="both"/>
     </w:pPr>
     <w:rPr>
-      <w:rFonts w:ascii="Georgia" w:cs="Georgia" w:eastAsia="Georgia" w:hAnsi="Georgia"/>
+      <w:rFonts w:ascii="Gelasio" w:cs="Gelasio" w:eastAsia="Gelasio" w:hAnsi="Gelasio"/>
       <w:i/>
       <w:iCs/>
       <w:color w:val="5A5A5A"/>
@@ -26718,7 +26718,7 @@
       <w:jc w:val="both"/>
     </w:pPr>
     <w:rPr>
-      <w:rFonts w:ascii="Georgia" w:cs="Georgia" w:eastAsia="Georgia" w:hAnsi="Georgia"/>
+      <w:rFonts w:ascii="Gelasio" w:cs="Gelasio" w:eastAsia="Gelasio" w:hAnsi="Gelasio"/>
       <w:i/>
       <w:iCs/>
       <w:color w:val="2B2B2B"/>
@@ -26736,7 +26736,7 @@
       <w:jc w:val="center"/>
     </w:pPr>
     <w:rPr>
-      <w:rFonts w:ascii="Georgia" w:cs="Georgia" w:eastAsia="Georgia" w:hAnsi="Georgia"/>
+      <w:rFonts w:ascii="Gelasio" w:cs="Gelasio" w:eastAsia="Gelasio" w:hAnsi="Gelasio"/>
       <w:i/>
       <w:iCs/>
       <w:color w:val="8A8A8A"/>
@@ -26757,7 +26757,7 @@
       <w:jc w:val="both"/>
     </w:pPr>
     <w:rPr>
-      <w:rFonts w:ascii="Georgia" w:cs="Georgia" w:eastAsia="Georgia" w:hAnsi="Georgia"/>
+      <w:rFonts w:ascii="Gelasio" w:cs="Gelasio" w:eastAsia="Gelasio" w:hAnsi="Gelasio"/>
       <w:color w:val="2B2B2B"/>
       <w:sz w:val="22"/>
       <w:szCs w:val="22"/>
@@ -26776,7 +26776,7 @@
       <w:spacing w:after="100" w:before="260"/>
     </w:pPr>
     <w:rPr>
-      <w:rFonts w:ascii="Georgia" w:cs="Georgia" w:eastAsia="Georgia" w:hAnsi="Georgia"/>
+      <w:rFonts w:ascii="Gelasio" w:cs="Gelasio" w:eastAsia="Gelasio" w:hAnsi="Gelasio"/>
       <w:b/>
       <w:bCs/>
       <w:color w:val="3D5A6C"/>
@@ -26793,7 +26793,7 @@
       <w:ind w:right="700"/>
     </w:pPr>
     <w:rPr>
-      <w:rFonts w:ascii="Georgia" w:cs="Georgia" w:eastAsia="Georgia" w:hAnsi="Georgia"/>
+      <w:rFonts w:ascii="Gelasio" w:cs="Gelasio" w:eastAsia="Gelasio" w:hAnsi="Gelasio"/>
       <w:b/>
       <w:bCs/>
       <w:color w:val="2B2B2B"/>
@@ -26810,7 +26810,7 @@
       <w:ind w:left="280" w:right="700"/>
     </w:pPr>
     <w:rPr>
-      <w:rFonts w:ascii="Georgia" w:cs="Georgia" w:eastAsia="Georgia" w:hAnsi="Georgia"/>
+      <w:rFonts w:ascii="Gelasio" w:cs="Gelasio" w:eastAsia="Gelasio" w:hAnsi="Gelasio"/>
       <w:color w:val="2B2B2B"/>
       <w:sz w:val="21"/>
       <w:szCs w:val="21"/>

</xml_diff>

<commit_message>
Reconstrucción tras ajustar el largo de los capítulos 3, 7 y 16
PDF, DOCX y EPUB reconstruidos; lector al día (45 secciones, 1230
bloques). README punto 53 y ESTADO.md con las cifras nuevas y la
decisión sobre el largo de los capítulos.

187 páginas (183 de cuerpo), TOC 43/43 estable, 0 problemas.

Co-Authored-By: Claude Opus 5.5 <noreply@anthropic.com>
Claude-Session: https://claude.ai/code/session_01SPkhDdVzUCxJwqq61ddeLW
</commit_message>
<xml_diff>
--- a/Hechos_inferencias_incertidumbre_edicion_revisada.docx
+++ b/Hechos_inferencias_incertidumbre_edicion_revisada.docx
@@ -351,7 +351,7 @@
         <w:rPr>
           <w:color w:val="8A8A8A"/>
         </w:rPr>
-        <w:t xml:space="preserve">22</w:t>
+        <w:t xml:space="preserve">23</w:t>
       </w:r>
     </w:p>
     <w:p>
@@ -372,7 +372,7 @@
         <w:rPr>
           <w:color w:val="8A8A8A"/>
         </w:rPr>
-        <w:t xml:space="preserve">27</w:t>
+        <w:t xml:space="preserve">28</w:t>
       </w:r>
     </w:p>
     <w:p>
@@ -393,7 +393,7 @@
         <w:rPr>
           <w:color w:val="8A8A8A"/>
         </w:rPr>
-        <w:t xml:space="preserve">29</w:t>
+        <w:t xml:space="preserve">30</w:t>
       </w:r>
     </w:p>
     <w:p>
@@ -414,7 +414,7 @@
         <w:rPr>
           <w:color w:val="8A8A8A"/>
         </w:rPr>
-        <w:t xml:space="preserve">30</w:t>
+        <w:t xml:space="preserve">31</w:t>
       </w:r>
     </w:p>
     <w:p>
@@ -435,7 +435,7 @@
         <w:rPr>
           <w:color w:val="8A8A8A"/>
         </w:rPr>
-        <w:t xml:space="preserve">36</w:t>
+        <w:t xml:space="preserve">37</w:t>
       </w:r>
     </w:p>
     <w:p>
@@ -456,7 +456,7 @@
         <w:rPr>
           <w:color w:val="8A8A8A"/>
         </w:rPr>
-        <w:t xml:space="preserve">40</w:t>
+        <w:t xml:space="preserve">41</w:t>
       </w:r>
     </w:p>
     <w:p>
@@ -477,7 +477,7 @@
         <w:rPr>
           <w:color w:val="8A8A8A"/>
         </w:rPr>
-        <w:t xml:space="preserve">44</w:t>
+        <w:t xml:space="preserve">45</w:t>
       </w:r>
     </w:p>
     <w:p>
@@ -498,7 +498,7 @@
         <w:rPr>
           <w:color w:val="8A8A8A"/>
         </w:rPr>
-        <w:t xml:space="preserve">49</w:t>
+        <w:t xml:space="preserve">50</w:t>
       </w:r>
     </w:p>
     <w:p>
@@ -519,7 +519,7 @@
         <w:rPr>
           <w:color w:val="8A8A8A"/>
         </w:rPr>
-        <w:t xml:space="preserve">51</w:t>
+        <w:t xml:space="preserve">52</w:t>
       </w:r>
     </w:p>
     <w:p>
@@ -540,7 +540,7 @@
         <w:rPr>
           <w:color w:val="8A8A8A"/>
         </w:rPr>
-        <w:t xml:space="preserve">52</w:t>
+        <w:t xml:space="preserve">53</w:t>
       </w:r>
     </w:p>
     <w:p>
@@ -561,7 +561,7 @@
         <w:rPr>
           <w:color w:val="8A8A8A"/>
         </w:rPr>
-        <w:t xml:space="preserve">56</w:t>
+        <w:t xml:space="preserve">57</w:t>
       </w:r>
     </w:p>
     <w:p>
@@ -582,7 +582,7 @@
         <w:rPr>
           <w:color w:val="8A8A8A"/>
         </w:rPr>
-        <w:t xml:space="preserve">62</w:t>
+        <w:t xml:space="preserve">63</w:t>
       </w:r>
     </w:p>
     <w:p>
@@ -603,7 +603,7 @@
         <w:rPr>
           <w:color w:val="8A8A8A"/>
         </w:rPr>
-        <w:t xml:space="preserve">67</w:t>
+        <w:t xml:space="preserve">68</w:t>
       </w:r>
     </w:p>
     <w:p>
@@ -624,7 +624,7 @@
         <w:rPr>
           <w:color w:val="8A8A8A"/>
         </w:rPr>
-        <w:t xml:space="preserve">71</w:t>
+        <w:t xml:space="preserve">72</w:t>
       </w:r>
     </w:p>
     <w:p>
@@ -645,7 +645,7 @@
         <w:rPr>
           <w:color w:val="8A8A8A"/>
         </w:rPr>
-        <w:t xml:space="preserve">77</w:t>
+        <w:t xml:space="preserve">78</w:t>
       </w:r>
     </w:p>
     <w:p>
@@ -666,7 +666,7 @@
         <w:rPr>
           <w:color w:val="8A8A8A"/>
         </w:rPr>
-        <w:t xml:space="preserve">81</w:t>
+        <w:t xml:space="preserve">82</w:t>
       </w:r>
     </w:p>
     <w:p>
@@ -687,7 +687,7 @@
         <w:rPr>
           <w:color w:val="8A8A8A"/>
         </w:rPr>
-        <w:t xml:space="preserve">83</w:t>
+        <w:t xml:space="preserve">84</w:t>
       </w:r>
     </w:p>
     <w:p>
@@ -708,7 +708,7 @@
         <w:rPr>
           <w:color w:val="8A8A8A"/>
         </w:rPr>
-        <w:t xml:space="preserve">84</w:t>
+        <w:t xml:space="preserve">85</w:t>
       </w:r>
     </w:p>
     <w:p>
@@ -729,7 +729,7 @@
         <w:rPr>
           <w:color w:val="8A8A8A"/>
         </w:rPr>
-        <w:t xml:space="preserve">90</w:t>
+        <w:t xml:space="preserve">91</w:t>
       </w:r>
     </w:p>
     <w:p>
@@ -750,7 +750,7 @@
         <w:rPr>
           <w:color w:val="8A8A8A"/>
         </w:rPr>
-        <w:t xml:space="preserve">99</w:t>
+        <w:t xml:space="preserve">98</w:t>
       </w:r>
     </w:p>
     <w:p>
@@ -771,7 +771,7 @@
         <w:rPr>
           <w:color w:val="8A8A8A"/>
         </w:rPr>
-        <w:t xml:space="preserve">106</w:t>
+        <w:t xml:space="preserve">105</w:t>
       </w:r>
     </w:p>
     <w:p>
@@ -792,7 +792,7 @@
         <w:rPr>
           <w:color w:val="8A8A8A"/>
         </w:rPr>
-        <w:t xml:space="preserve">115</w:t>
+        <w:t xml:space="preserve">114</w:t>
       </w:r>
     </w:p>
     <w:p>
@@ -813,7 +813,7 @@
         <w:rPr>
           <w:color w:val="8A8A8A"/>
         </w:rPr>
-        <w:t xml:space="preserve">119</w:t>
+        <w:t xml:space="preserve">118</w:t>
       </w:r>
     </w:p>
     <w:p>
@@ -834,7 +834,7 @@
         <w:rPr>
           <w:color w:val="8A8A8A"/>
         </w:rPr>
-        <w:t xml:space="preserve">127</w:t>
+        <w:t xml:space="preserve">126</w:t>
       </w:r>
     </w:p>
     <w:p>
@@ -855,7 +855,7 @@
         <w:rPr>
           <w:color w:val="8A8A8A"/>
         </w:rPr>
-        <w:t xml:space="preserve">130</w:t>
+        <w:t xml:space="preserve">129</w:t>
       </w:r>
     </w:p>
     <w:p>
@@ -876,7 +876,7 @@
         <w:rPr>
           <w:color w:val="8A8A8A"/>
         </w:rPr>
-        <w:t xml:space="preserve">132</w:t>
+        <w:t xml:space="preserve">131</w:t>
       </w:r>
     </w:p>
     <w:p>
@@ -897,7 +897,7 @@
         <w:rPr>
           <w:color w:val="8A8A8A"/>
         </w:rPr>
-        <w:t xml:space="preserve">134</w:t>
+        <w:t xml:space="preserve">133</w:t>
       </w:r>
     </w:p>
     <w:p>
@@ -918,7 +918,7 @@
         <w:rPr>
           <w:color w:val="8A8A8A"/>
         </w:rPr>
-        <w:t xml:space="preserve">136</w:t>
+        <w:t xml:space="preserve">135</w:t>
       </w:r>
     </w:p>
     <w:p>
@@ -939,7 +939,7 @@
         <w:rPr>
           <w:color w:val="8A8A8A"/>
         </w:rPr>
-        <w:t xml:space="preserve">139</w:t>
+        <w:t xml:space="preserve">138</w:t>
       </w:r>
     </w:p>
     <w:p>
@@ -960,7 +960,7 @@
         <w:rPr>
           <w:color w:val="8A8A8A"/>
         </w:rPr>
-        <w:t xml:space="preserve">150</w:t>
+        <w:t xml:space="preserve">149</w:t>
       </w:r>
     </w:p>
     <w:p>
@@ -981,7 +981,7 @@
         <w:rPr>
           <w:color w:val="8A8A8A"/>
         </w:rPr>
-        <w:t xml:space="preserve">155</w:t>
+        <w:t xml:space="preserve">154</w:t>
       </w:r>
     </w:p>
     <w:p>
@@ -1002,7 +1002,7 @@
         <w:rPr>
           <w:color w:val="8A8A8A"/>
         </w:rPr>
-        <w:t xml:space="preserve">162</w:t>
+        <w:t xml:space="preserve">161</w:t>
       </w:r>
     </w:p>
     <w:p>
@@ -1023,7 +1023,7 @@
         <w:rPr>
           <w:color w:val="8A8A8A"/>
         </w:rPr>
-        <w:t xml:space="preserve">167</w:t>
+        <w:t xml:space="preserve">166</w:t>
       </w:r>
     </w:p>
     <w:p>
@@ -1044,7 +1044,7 @@
         <w:rPr>
           <w:color w:val="8A8A8A"/>
         </w:rPr>
-        <w:t xml:space="preserve">168</w:t>
+        <w:t xml:space="preserve">167</w:t>
       </w:r>
     </w:p>
     <w:p>
@@ -1065,7 +1065,7 @@
         <w:rPr>
           <w:color w:val="8A8A8A"/>
         </w:rPr>
-        <w:t xml:space="preserve">170</w:t>
+        <w:t xml:space="preserve">169</w:t>
       </w:r>
     </w:p>
     <w:p>
@@ -1086,7 +1086,7 @@
         <w:rPr>
           <w:color w:val="8A8A8A"/>
         </w:rPr>
-        <w:t xml:space="preserve">184</w:t>
+        <w:t xml:space="preserve">183</w:t>
       </w:r>
     </w:p>
     <w:p>
@@ -3584,6 +3584,15 @@
     </w:p>
     <w:p>
       <w:pPr>
+        <w:pStyle w:val="BodyJ"/>
+        <w:keepNext w:val="false"/>
+      </w:pPr>
+      <w:r>
+        <w:t xml:space="preserve">Esa relación puede medirse, aunque todavía con instrumentos toscos. Gerrity y colaboradores construyeron en 1990 una escala de las reacciones de los médicos ante la incertidumbre, con dos dimensiones que cualquier clínico reconoce: el estrés que produce y la renuencia a revelarla a otros (Gerrity et al., 1990). En veinte internistas de una misma clínica, cada desviación estándar más de ansiedad ante la incertidumbre se asoció con un 17% más de gasto facturado en los treinta días siguientes a la consulta, y la renuencia a revelarla, con un 12% más (Allison et al., 1998). Es un estudio pequeño, y las revisiones posteriores describen una literatura heterogénea y de baja calidad metodológica. Lo más constante que encuentran es otra cosa: la asociación entre la baja tolerancia a la incertidumbre y el malestar del propio médico (Strout et al., 2018; Hancock &amp; Mattick, 2020). La lectura prudente es doble. La incertidumbre mal tolerada cuesta exámenes, y también cuesta salud, empezando por la de quien la carga.</w:t>
+      </w:r>
+    </w:p>
+    <w:p>
+      <w:pPr>
         <w:pStyle w:val="Heading3"/>
         <w:keepNext/>
         <w:keepLines/>
@@ -3691,6 +3700,80 @@
       </w:pPr>
       <w:r>
         <w:t xml:space="preserve">La incertidumbre más importante no siempre es la mayor. Una duda pequeña puede dominar la decisión si el error asociado es catastrófico. Por el contrario, una amplia incertidumbre etiológica puede ser tolerable cuando varias explicaciones comparten el mismo manejo inicial.</w:t>
+      </w:r>
+    </w:p>
+    <w:p>
+      <w:pPr>
+        <w:pStyle w:val="Heading3"/>
+        <w:keepNext/>
+        <w:keepLines/>
+        <w:spacing w:after="120" w:before="280"/>
+      </w:pPr>
+      <w:r>
+        <w:rPr>
+          <w:rFonts w:ascii="Gelasio" w:cs="Gelasio" w:eastAsia="Gelasio" w:hAnsi="Gelasio"/>
+          <w:b/>
+          <w:bCs/>
+          <w:color w:val="2B2B2B"/>
+          <w:sz w:val="25"/>
+          <w:szCs w:val="25"/>
+        </w:rPr>
+        <w:t xml:space="preserve">La incertidumbre de la evidencia</w:t>
+      </w:r>
+    </w:p>
+    <w:p>
+      <w:pPr>
+        <w:pStyle w:val="BodyJ"/>
+        <w:keepNext w:val="false"/>
+      </w:pPr>
+      <w:r>
+        <w:t xml:space="preserve">Hay una incertidumbre que el clínico no produce ni puede reducir junto a la cama: la que trae la evidencia misma. Para ella existe un léxico formal. El sistema GRADE califica la certeza de un conjunto de estudios en cuatro niveles —alta, moderada, baja y muy baja—; los ensayos aleatorizados parten en alta y los estudios observacionales en baja, y la calificación baja por riesgo de sesgo, imprecisión, inconsistencia, evidencia indirecta o sesgo de publicación (Balshem et al., 2011). El propio grupo cambió de palabra con los años: empezó hablando de «calidad de la evidencia», pasó a «confianza en las estimaciones» y hoy prefiere «certeza» (Hultcrantz et al., 2017).</w:t>
+      </w:r>
+    </w:p>
+    <w:p>
+      <w:pPr>
+        <w:pStyle w:val="BodyJ"/>
+        <w:keepNext w:val="false"/>
+      </w:pPr>
+      <w:r>
+        <w:t xml:space="preserve">El cambio no es cosmético. GRADE define hoy la certeza como la seguridad de que el efecto verdadero queda a un lado de un umbral elegido, y de eso se sigue algo que sorprende a quien lo oye por primera vez: la misma evidencia puede dar certeza alta en un contexto y baja en otro. En un ejemplo del propio grupo, un fármaco que evita una muerte por cada cien pacientes al año cruza con holgura el umbral de un país rico y puede quedar lejos del de uno pobre, donde el costo de oportunidad exige un efecto mucho mayor (Hultcrantz et al., 2017). La certeza de la evidencia, como la del clínico, se mide contra una decisión: es el umbral del capítulo 10 aplicado a la literatura. Y es, a la vez, un léxico de certeza con definiciones explícitas, que es lo que el Apéndice B propone para la frase clínica. Cuando una guía dice «certeza baja», no dice que el tratamiento no sirva; dice cuánta confianza merece la estimación de su efecto. La ficha debería poder decir lo mismo de una inferencia.</w:t>
+      </w:r>
+    </w:p>
+    <w:p>
+      <w:pPr>
+        <w:pStyle w:val="Heading3"/>
+        <w:keepNext/>
+        <w:keepLines/>
+        <w:spacing w:after="120" w:before="280"/>
+      </w:pPr>
+      <w:r>
+        <w:rPr>
+          <w:rFonts w:ascii="Gelasio" w:cs="Gelasio" w:eastAsia="Gelasio" w:hAnsi="Gelasio"/>
+          <w:b/>
+          <w:bCs/>
+          <w:color w:val="2B2B2B"/>
+          <w:sz w:val="25"/>
+          <w:szCs w:val="25"/>
+        </w:rPr>
+        <w:t xml:space="preserve">La incertidumbre del otro lado de la cama</w:t>
+      </w:r>
+    </w:p>
+    <w:p>
+      <w:pPr>
+        <w:pStyle w:val="BodyJ"/>
+        <w:keepNext w:val="false"/>
+      </w:pPr>
+      <w:r>
+        <w:t xml:space="preserve">La pregunta de la familia de Carmen —«¿ya saben qué tuvo?»— no es la misma que se hace el equipo. La enfermería tiene para esto una teoría propia. Merle Mishel definió la incertidumbre de la enfermedad como la incapacidad de determinar el significado de los hechos relacionados con ella, y la descompuso en percepciones que cualquier paciente reconoce: síntomas ambiguos, tratamientos complejos, información insuficiente y un curso imprevisible. La misma incertidumbre, sostuvo, puede vivirse como amenaza o como oportunidad (Mishel, 1988). Más tarde agregó que en la enfermedad crónica, donde la incertidumbre no termina, la tarea no es resolverla sino aprender a vivir con ella (Mishel, 1990).</w:t>
+      </w:r>
+    </w:p>
+    <w:p>
+      <w:pPr>
+        <w:pStyle w:val="BodyJ"/>
+        <w:keepNext w:val="false"/>
+      </w:pPr>
+      <w:r>
+        <w:t xml:space="preserve">El mapa del paciente y el del médico rara vez coinciden. Para el equipo, la duda decisiva sobre Carmen era la pequeña con consecuencias graves: un asa que volviera a atascarse sin aviso. Para la familia era otra: si volvería a la casa, cuándo y en qué condiciones. Ninguna de las dos es más verdadera, pero una nota que sólo registra la primera cartografía está incompleta, y una conversación que sólo responde la primera deja sin contestar lo que la familia preguntaba. Lo que más alivia, como cuenta el capítulo 15, no es la certeza que no hay, sino convertir lo imprevisible en un plan: qué se vigila, cuándo se sabrá más y qué hará cambiar de rumbo. Eso no elimina la incertidumbre del paciente; le devuelve algo que hacer con ella.</w:t>
       </w:r>
     </w:p>
     <w:p>
@@ -6111,7 +6194,7 @@
         <w:keepNext w:val="false"/>
       </w:pPr>
       <w:r>
-        <w:t xml:space="preserve">Los estudios de errores diagnósticos muestran combinaciones de fallas en historia, examen, interpretación, seguimiento y comunicación (Graber et al., 2005; Schiff et al., 2009). Su magnitud ya no es una conjetura de pasillo. En 29 hospitales académicos de Estados Unidos, la revisión de las fichas de adultos que murieron o fueron trasladados a cuidados intensivos encontró un error diagnóstico en el 23% de ellos, y en el 6,6% de los fallecidos los revisores juzgaron que el error contribuyó a la muerte; las fallas que más pesaban eran las de la evaluación del paciente y las de la solicitud e interpretación de exámenes (Auerbach et al., 2024). Una estimación nacional, construida con modelos y no con un recuento, calculó en ese país unas 795.000 personas muertas o con discapacidad permanente cada año por errores diagnósticos en enfermedades graves, con un rango plausible de 598.000 a 1.023.000 (Newman-Toker et al., 2024). Las National Academies definieron el diagnóstico como un proceso iterativo y de equipo, no como un acto mental instantáneo (National Academies of Sciences, Engineering, and Medicine, 2015). El error debe reconstruirse como trayectoria: qué información existía, quién la recibió, cómo fue representada, qué decisiones se tomaron, qué feedback faltó y cuándo habría sido posible corregir.</w:t>
+        <w:t xml:space="preserve">Los estudios de errores diagnósticos muestran combinaciones de fallas en historia, examen, interpretación, seguimiento y comunicación (Graber et al., 2005; Schiff et al., 2009). Su magnitud ya no es una conjetura de pasillo. En 29 hospitales académicos de Estados Unidos, la revisión de las fichas de adultos que murieron o fueron trasladados a cuidados intensivos encontró un error diagnóstico en el 23% de ellos, y en el 6,6% de los fallecidos los revisores juzgaron que el error contribuyó a la muerte; las fallas que más pesaban eran las de la evaluación del paciente y las de la solicitud e interpretación de exámenes (Auerbach et al., 2024). Una estimación nacional, construida con modelos y no con un recuento, calculó en ese país unas 795.000 personas muertas o con discapacidad permanente cada año por errores diagnósticos en enfermedades graves, con un rango plausible de 598.000 a 1.023.000 (Newman-Toker et al., 2024). Fuera del hospital, una síntesis de tres estudios estimó que al menos uno de cada veinte adultos estadounidenses sufre cada año un error diagnóstico en la atención ambulatoria, y que cerca de la mitad podría ser dañino (Singh et al., 2014). Las National Academies definieron el diagnóstico como un proceso iterativo y de equipo, no como un acto mental instantáneo (National Academies of Sciences, Engineering, and Medicine, 2015). El error debe reconstruirse como trayectoria: qué información existía, quién la recibió, cómo fue representada, qué decisiones se tomaron, qué feedback faltó y cuándo habría sido posible corregir.</w:t>
       </w:r>
     </w:p>
     <w:p>
@@ -6239,6 +6322,43 @@
           <w:sz w:val="25"/>
           <w:szCs w:val="25"/>
         </w:rPr>
+        <w:t xml:space="preserve">Fallas activas y condiciones latentes</w:t>
+      </w:r>
+    </w:p>
+    <w:p>
+      <w:pPr>
+        <w:pStyle w:val="BodyJ"/>
+        <w:keepNext w:val="false"/>
+      </w:pPr>
+      <w:r>
+        <w:t xml:space="preserve">La palabra «trayectoria» no es de este libro. James Reason distinguió dos maneras de mirar el error. El enfoque centrado en la persona se fija en los actos inseguros de quien está en la primera línea y los atribuye a olvido, descuido o falta de atención; el enfoque centrado en el sistema ve los errores como consecuencias más que como causas (Reason, 2000). En el segundo, las fallas activas —los actos inseguros de quien está en contacto directo con el paciente— se combinan con condiciones latentes, «patógenos residentes» que dejaron decisiones de diseño, de gestión o de organización, y que pueden dormir años antes de encontrar su ocasión. Las defensas de un sistema se parecen a lonjas de queso con agujeros que se abren, se cierran y se desplazan, y el accidente ocurre cuando los agujeros de muchas capas se alinean por un momento y dejan pasar una trayectoria (Reason, 2000).</w:t>
+      </w:r>
+    </w:p>
+    <w:p>
+      <w:pPr>
+        <w:pStyle w:val="BodyJ"/>
+        <w:keepNext w:val="false"/>
+      </w:pPr>
+      <w:r>
+        <w:t xml:space="preserve">Leído así, el caso de la colecistitis mezcla las dos cosas. Las fallas activas fueron mías: aceptar la frase heredada, no ponderar la bacteriuria, examinar por trámite, explicar con un lugar común la falta de respuesta. Pero cada una encontró un agujero ya abierto: una hoja de urgencias que transmite diagnósticos como antecedentes, una cultura que tiene frases hechas para justificar la espera y una visita de sala sin criterio de reapertura. Esos agujeros no eran míos en exclusiva, y al día siguiente seguían ahí, esperando al próximo paciente. Por eso la respuesta de Reason no es exhortar a quien se equivocó, sino agregar capas o achicar sus agujeros; el criterio escrito de reevaluación a las 48 horas es una lonja más. La responsabilidad del clínico no desaparece. Lo que cambia es dónde se busca la corrección y quién más tiene que hacerla.</w:t>
+      </w:r>
+    </w:p>
+    <w:p>
+      <w:pPr>
+        <w:pStyle w:val="Heading3"/>
+        <w:keepNext/>
+        <w:keepLines/>
+        <w:spacing w:after="120" w:before="280"/>
+      </w:pPr>
+      <w:r>
+        <w:rPr>
+          <w:rFonts w:ascii="Gelasio" w:cs="Gelasio" w:eastAsia="Gelasio" w:hAnsi="Gelasio"/>
+          <w:b/>
+          <w:bCs/>
+          <w:color w:val="2B2B2B"/>
+          <w:sz w:val="25"/>
+          <w:szCs w:val="25"/>
+        </w:rPr>
         <w:t xml:space="preserve">Sesgo, conocimiento y confianza</w:t>
       </w:r>
     </w:p>
@@ -10734,7 +10854,7 @@
         <w:keepNext w:val="false"/>
       </w:pPr>
       <w:r>
-        <w:t xml:space="preserve">Cuatro líneas, y cada una tiene antepasados. «Crepitaciones» viene de un médico del hospital Necker de París que enrolló un cuaderno para oír un corazón. «Probable» supone que alguien se atrevió a contar enfermos. «Si en 48 horas no mejora» resume una larga discusión sobre cómo se pone a prueba una hipótesis y cuánta evidencia basta para actuar. Y la última frase, la que muchas notas omiten, entró a la medicina contra la resistencia del modelo que gobernaba todo lo demás. Antes de que el capítulo siguiente condense el libro en un método, éste recorre esa genealogía. No es una historia de la medicina ni un panteón; es una pregunta más estrecha. Quiénes separaron cada una de las capas que HII-D pide distinguir, en qué medicina lo hicieron, qué tan originales fueron y en qué se equivocaron. La respuesta tiene una moraleja que conviene adelantar: ninguna de las capas es nueva, y casi ninguno de los que las separaron fue el primero en verlas. Lo que dejaron fue otra cosa.</w:t>
+        <w:t xml:space="preserve">Cada línea tiene antepasados. «Crepitaciones» viene de un médico que enrolló un cuaderno para oír un corazón; «probable», de alguien que se atrevió a contar enfermos; «si en 48 horas no mejora», de una larga discusión sobre cómo se pone a prueba una hipótesis y cuánta evidencia basta para actuar. La última frase, la que muchas notas omiten, entró a la medicina contra el modelo que gobernaba todo lo demás. Antes de que el capítulo siguiente condense el libro en un método, éste pregunta quiénes separaron cada una de sus capas, en qué medicina lo hicieron, qué tan originales fueron y en qué se equivocaron. La respuesta, adelantada: ninguna capa es nueva, y casi nadie fue el primero en verla. Lo que dejaron fue otra cosa.</w:t>
       </w:r>
     </w:p>
     <w:p>
@@ -10762,16 +10882,7 @@
         <w:keepNext w:val="false"/>
       </w:pPr>
       <w:r>
-        <w:t xml:space="preserve">La medicina hipocrática —un conjunto de escritos griegos de los siglos V y IV antes de nuestra era, de varios autores, reunidos bajo el nombre de un médico de Cos— nació contra un competidor que hoy cuesta imaginar: la explicación divina. El tratado sobre la llamada enfermedad sagrada, la epilepsia, abre con una declaración de método. No le parece más divina ni más sagrada que las otras enfermedades: tiene una causa natural, y su supuesto origen divino se debe a la inexperiencia de los hombres y a su asombro ante lo que no entienden (Hipócrates, 1923b). Es una de las separaciones de capas más antiguas que conserva la medicina escrita. Las convulsiones quedan de un lado; la inferencia que las atribuía a los dioses, del otro, desacreditada por falta de razones.</w:t>
-      </w:r>
-    </w:p>
-    <w:p>
-      <w:pPr>
-        <w:pStyle w:val="BodyJ"/>
-        <w:keepNext w:val="false"/>
-      </w:pPr>
-      <w:r>
-        <w:t xml:space="preserve">El libro I de las </w:t>
+        <w:t xml:space="preserve">La medicina hipocrática —escritos griegos de los siglos V y IV antes de nuestra era, de varios autores, reunidos bajo el nombre de un médico de Cos— nació contra la explicación divina. El tratado sobre la llamada enfermedad sagrada, la epilepsia, abre negando que sea más divina que las otras: tiene una causa natural, y su supuesto origen divino se debe a la inexperiencia y al asombro de los hombres (Hipócrates, 1923b). Las convulsiones quedan de un lado; la inferencia que las atribuía a los dioses, del otro, sin razones que la sostengan. Las </w:t>
       </w:r>
       <w:r>
         <w:rPr>
@@ -10781,26 +10892,26 @@
         <w:t xml:space="preserve">Epidemias</w:t>
       </w:r>
       <w:r>
-        <w:t xml:space="preserve"> contiene una fórmula que podría servir de epígrafe a este libro: declarar el pasado, diagnosticar el presente, predecir el futuro; y frente a las enfermedades, acostumbrarse a dos cosas, ayudar o no dañar (Hipócrates, 1923a, p. 165). Están ahí, en germen, las cuatro capas: lo que ocurrió, lo que se infiere de ello, lo que viene —que siempre es incierto— y lo que se hace. La decisión ya trae su asimetría, y la tradición la endureció en un latín que no escribió ningún griego. </w:t>
-      </w:r>
-      <w:r>
-        <w:rPr>
-          <w:i/>
-          <w:iCs/>
-        </w:rPr>
-        <w:t xml:space="preserve">Primum non nocere</w:t>
-      </w:r>
-      <w:r>
-        <w:t xml:space="preserve"> no es de Hipócrates ni de Galeno; la fórmula latina aparece impresa recién en el siglo XIX (Smith, 2005).</w:t>
-      </w:r>
-    </w:p>
-    <w:p>
-      <w:pPr>
-        <w:pStyle w:val="BodyJ"/>
-        <w:keepNext w:val="false"/>
-      </w:pPr>
-      <w:r>
-        <w:t xml:space="preserve">Los libros I y III de las </w:t>
+        <w:t xml:space="preserve"> agregan una fórmula que podría ser el epígrafe de este libro: declarar el pasado, diagnosticar el presente, predecir el futuro y, frente a las enfermedades, ayudar o no dañar (Hipócrates, 1923a, p. 165). Ahí están, en germen, las cuatro capas. El </w:t>
+      </w:r>
+      <w:r>
+        <w:rPr>
+          <w:i/>
+          <w:iCs/>
+        </w:rPr>
+        <w:t xml:space="preserve">primum non nocere</w:t>
+      </w:r>
+      <w:r>
+        <w:t xml:space="preserve"> que suele atribuírseles no es de Hipócrates ni de Galeno: la fórmula latina aparece impresa recién en el siglo XIX (Smith, 2005).</w:t>
+      </w:r>
+    </w:p>
+    <w:p>
+      <w:pPr>
+        <w:pStyle w:val="BodyJ"/>
+        <w:keepNext w:val="false"/>
+      </w:pPr>
+      <w:r>
+        <w:t xml:space="preserve">Las mismas </w:t>
       </w:r>
       <w:r>
         <w:rPr>
@@ -10810,25 +10921,16 @@
         <w:t xml:space="preserve">Epidemias</w:t>
       </w:r>
       <w:r>
-        <w:t xml:space="preserve"> reúnen además cuarenta y dos historias clínicas escritas día por día, de las que veinticinco terminan en la muerte. El tratamiento casi no aparece: el autor no quería mostrar cómo curar, sino descubrir la secuencia de los síntomas (Hipócrates, 1923a, p. 144). Su traductor inglés llamó a esos dos libros el producto más notable de la ciencia griega (Hipócrates, 1923a, p. 141), y vale la pena mirar lo que no hacen: no seleccionan los éxitos. Una casuística con casi 60% de muertes es lo contrario de la que publica quien quiere demostrar que su tratamiento sirve. La honestidad que el capítulo 13 le pide a la ficha tiene antecedentes más viejos que el papel. Y la incertidumbre también: dos milenios después, Osler abrió su tratado de medicina con el primer aforismo hipocrático, «la experiencia es falaz y el juicio, difícil» (Osler, 1892).</w:t>
-      </w:r>
-    </w:p>
-    <w:p>
-      <w:pPr>
-        <w:pStyle w:val="BodyJ"/>
-        <w:keepNext w:val="false"/>
-      </w:pPr>
-      <w:r>
-        <w:t xml:space="preserve">Galeno, médico griego del siglo II en la Roma imperial y médico de la corte de Marco Aurelio, heredó una disputa que es todavía la nuestra. Los «empíricos» trataban por semejanza con casos anteriores, sin comprometerse con ninguna teoría sobre el interior del cuerpo; los «racionalistas» razonaban desde la fisiología. Galeno concedía a los primeros que la experiencia sola acierta en muchos casos, y que entre ser un empírico puro y adoptar una teoría errónea había que preferir infinitamente lo primero. Pero sostenía que conocer el interior del cuerpo permite distinguir enfermedades de síntomas parecidos allí donde el empírico se equivoca (Singer, 2024). Es la tensión entre reconocimiento de patrones y razonamiento causal del capítulo 6, dieciocho siglos antes.</w:t>
-      </w:r>
-    </w:p>
-    <w:p>
-      <w:pPr>
-        <w:pStyle w:val="BodyJ"/>
-        <w:keepNext w:val="false"/>
-      </w:pPr>
-      <w:r>
-        <w:t xml:space="preserve">Galeno disecaba y experimentaba —ligó la médula espinal de cerdos vivos para mostrar que el cerebro gobierna el habla y el movimiento—, pero en su época sólo se disecaban animales (Singer, 2024). Su anatomía humana fue en parte una anatomía de animales, y el error que importa aquí no fue suyo, sino de quienes vinieron después. Su obra fue la anatomía de Occidente durante más de mil años. Cuando en una disección medieval el cadáver no coincidía con Galeno, se declaraba anormal al cadáver; Vesalio, que en 1543 publicaría la obra que empezó a corregirlo, confesaba años antes que discutir su autoridad le daba casi tanto miedo como dudar de la inmortalidad del alma (Xiang &amp; Venkatesan, 2023). Es la forma extrema de la frase heredada del capítulo 7: una afirmación tan autorizada que el hecho que la contradice se reclasifica como anomalía.</w:t>
+        <w:t xml:space="preserve"> reúnen cuarenta y dos historias clínicas escritas día por día, de las que veinticinco terminan en la muerte; el autor no quería mostrar cómo curar, sino descubrir la secuencia de los síntomas (Hipócrates, 1923a, p. 144). Una casuística con casi 60% de muertes es lo contrario de la que publica quien quiere probar que su tratamiento sirve: la honestidad que el capítulo 13 le pide a la ficha es más vieja que el papel. La incertidumbre también lo es. Osler abrió su tratado de medicina con el primer aforismo hipocrático: «la experiencia es falaz y el juicio, difícil» (Osler, 1892).</w:t>
+      </w:r>
+    </w:p>
+    <w:p>
+      <w:pPr>
+        <w:pStyle w:val="BodyJ"/>
+        <w:keepNext w:val="false"/>
+      </w:pPr>
+      <w:r>
+        <w:t xml:space="preserve">Galeno, médico griego del siglo II en la Roma imperial, heredó una disputa que sigue siendo la nuestra. Los «empíricos» trataban por semejanza con casos anteriores, sin ninguna teoría sobre el interior del cuerpo; los «racionalistas» razonaban desde la fisiología. Galeno concedía que la experiencia sola acierta en muchos casos y que es preferible a una teoría errónea, pero sostenía que conocer el interior del cuerpo permite distinguir enfermedades de síntomas parecidos allí donde el empírico se equivoca (Singer, 2024). Es la tensión entre reconocimiento de patrones y razonamiento causal del capítulo 6. En su época sólo se disecaban animales (Singer, 2024), y su anatomía, en parte animal, fue la de Occidente durante más de mil años. El error que importa no fue tanto suyo como de quienes vinieron después: cuando en una disección medieval el cadáver no coincidía con Galeno, se declaraba anormal al cadáver (Xiang &amp; Venkatesan, 2023). Es la forma extrema de la frase heredada del capítulo 7: una afirmación tan autorizada que el hecho que la contradice se reclasifica como anomalía.</w:t>
       </w:r>
     </w:p>
     <w:p>
@@ -10856,25 +10958,16 @@
         <w:keepNext w:val="false"/>
       </w:pPr>
       <w:r>
-        <w:t xml:space="preserve">En el París que siguió a la Revolución, una generación de médicos —Bichat, Corvisart, Bayle— se propuso correlacionar lo que se observaba junto a la cama con lo que mostraba la mesa de autopsias (Roguin, 2006). Foucault, citado en el capítulo 4, leyó ahí el nacimiento de una mirada. René Laennec cuenta su parte con sencillez. En 1816 lo consultó una joven con síntomas de enfermedad cardiaca, en quien la palpación y la percusión servían de poco por su gordura, y cuya edad y sexo le impedían apoyar la oreja en su pecho. Recordó un fenómeno acústico conocido —el golpe de alfiler que se oye en el otro extremo de una viga—, enrolló un cuaderno de papel y oyó el corazón de una manera mucho más neta y distinta que nunca antes. De inmediato empezó una serie de observaciones en el hospital Necker (Laennec, 1819, pp. 7–8).</w:t>
-      </w:r>
-    </w:p>
-    <w:p>
-      <w:pPr>
-        <w:pStyle w:val="BodyJ"/>
-        <w:keepNext w:val="false"/>
-      </w:pPr>
-      <w:r>
-        <w:t xml:space="preserve">Su originalidad no fue el instrumento. La auscultación directa se conocía desde los hipocráticos, y Corvisart había traducido en 1808 la percusión de Auenbrugger (Roguin, 2006). Fue el método que lo rodeó: cada sonido se describió, se nombró y se confrontó con la lesión que mostraba la autopsia. Para Laennec, la anatomía patológica era «la antorcha más segura que puede guiar al médico» (Laennec, 1819, p. xxi). El signo valía porque existía un patrón de referencia capaz de desmentirlo.</w:t>
-      </w:r>
-    </w:p>
-    <w:p>
-      <w:pPr>
-        <w:pStyle w:val="BodyJ"/>
-        <w:keepNext w:val="false"/>
-      </w:pPr>
-      <w:r>
-        <w:t xml:space="preserve">Así nació un vocabulario que todavía usamos. Al ruido de la neumonía inicial lo comparó con el de la sal que crepita cuando se la calienta en una vasija. Lo llamó </w:t>
+        <w:t xml:space="preserve">En el París posterior a la Revolución, una generación de médicos se propuso correlacionar lo que se oía y se veía junto a la cama con lo que mostraba la autopsia (Roguin, 2006). René Laennec cuenta su parte con sencillez. En 1816, ante una joven con síntomas cardiacos, a quien la gordura volvía inútil la percusión y cuya edad y sexo le impedían apoyar la oreja en su pecho, recordó que un golpe de alfiler se oye en el otro extremo de una viga, enrolló un cuaderno de papel y oyó el corazón como nunca antes (Laennec, 1819, pp. 7–8). Lo original no fue el instrumento —la auscultación directa se conocía desde los hipocráticos (Roguin, 2006)—, sino el método: cada sonido se describió, se nombró y se confrontó con la lesión de la autopsia, que para él era «la antorcha más segura que puede guiar al médico» (Laennec, 1819, p. xxi).</w:t>
+      </w:r>
+    </w:p>
+    <w:p>
+      <w:pPr>
+        <w:pStyle w:val="BodyJ"/>
+        <w:keepNext w:val="false"/>
+      </w:pPr>
+      <w:r>
+        <w:t xml:space="preserve">Al ruido de la neumonía inicial lo llamó </w:t>
       </w:r>
       <w:r>
         <w:rPr>
@@ -10884,35 +10977,16 @@
         <w:t xml:space="preserve">râle crépitant</w:t>
       </w:r>
       <w:r>
-        <w:t xml:space="preserve"> y escribió que era el signo patognomónico del primer grado de la neumonía: «sería difícil describirlo mejor; pero basta haberlo oído una sola vez para no desconocerlo nunca más» (Laennec, 1819, p. 172). La frase contiene, sin proponérselo, dos lecciones de este libro. La segunda mitad es conocimiento tácito en estado puro (capítulo 6): el hecho auscultatorio se aprende oyendo, no leyendo. La primera es un exceso. Las crepitaciones se oyen también en la insuficiencia cardiaca y en la fibrosis pulmonar, y ningún clínico de hoy las llamaría patognomónicas. El fundador del hecho auscultatorio le asignó más fuerza inferencial de la que tenía. Murió a los cuarenta y cinco años, de la tuberculosis que había enseñado a reconocer (Roguin, 2006).</w:t>
-      </w:r>
-    </w:p>
-    <w:p>
-      <w:pPr>
-        <w:pStyle w:val="BodyJ"/>
-        <w:keepNext w:val="false"/>
-      </w:pPr>
-      <w:r>
-        <w:t xml:space="preserve">Lo que sobrevive de Laennec es la idea de que un hecho clínico se produce: hacen falta un instrumento, un oído entrenado y un patrón de referencia contra el cual calibrarlos. Es el gradiente de facticidad del capítulo 1. Un siglo después, un médico de laboratorio llevó la idea más lejos. Ludwik Fleck era bacteriólogo en Lwów, la actual Lviv; sus primeros textos epistemológicos trataban sobre el modo de pensar de la medicina, y en 1935 publicó en Basilea un libro sobre cómo se había llegado a la reacción de Wassermann, la prueba serológica de la sífilis (Sady, 2025). La tesis estaba en el título: un hecho científico tiene génesis y desarrollo. Lo que una comunidad acepta como hecho depende de su «colectivo de pensamiento», la comunidad de personas que intercambian ideas, y de su «estilo de pensamiento», que Fleck definió como una disposición a la percepción dirigida (Fleck, 1979, pp. 39 y 99). «El conocimiento es la actividad más socialmente condicionada del hombre», escribió (Fleck, 1979, p. 42).</w:t>
-      </w:r>
-    </w:p>
-    <w:p>
-      <w:pPr>
-        <w:pStyle w:val="BodyJ"/>
-        <w:keepNext w:val="false"/>
-      </w:pPr>
-      <w:r>
-        <w:t xml:space="preserve">Una de sus observaciones toca directamente la clínica. Percibir de inmediato una forma exige experiencia en el campo; se adquiere sólo después de mucho ver, «y al mismo tiempo, por supuesto, perdemos la capacidad de ver lo que contradice la forma» (Fleck, 1979, p. 92). Es la mitad oscura de la pericia del capítulo 6, escrita en 1935. El libro casi no se leyó: su editorial no vendió un solo ejemplar entre 1962 y 1966 y terminó destruyendo los que quedaban (Sady, 2025). Fleck sobrevivió al gueto, a Auschwitz y a Buchenwald —en el gueto produjo una vacuna contra el tifus— y murió en Israel en 1961. Su originalidad se mide por quién lo leyó: Kuhn reconoció en el prefacio de </w:t>
-      </w:r>
-      <w:r>
-        <w:rPr>
-          <w:i/>
-          <w:iCs/>
-        </w:rPr>
-        <w:t xml:space="preserve">La estructura de las revoluciones científicas</w:t>
-      </w:r>
-      <w:r>
-        <w:t xml:space="preserve"> que aquella monografía «casi desconocida» anticipaba muchas de sus propias ideas (Kuhn, 1996, pp. vii–viii). Lo que dejó para la cama del enfermo es una pregunta que la ficha rara vez se hace: este hecho, ¿lo sería para otro equipo, con otro estilo de pensamiento?</w:t>
+        <w:t xml:space="preserve"> y lo declaró patognomónico: «sería difícil describirlo mejor; pero basta haberlo oído una sola vez para no desconocerlo nunca más» (Laennec, 1819, p. 172). La segunda mitad de la frase es conocimiento tácito en estado puro (capítulo 6). La primera es un exceso, porque las crepitaciones se oyen también en la insuficiencia cardiaca y en la fibrosis pulmonar: el fundador del hecho auscultatorio le asignó más fuerza inferencial de la que tenía. Murió a los cuarenta y cinco años, de la tuberculosis que había enseñado a reconocer (Roguin, 2006). Lo que sobrevive de él es la idea de que un hecho clínico se produce, con un instrumento, un oído entrenado y un patrón de referencia contra el cual calibrarlos: el gradiente de facticidad del capítulo 1.</w:t>
+      </w:r>
+    </w:p>
+    <w:p>
+      <w:pPr>
+        <w:pStyle w:val="BodyJ"/>
+        <w:keepNext w:val="false"/>
+      </w:pPr>
+      <w:r>
+        <w:t xml:space="preserve">Un siglo después, Ludwik Fleck, bacteriólogo en Lwów, llevó la idea más lejos. En 1935 publicó un libro sobre cómo se había llegado a la reacción de Wassermann para la sífilis, cuya tesis estaba en el título: un hecho científico tiene génesis y desarrollo (Sady, 2025). Lo que una comunidad acepta como hecho depende de su «colectivo de pensamiento» y de su «estilo de pensamiento», una disposición compartida a percibir de cierta manera (Fleck, 1979, pp. 39 y 99). Una de sus observaciones toca de lleno la clínica: percibir una forma de inmediato exige mucha experiencia, «y al mismo tiempo, por supuesto, perdemos la capacidad de ver lo que contradice la forma» (Fleck, 1979, p. 92). Es la mitad oscura de la pericia, escrita en 1935. El libro casi no se leyó, y Fleck sobrevivió a Auschwitz y a Buchenwald. Su originalidad se mide por quién lo leyó después: Kuhn reconoció que aquella monografía «casi desconocida» anticipaba muchas de sus propias ideas (Kuhn, 1996, pp. vii–viii). La pregunta que le deja a la ficha es incómoda: este hecho, ¿lo sería para otro equipo, con otro estilo de pensamiento?</w:t>
       </w:r>
     </w:p>
     <w:p>
@@ -10940,7 +11014,7 @@
         <w:keepNext w:val="false"/>
       </w:pPr>
       <w:r>
-        <w:t xml:space="preserve">Claude Bernard escribió su </w:t>
+        <w:t xml:space="preserve">Claude Bernard publicó en 1865, desde el laboratorio de fisiología y contra quienes fundaban sus opiniones en el «tacto médico» (Bernard, 1865, p. 96), su </w:t>
       </w:r>
       <w:r>
         <w:rPr>
@@ -10950,81 +11024,25 @@
         <w:t xml:space="preserve">Introducción al estudio de la medicina experimental</w:t>
       </w:r>
       <w:r>
-        <w:t xml:space="preserve"> en 1865, desde el laboratorio de fisiología y contra quienes fundaban sus opiniones en el «tacto médico» o en la inspiración (Bernard, 1865, p. 96). Su respuesta fue la hipótesis puesta a prueba. La idea experimental es una idea previa, pero se presenta como hipótesis, y sus consecuencias deben someterse al criterio de la experiencia para juzgar su valor (Bernard, 1865, p. 49). Agregó dos exigencias que este libro hace suyas. «La verdadera ciencia enseña a dudar y a abstenerse en la ignorancia» (Bernard, 1865, p. 96). Y como el </w:t>
-      </w:r>
-      <w:r>
-        <w:rPr>
-          <w:i/>
-          <w:iCs/>
-        </w:rPr>
-        <w:t xml:space="preserve">post hoc, ergo propter hoc</w:t>
-      </w:r>
-      <w:r>
-        <w:t xml:space="preserve"> es el error típico de los médicos, las ideas sólo se asientan con solidez si se busca destruir las propias conclusiones mediante contrapruebas (Bernard, 1865, pp. 98–99). Es la falsabilidad que el capítulo 17 le exige a HII-D, setenta años antes de que tuviera ese nombre.</w:t>
-      </w:r>
-    </w:p>
-    <w:p>
-      <w:pPr>
-        <w:pStyle w:val="BodyJ"/>
-        <w:keepNext w:val="false"/>
-      </w:pPr>
-      <w:r>
-        <w:t xml:space="preserve">Bernard fue además el autor del </w:t>
-      </w:r>
-      <w:r>
-        <w:rPr>
-          <w:i/>
-          <w:iCs/>
-        </w:rPr>
-        <w:t xml:space="preserve">medio interior</w:t>
-      </w:r>
-      <w:r>
-        <w:t xml:space="preserve">: los organismos superiores viven en un medio líquido propio —la sangre y los fluidos que bañan los tejidos—, distinto del medio exterior (Bernard, 1865, pp. 108–109). Reclamó la prioridad de esa idea, que creía haber sido el primero en expresar con claridad. Pero sobre la originalidad de su método fue más modesto que sus admiradores: los grandes experimentadores, escribió, existieron antes que los preceptos de la experimentación (Bernard, 1865, p. 90).</w:t>
-      </w:r>
-    </w:p>
-    <w:p>
-      <w:pPr>
-        <w:pStyle w:val="BodyJ"/>
-        <w:keepNext w:val="false"/>
-      </w:pPr>
-      <w:r>
-        <w:t xml:space="preserve">Su error es instructivo, porque nació de una virtud. Desconfiaba de los promedios: el análisis de la orina de veinticuatro horas mezclada era «el análisis de una orina que no existe», y el uso de la estadística conducía en medicina «casi necesariamente al error» (Bernard, 1865, pp. 235–236). Si un cirujano concluía que la mortalidad de una operación era de dos por cada cinco, ese dato «no significa absolutamente nada científicamente» y no da ninguna certeza para la operación siguiente, porque no dice si el próximo paciente estará entre los vivos o entre los muertos (Bernard, 1865, p. 241). Se equivocó en la conclusión y acertó en el problema. Lo que plantea es exactamente la distancia entre el ensayo y el caso singular del capítulo 9, y él mismo matizó: la estadística puede guiar el pronóstico, y no rechazaba su uso, sino que no se buscara ir más allá (Bernard, 1865, p. 243).</w:t>
-      </w:r>
-    </w:p>
-    <w:p>
-      <w:pPr>
-        <w:pStyle w:val="BodyJ"/>
-        <w:keepNext w:val="false"/>
-      </w:pPr>
-      <w:r>
-        <w:t xml:space="preserve">Casi dos décadas antes del libro de Bernard, en la maternidad del Hospital General de Viena se hacía, sin que nadie lo planeara, uno de los experimentos naturales más citados de la historia. Desde 1840 funcionaban allí dos clínicas: en la primera se formaban los estudiantes de medicina; en la segunda, las matronas. Las parturientas se admitían en días alternos (Stang et al., 2022). Entre 1841 y 1846 murieron 1.989 de las 20.042 mujeres que dieron a luz en la primera, casi 10%, y 691 de las 17.791 de la segunda, menos de 4% (Semmelweis, 1861, p. 3). Ignaz Semmelweis, asistente en la primera, tenía una diferencia que nadie explicaba.</w:t>
-      </w:r>
-    </w:p>
-    <w:p>
-      <w:pPr>
-        <w:pStyle w:val="BodyJ"/>
-        <w:keepNext w:val="false"/>
-      </w:pPr>
-      <w:r>
-        <w:t xml:space="preserve">La pista llegó con una muerte. En marzo de 1847, Kolletschka, profesor de medicina legal, fue herido en un dedo con el bisturí de un alumno durante una autopsia docente, y murió de un cuadro igual al de las puérperas: linfangitis, flebitis, pleuritis, peritonitis, meningitis. Semmelweis estaba en Venecia; al volver, escribe, la imagen de esa enfermedad lo persiguió día y noche hasta que tuvo que aceptar que era la misma (Semmelweis, 1861, pp. 53–54). La inferencia fue que los estudiantes llevaban en las manos partículas de los cadáveres desde la sala de autopsias a la de partos, cosa que las matronas no hacían. Desde mediados de mayo de 1847 exigió lavarse las manos con solución de cloro —primero agua clorada; después, por su precio, cal clorada—, y entre junio y diciembre murieron 56 de las 1.841 parturientas de la primera clínica, 3% (Semmelweis, 1861, pp. 55–57). En 1848, la mortalidad de ambas clínicas fue prácticamente la misma.</w:t>
-      </w:r>
-    </w:p>
-    <w:p>
-      <w:pPr>
-        <w:pStyle w:val="BodyJ"/>
-        <w:keepNext w:val="false"/>
-      </w:pPr>
-      <w:r>
-        <w:t xml:space="preserve">El episodio que mejor muestra su razonamiento es posterior y menos citado. En octubre de 1847 ingresó una parturienta con un cáncer uterino supurado; los médicos que la examinaron se lavaron las manos sólo con jabón, y de las doce mujeres que parieron junto a ella murieron once. Semmelweis no defendió su hipótesis contra el dato: la amplió. No eran sólo los cadáveres, sino también la materia pútrida de enfermas vivas, y desde entonces se exigió el lavado con cloro también después de examinarlas (Semmelweis, 1861, pp. 59–60). Hempel hizo de este episodio, en 1966, el ejemplo de manual del método hipotético-deductivo, y la filosofía de la ciencia todavía lo discute (Hepburn &amp; Andersen, 2026).</w:t>
-      </w:r>
-    </w:p>
-    <w:p>
-      <w:pPr>
-        <w:pStyle w:val="BodyJ"/>
-        <w:keepNext w:val="false"/>
-      </w:pPr>
-      <w:r>
-        <w:t xml:space="preserve">Y sin embargo fracasó. La respuesta a sus ideas fue casi uniformemente negativa (Kadar et al., 2018). Publicó su libro recién en 1861, trece años después de los hechos (Stang et al., 2022); trató de asesinos a sus críticos (Schreiner, 2020), y murió en 1865 en un asilo de Viena, de una sepsis causada por las heridas de una golpiza de sus cuidadores (Kadar et al., 2018). Tenía los hechos y una inferencia correcta. ¿Por qué no bastó? Hay razones conocidas: faltaba todavía una teoría microbiana que le diera un mecanismo, y él mismo dificultó que lo escucharan. Fleck ofrece otra, aunque nunca escribió sobre Semmelweis, y la lectura que sigue es nuestra. Para el colectivo de pensamiento de la obstetricia vienesa, sus cifras no eran todavía un hecho. No cabían en un estilo que explicaba la fiebre puerperal por influencias atmosféricas, cósmicas y telúricas —las que el propio Semmelweis se dedicó a refutar en su libro (Semmelweis, 1861)—, y además acusaban a quienes debían aceptarlas. Un hecho que obliga al lector a declararse culpable necesita más que una buena tabla. El capítulo 14 lo dijo de los equipos: tener razón no basta; hay que lograr que el desacuerdo se pueda escuchar.</w:t>
+        <w:t xml:space="preserve">. La idea previa es necesaria, pero se presenta como hipótesis, y sus consecuencias se someten al criterio de la experiencia (Bernard, 1865, p. 49). «La verdadera ciencia enseña a dudar y a abstenerse en la ignorancia» (Bernard, 1865, p. 96), y las ideas sólo se asientan si se busca destruir las propias conclusiones con contrapruebas (Bernard, 1865, pp. 98–99): es la falsabilidad que el capítulo 17 le exige a HII-D, setenta años antes de que tuviera nombre. Sobre la originalidad de su método fue modesto; los grandes experimentadores, escribió, existieron antes que los preceptos (Bernard, 1865, p. 90). Su error nació de su misma exigencia. Desconfiaba de los promedios: si la mortalidad de una operación es de dos por cada cinco, el dato «no significa absolutamente nada científicamente», porque no dice si el próximo paciente estará entre los vivos o entre los muertos (Bernard, 1865, p. 241). Se equivocó en la conclusión y acertó en el problema, que es la distancia entre el ensayo y el caso singular del capítulo 9; él mismo admitió que la estadística puede guiar el pronóstico (Bernard, 1865, p. 243).</w:t>
+      </w:r>
+    </w:p>
+    <w:p>
+      <w:pPr>
+        <w:pStyle w:val="BodyJ"/>
+        <w:keepNext w:val="false"/>
+      </w:pPr>
+      <w:r>
+        <w:t xml:space="preserve">Casi dos décadas antes, en la maternidad del Hospital General de Viena funcionaban dos clínicas: en la primera se formaban los estudiantes de medicina; en la segunda, las matronas, y las parturientas se admitían en días alternos (Stang et al., 2022). Entre 1841 y 1846 murieron 1.989 de las 20.042 mujeres que parieron en la primera, casi 10%, y 691 de las 17.791 de la segunda, menos de 4% (Semmelweis, 1861, p. 3). En marzo de 1847, el profesor Kolletschka fue herido con el bisturí de un alumno durante una autopsia y murió de un cuadro igual al de las puérperas. Ignaz Semmelweis, asistente en la primera clínica, infirió que los estudiantes llevaban en las manos materia de los cadáveres a la sala de partos (Semmelweis, 1861, pp. 53–54). Desde mayo exigió lavarlas con cloro, y entre junio y diciembre murieron 56 de 1.841 parturientas, 3% (Semmelweis, 1861, pp. 55–57). En octubre, once de las doce mujeres que parieron junto a una enferma con un cáncer uterino supurado murieron; los médicos se habían lavado sólo con jabón. Semmelweis no defendió su hipótesis contra el dato: la amplió a la materia pútrida de enfermas vivas (Semmelweis, 1861, pp. 59–60). La filosofía de la ciencia hizo de su razonamiento el ejemplo de manual del método hipotético-deductivo (Hepburn &amp; Andersen, 2026).</w:t>
+      </w:r>
+    </w:p>
+    <w:p>
+      <w:pPr>
+        <w:pStyle w:val="BodyJ"/>
+        <w:keepNext w:val="false"/>
+      </w:pPr>
+      <w:r>
+        <w:t xml:space="preserve">Y sin embargo fracasó. La respuesta fue casi uniformemente negativa; publicó su libro trece años después de los hechos (Stang et al., 2022) y murió en 1865 en un asilo de Viena, de una sepsis causada por las heridas de una golpiza (Kadar et al., 2018). Faltaba una teoría microbiana que le diera un mecanismo, y él mismo dificultó que lo escucharan: trató de asesinos a sus críticos (Schreiner, 2020). Fleck, que nunca escribió sobre Semmelweis, ofrece otra razón, y la lectura es nuestra. Para un colectivo que explicaba la fiebre puerperal por influencias atmosféricas y telúricas (Semmelweis, 1861), sus cifras no eran todavía un hecho, y además acusaban a quienes debían aceptarlas. Un hecho que obliga al lector a declararse culpable necesita más que una buena tabla. El capítulo 14 lo dijo de los equipos: tener razón no basta; hay que lograr que el desacuerdo se pueda escuchar.</w:t>
       </w:r>
     </w:p>
     <w:p>
@@ -11052,53 +11070,25 @@
         <w:keepNext w:val="false"/>
       </w:pPr>
       <w:r>
-        <w:t xml:space="preserve">En el París de la década de 1820 dominaba la medicina de Broussais, para quien casi toda fiebre era la inflamación de un órgano y el tratamiento natural, sacar sangre. Sólo en 1833, Francia importó 42 millones de sanguijuelas para uso médico (Morabia, 2006). Pierre-Charles-Alexandre Louis hizo algo que hoy parece trivial y entonces fue una provocación: contó. En su estudio de 1835 sobre los efectos de la sangría reunió 78 pacientes con neumonía, de los cuales murieron 28. Entre los sangrados en los primeros cuatro días de enfermedad murieron 18 de 41; entre los sangrados del quinto al noveno, 9 de 36. «Resultado espantoso, absurdo en apariencia», escribió (Louis, 1835, pp. 16–17).</w:t>
-      </w:r>
-    </w:p>
-    <w:p>
-      <w:pPr>
-        <w:pStyle w:val="BodyJ"/>
-        <w:keepNext w:val="false"/>
-      </w:pPr>
-      <w:r>
-        <w:t xml:space="preserve">No se apresuró a concluir que sangrar temprano mataba. Advirtió que entre los sangrados el primer día había casi el doble de mayores de cincuenta años, «lo que debió tener una gran influencia sobre la mortalidad» (Louis, 1835, pp. 17–18). Es lo que hoy se llama confusión, nombrado antes de tener nombre: la diferencia entre dos grupos puede deberse a otra diferencia entre ellos. Su método numérico pedía comparar pacientes semejantes en todo lo demás y confiaba en que, con números grandes, los errores se compensarían en ambos grupos (Morabia, 2006). Su conclusión fue modesta: todo indicaba «límites estrechos» para la utilidad de la sangría en la neumonía (Louis, 1835, p. 21). No la abandonó; él mismo recordó que había mostrado la necesidad de recurrir a ella en las inflamaciones graves. Y contó cómo lo recibieron sus críticos: unos lo acusaron de desterrar la sangría, y otros se declararon contra su método y a favor de lo que comúnmente se llama la experiencia (Louis, 1835). La discusión entre el recuento y la experiencia del clínico empezó ahí y no ha terminado. Morabia lo llamó un epidemiólogo preformal (Morabia, 2006).</w:t>
-      </w:r>
-    </w:p>
-    <w:p>
-      <w:pPr>
-        <w:pStyle w:val="BodyJ"/>
-        <w:keepNext w:val="false"/>
-      </w:pPr>
-      <w:r>
-        <w:t xml:space="preserve">Louis no fue el primero en comparar. Hacia el año 900, en una nota agregada a un comentario de las </w:t>
-      </w:r>
-      <w:r>
-        <w:rPr>
-          <w:i/>
-          <w:iCs/>
-        </w:rPr>
-        <w:t xml:space="preserve">Epidemias</w:t>
-      </w:r>
-      <w:r>
-        <w:t xml:space="preserve"> hipocráticas, el médico persa al-Razi escribió que había sangrado a un grupo de pacientes con signos de fiebre cerebral y dejado intencionalmente sin sangrar a otro, «para quitar la duda de mi opinión»; todos los del segundo grupo, anotó, enfermaron (Pormann, 2018). Tenía la forma de un ensayo controlado nueve siglos antes que Louis y llegó a la conclusión contraria: que la sangría servía. La comparación sin números, sin registro de cuántos ni de cómo se eligió a cada grupo, y sin nadie que la repitiera, confirmó lo que el comparador ya creía. Lo que Louis agregó no fue la idea de comparar, sino la obligación de contar, publicar los números y discutir lo que podía distorsionarlos. Con eso, la incertidumbre dejó de ser un estado de ánimo del médico y pasó a ser una propiedad de los datos, algo que se puede estimar y escribir.</w:t>
-      </w:r>
-    </w:p>
-    <w:p>
-      <w:pPr>
-        <w:pStyle w:val="BodyJ"/>
-        <w:keepNext w:val="false"/>
-      </w:pPr>
-      <w:r>
-        <w:t xml:space="preserve">Dos generaciones después, William Osler la nombró sin pudor. Osler organizó la enseñanza junto a la cama en el hospital Johns Hopkins, donde el estudiante, decía, empieza con el paciente, continúa con el paciente y termina sus estudios con el paciente, usando los libros como herramientas (Osler, 1905, p. 331). A sus alumnos les advertía que los errores de juicio son inevitables en un arte que consiste en gran parte en sopesar probabilidades (Osler, 1905, p. 40). Y ante una sociedad médica, en 1903, defendió el axioma del obispo Butler, «la probabilidad es la guía de la vida», como más verdadero para la medicina que para cualquier otra profesión: no hay descrédito, aunque a veces sí mucha incomodidad, en «este eterno quizás» con que hay que encabezar tanto de lo que hacemos (Osler, 1905, pp. 347–348).</w:t>
-      </w:r>
-    </w:p>
-    <w:p>
-      <w:pPr>
-        <w:pStyle w:val="BodyJ"/>
-        <w:keepNext w:val="false"/>
-      </w:pPr>
-      <w:r>
-        <w:t xml:space="preserve">La frase más citada de Osler sobre el tema —la medicina como ciencia de la incertidumbre y arte de la probabilidad— no aparece en ninguno de los escritos suyos que se revisaron para este capítulo. Proviene de una colección póstuma de aforismos de sus visitas, publicada en 1950, y conviene citarla como lo que es: una atribución. El detalle no es pedante. La frase que mejor resume la capa de incertidumbre circula como hecho sin procedencia verificable, que es exactamente el problema del capítulo 1.</w:t>
+        <w:t xml:space="preserve">En el París de la década de 1820, la medicina de Broussais veía en casi toda fiebre la inflamación de un órgano, y el tratamiento natural era sacar sangre: sólo en 1833, Francia importó 42 millones de sanguijuelas para uso médico (Morabia, 2006). Pierre-Charles-Alexandre Louis hizo algo que entonces fue una provocación: contó. En 1835 reunió 78 pacientes con neumonía, de los que murieron 28. Entre los sangrados en los primeros cuatro días murieron 18 de 41; entre los sangrados del quinto al noveno, 9 de 36. «Resultado espantoso, absurdo en apariencia», escribió (Louis, 1835, pp. 16–17). No concluyó que sangrar temprano mataba: advirtió que entre los sangrados el primer día había casi el doble de mayores de cincuenta años (Louis, 1835, pp. 17–18). Es la confusión, nombrada antes de tener nombre. Concluyó que la utilidad de la sangría tenía «límites estrechos» (Louis, 1835, p. 21), sin abandonarla en las inflamaciones graves, y sus críticos se declararon contra su método y a favor de lo que comúnmente se llama la experiencia (Louis, 1835). Esa discusión no ha terminado.</w:t>
+      </w:r>
+    </w:p>
+    <w:p>
+      <w:pPr>
+        <w:pStyle w:val="BodyJ"/>
+        <w:keepNext w:val="false"/>
+      </w:pPr>
+      <w:r>
+        <w:t xml:space="preserve">Tampoco fue el primero en comparar. Hacia el año 900, el médico persa al-Razi anotó que había sangrado a un grupo de pacientes con fiebre cerebral y dejado sin sangrar a otro, a propósito, «para quitar la duda de mi opinión»; todos los del segundo grupo enfermaron (Pormann, 2018). Tenía la forma de un ensayo controlado nueve siglos antes que Louis, y llegó a la conclusión contraria. Sin números, sin registro de cómo se eligió a cada grupo y sin nadie que la repitiera, la comparación confirmó lo que el comparador ya creía. Louis agregó la obligación de contar, publicar los números y discutir lo que podía distorsionarlos. Con eso, la incertidumbre dejó de ser un estado de ánimo del médico y pasó a ser una propiedad de los datos, algo que se estima y se escribe.</w:t>
+      </w:r>
+    </w:p>
+    <w:p>
+      <w:pPr>
+        <w:pStyle w:val="BodyJ"/>
+        <w:keepNext w:val="false"/>
+      </w:pPr>
+      <w:r>
+        <w:t xml:space="preserve">Dos generaciones después, William Osler, que organizó en el hospital Johns Hopkins una enseñanza que empieza, continúa y termina con el paciente (Osler, 1905, p. 331), le dio a esa incertidumbre su lugar en el oficio. Advertía que los errores de juicio son inevitables en un arte que consiste en gran parte en sopesar probabilidades (Osler, 1905, p. 40). Con el obispo Butler, sostenía que «la probabilidad es la guía de la vida», y que no hay descrédito, aunque a veces sí mucha incomodidad, en «este eterno quizás» con que hay que encabezar tanto de lo que hacemos (Osler, 1905, pp. 347–348). Su frase más citada sobre el tema —la medicina como ciencia de la incertidumbre y arte de la probabilidad— no aparece en ninguno de los escritos suyos que se revisaron para este capítulo; viene de una colección póstuma de aforismos publicada en 1950. Que la frase emblema de la capa de incertidumbre circule como hecho sin procedencia verificable es exactamente el problema del capítulo 1.</w:t>
       </w:r>
     </w:p>
     <w:p>
@@ -11136,34 +11126,25 @@
         <w:t xml:space="preserve">Science</w:t>
       </w:r>
       <w:r>
-        <w:t xml:space="preserve"> un artículo cuyo subtítulo es un programa: la lógica simbólica, la probabilidad y la teoría del valor ayudan a entender cómo razonan los médicos (Ledley &amp; Lusted, 1959). Había antecedentes —un aparato para asistir las facultades lógicas en el diagnóstico diferencial, la correlación mecánica de datos para diagnosticar enfermedades hematológicas (Nash, 1954; Lipkin &amp; Hardy, 1957)—, pero un contemporáneo lo juzgó con precisión: fue el primer intento de aplicar una estructura formal general al problema de la medicina clínica (Card, 1970, p. 183). Lo nuevo fue la descomposición. El diagnóstico quedaba como un problema lógico, un problema de probabilidad y, por separado, un problema de valores: cuánto cuesta cada error. Es la separación entre inferencia, incertidumbre y decisión de este libro, escrita en símbolos. En esa línea están el umbral de Pauker y Kassirer del capítulo 10, los sistemas de apoyo a la decisión y buena parte de lo que el capítulo 19 discute sobre inteligencia artificial.</w:t>
-      </w:r>
-    </w:p>
-    <w:p>
-      <w:pPr>
-        <w:pStyle w:val="BodyJ"/>
-        <w:keepNext w:val="false"/>
-      </w:pPr>
-      <w:r>
-        <w:t xml:space="preserve">La crítica llegó de un clínico. Feinstein, que en la Introducción aparece reclamando una ciencia del juicio clínico, objetó en 1973 que el procedimiento bayesiano ignora el camino interno de la lógica diagnóstica (Feinstein, 1973). Tenía razón en algo que el capítulo 2 ya dijo: el teorema de Bayes actualiza hipótesis, pero no las genera. La abducción queda fuera de la fórmula.</w:t>
-      </w:r>
-    </w:p>
-    <w:p>
-      <w:pPr>
-        <w:pStyle w:val="BodyJ"/>
-        <w:keepNext w:val="false"/>
-      </w:pPr>
-      <w:r>
-        <w:t xml:space="preserve">Austin Bradford Hill habló en 1965 ante la recién fundada Sección de Medicina del Trabajo de la Real Sociedad de Medicina, un año después del informe del Cirujano General de Estados Unidos sobre el tabaco y con sus propios estudios con Richard Doll sobre el cáncer de pulmón a la vista. La pregunta era la de siempre: ¿cuándo una asociación autoriza a hablar de causa? Su respuesta fueron nueve «puntos de vista»: fuerza, consistencia, especificidad, temporalidad, gradiente biológico, plausibilidad, coherencia, experimento y analogía. La posteridad los convirtió en «criterios», palabra que él nunca usó (Phillips &amp; Goodman, 2004). Él había dicho lo contrario. Ninguno de los nueve puede aportar pruebas indiscutibles a favor o en contra de la causalidad, ni puede exigirse como condición indispensable; lo que hacen es ayudar a responder la pregunta de fondo: ¿hay otra manera de explicar los hechos, otra respuesta igual o más probable que la causa? (Hill, 1965). Es la pregunta que el capítulo 2 pone en el centro de la inferencia clínica: no qué explica lo observado, sino qué más podría explicarlo. Sobre las pruebas de significación fue igual de breve: como el fuego, la prueba de ji cuadrado es un excelente sirviente y un mal amo (Hill, 1965). La saga de un valor p de 0,06 en el capítulo 9 es el comentario más largo de esa frase.</w:t>
-      </w:r>
-    </w:p>
-    <w:p>
-      <w:pPr>
-        <w:pStyle w:val="BodyJ"/>
-        <w:keepNext w:val="false"/>
-      </w:pPr>
-      <w:r>
-        <w:t xml:space="preserve">Pero lo que hace de Hill un antepasado de la capa de decisión es la última sección de su conferencia, titulada «El caso para actuar»: «Todo trabajo científico es incompleto, sea observacional o experimental. Todo trabajo científico puede ser alterado o modificado por el avance del conocimiento. Eso no nos confiere la libertad de ignorar el conocimiento que ya tenemos ni de postergar la acción que parece exigir en un momento dado» (Hill, 1965, p. 300). Agregó enseguida que la evidencia exigida depende de lo que la acción cuesta. Con evidencia razonable se puede cambiar un aceite probablemente cancerígeno por otro en una fábrica, sin demasiada injusticia si uno se equivoca. Para hacer que la gente deje los cigarrillos, las grasas y el azúcar que le gustan, haría falta evidencia muy fuerte (Hill, 1965, p. 300). Es el umbral del capítulo 10 dicho por un epidemiólogo: cuánta evidencia basta depende del precio del error.</w:t>
+        <w:t xml:space="preserve"> un artículo cuyo subtítulo es un programa: la lógica simbólica, la probabilidad y la teoría del valor ayudan a entender cómo razonan los médicos (Ledley &amp; Lusted, 1959). Ya existían aparatos para asistir el diagnóstico diferencial (Nash, 1954; Lipkin &amp; Hardy, 1957), pero un contemporáneo lo juzgó con precisión: fue el primer intento de aplicar una estructura formal general al problema de la medicina clínica (Card, 1970, p. 183). Lo nuevo fue separar el diagnóstico en un problema lógico, uno de probabilidad y, aparte, uno de valores —cuánto cuesta cada error—. Es la separación entre inferencia, incertidumbre y decisión de este libro, escrita en símbolos, y en esa línea están el umbral del capítulo 10 y buena parte de la inteligencia artificial del capítulo 19. Feinstein objetó en 1973 que el procedimiento bayesiano ignora el camino interno de la lógica diagnóstica (Feinstein, 1973), y tenía razón en lo que el capítulo 2 ya dijo: el teorema de Bayes actualiza hipótesis, pero no las genera.</w:t>
+      </w:r>
+    </w:p>
+    <w:p>
+      <w:pPr>
+        <w:pStyle w:val="BodyJ"/>
+        <w:keepNext w:val="false"/>
+      </w:pPr>
+      <w:r>
+        <w:t xml:space="preserve">Austin Bradford Hill habló en 1965 ante la recién fundada Sección de Medicina del Trabajo de la Real Sociedad de Medicina, un año después del informe del Cirujano General de Estados Unidos sobre el tabaco y con sus propios estudios con Richard Doll sobre el cáncer de pulmón a la vista. Para juzgar si una asociación autoriza a hablar de causa propuso nueve «puntos de vista»: fuerza, consistencia, especificidad, temporalidad, gradiente biológico, plausibilidad, coherencia, experimento y analogía. La posteridad los llamó «criterios», palabra que él nunca usó (Phillips &amp; Goodman, 2004). Había advertido que ninguno es indispensable y que sólo ayudan a responder si hay otra explicación igual o más probable que la causa (Hill, 1965), que es la pregunta del capítulo 2: no qué explica lo observado, sino qué más podría explicarlo. Sobre las pruebas de significación fue igual de breve: como el fuego, la prueba de ji cuadrado es un excelente sirviente y un mal amo (Hill, 1965).</w:t>
+      </w:r>
+    </w:p>
+    <w:p>
+      <w:pPr>
+        <w:pStyle w:val="BodyJ"/>
+        <w:keepNext w:val="false"/>
+      </w:pPr>
+      <w:r>
+        <w:t xml:space="preserve">Lo que lo hace antepasado de la capa de decisión es la última sección de su conferencia, «El caso para actuar»: «Todo trabajo científico es incompleto, sea observacional o experimental. Todo trabajo científico puede ser alterado o modificado por el avance del conocimiento. Eso no nos confiere la libertad de ignorar el conocimiento que ya tenemos ni de postergar la acción que parece exigir en un momento dado» (Hill, 1965, p. 300). Agregó que la evidencia exigida depende de lo que la acción cuesta. Con evidencia razonable se puede cambiar un aceite probablemente cancerígeno en una fábrica; para hacer que la gente deje los cigarrillos, las grasas y el azúcar que le gustan, hace falta evidencia muy fuerte (Hill, 1965, p. 300). Es el umbral del capítulo 10 dicho por un epidemiólogo.</w:t>
       </w:r>
     </w:p>
     <w:p>
@@ -11191,7 +11172,7 @@
         <w:keepNext w:val="false"/>
       </w:pPr>
       <w:r>
-        <w:t xml:space="preserve">En 1977, la psiquiatría estaba en crisis: unos decían que la enfermedad mental era un mito; otros pedían volver estrictamente al «modelo médico». George Engel, profesor de psiquiatría y de medicina en Rochester, respondió en </w:t>
+        <w:t xml:space="preserve">En 1977, con la psiquiatría en crisis —unos decían que la enfermedad mental era un mito; otros pedían volver estrictamente al «modelo médico»—, George Engel, profesor de psiquiatría y de medicina en Rochester, respondió en </w:t>
       </w:r>
       <w:r>
         <w:rPr>
@@ -11201,34 +11182,16 @@
         <w:t xml:space="preserve">Science</w:t>
       </w:r>
       <w:r>
-        <w:t xml:space="preserve"> que la crisis no era de la psiquiatría, sino de toda la medicina, y que ambas venían del mismo defecto: un modelo de enfermedad que ya no alcanzaba para sus tareas científicas ni para sus responsabilidades sociales (Engel, 1977). El modelo biomédico, escribió, supone que la enfermedad queda completamente explicada por desviaciones de variables biológicas medibles, y no deja lugar para las dimensiones sociales, psicológicas y conductuales de enfermar. Agregó una frase que conecta su crítica con los cadáveres «anormales» de los galenistas: el modelo había adquirido el estatus de dogma, y mientras en ciencia un modelo se revisa o se abandona cuando no explica los datos, un dogma exige que los datos discrepantes se fuercen a calzar o se excluyan (Engel, 1977).</w:t>
-      </w:r>
-    </w:p>
-    <w:p>
-      <w:pPr>
-        <w:pStyle w:val="BodyJ"/>
-        <w:keepNext w:val="false"/>
-      </w:pPr>
-      <w:r>
-        <w:t xml:space="preserve">Su propuesta, el modelo biopsicosocial, pedía considerar al paciente, el contexto social en que vive y el sistema que la sociedad organizó para enfrentar la enfermedad, incluido el propio rol del médico (Engel, 1977). La palabra no era suya —Grinker la había usado en 1954—, y la crítica más seria llegó después: el modelo terminó en un eclecticismo que dice qué mirar pero no cómo priorizar (Ghaemi, 2009). La objeción es justa, y este libro intenta una respuesta parcial. «Cuida a su marido» entra a la ficha como un hecho, con su procedencia, y pesa en la decisión como cualquier otro; lo que el modelo biopsicosocial nombró, HII-D intenta ubicarlo en una capa.</w:t>
-      </w:r>
-    </w:p>
-    <w:p>
-      <w:pPr>
-        <w:pStyle w:val="BodyJ"/>
-        <w:keepNext w:val="false"/>
-      </w:pPr>
-      <w:r>
-        <w:t xml:space="preserve">Michael Balint, psiquiatra y psicoanalista de la Clínica Tavistock de Londres, llevaba años reuniendo a médicos generales en seminarios de investigación sobre las implicancias psicológicas de la práctica general cuando publicó, en 1957, el libro que resultó de ellos. Empieza con un hallazgo. El primer tema que discutieron fue el de los medicamentos que solían recetar, y la discusión reveló —«ciertamente no por primera vez en la historia de la medicina»— que el medicamento más usado en la práctica general era el propio médico. No importaba sólo el frasco o la caja de pastillas, sino la manera en que el médico los entregaba. El segundo hallazgo era peor: de ese medicamento no existía farmacología alguna, ninguna guía sobre su dosis, su forma ni su frecuencia (Balint, 1957, p. 1).</w:t>
-      </w:r>
-    </w:p>
-    <w:p>
-      <w:pPr>
-        <w:pStyle w:val="BodyJ"/>
-        <w:keepNext w:val="false"/>
-      </w:pPr>
-      <w:r>
-        <w:t xml:space="preserve">Balint nombró además algo que cualquier internista reconoce. Cuando un paciente desconcertante circula entre su médico y una galaxia de especialistas, se produce la «colusión del anonimato»: se toman decisiones vitales sin que nadie se sienta plenamente responsable de ellas (Balint, 1957, p. 76). El capítulo 14 describió la cognición distribuida como una ventaja; Balint describió su costo. Una ficha en que cada interconsultor anota su parte y nadie firma la síntesis es la colusión del anonimato por escrito. Él mismo admitió que la idea central no era nueva. Lo nuevo fue el método: un grupo de médicos que discute con regularidad sus propios casos, a la vez investigación y formación (Balint, 1957, p. 3). Los grupos que llevan su nombre siguen reuniéndose.</w:t>
+        <w:t xml:space="preserve"> que la crisis era de toda la medicina (Engel, 1977). El modelo biomédico supone que la enfermedad queda explicada por desviaciones de variables biológicas medibles, y no deja lugar para sus dimensiones sociales, psicológicas y conductuales. Había adquirido el estatus de dogma, y un dogma, a diferencia de un modelo, exige que los datos discrepantes se fuercen a calzar o se excluyan (Engel, 1977): los cadáveres «anormales» de los galenistas, otra vez. Su modelo biopsicosocial pedía considerar al paciente, su contexto social y el sistema de atención, incluido el rol del médico. La palabra no era suya —Grinker la había usado en 1954—, y la crítica más seria es que el modelo dice qué mirar, pero no cómo priorizar (Ghaemi, 2009). HII-D intenta una respuesta parcial: «cuida a su marido» entra a la ficha como un hecho, con su procedencia, y pesa en la decisión como cualquier otro.</w:t>
+      </w:r>
+    </w:p>
+    <w:p>
+      <w:pPr>
+        <w:pStyle w:val="BodyJ"/>
+        <w:keepNext w:val="false"/>
+      </w:pPr>
+      <w:r>
+        <w:t xml:space="preserve">Michael Balint, psiquiatra y psicoanalista de la Clínica Tavistock de Londres, llevaba años reuniendo a médicos generales para estudiar la psicología de su práctica cuando publicó, en 1957, un libro que empieza con un hallazgo. El medicamento más usado en la práctica general era el propio médico —«ciertamente no por primera vez en la historia de la medicina»—, y de ese medicamento no existía farmacología alguna, ninguna guía sobre su dosis ni su frecuencia (Balint, 1957, p. 1). Nombró además algo que cualquier internista reconoce. Cuando un paciente desconcertante circula entre su médico y una galaxia de especialistas, se produce la «colusión del anonimato»: se toman decisiones vitales sin que nadie se sienta plenamente responsable de ellas (Balint, 1957, p. 76). El capítulo 14 describió la cognición distribuida como una ventaja; Balint describió su costo, y una ficha en que cada interconsultor anota su parte y nadie firma la síntesis es esa colusión por escrito. Lo nuevo de Balint no fue la idea, sino el método: un grupo de médicos que discute con regularidad sus propios casos, a la vez investigación y formación (Balint, 1957, p. 3).</w:t>
       </w:r>
     </w:p>
     <w:p>
@@ -11256,34 +11219,25 @@
         <w:keepNext w:val="false"/>
       </w:pPr>
       <w:r>
-        <w:t xml:space="preserve">Puesta en fila, la genealogía muestra un patrón. Casi ninguna de estas ideas era nueva cuando su autor la formuló. La auscultación se conocía desde los hipocráticos. Gordon y Holmes habían sospechado el contagio de la fiebre puerperal antes que Semmelweis (Stang et al., 2022). Al-Razi comparó grupos nueve siglos antes que Louis, y otros habían pensado el diagnóstico con máquinas antes que Ledley y Lusted. Grinker dijo «biopsicosocial» antes que Engel, Kuhn reconoció su deuda con Fleck y Balint escribió en su primera página que su hallazgo no era el primero. Lo que cada uno aportó fue un procedimiento que volvió verificable una intuición vieja: un cilindro de madera y la autopsia; una tabla con dos clínicas; un recuento con la advertencia de la edad; un lenguaje formal; nueve preguntas en lugar de reglas; un grupo que se reúne cada semana. Las ideas que sobreviven son las que se convierten en una práctica que otro puede repetir y que puede desmentir a quien la propuso.</w:t>
-      </w:r>
-    </w:p>
-    <w:p>
-      <w:pPr>
-        <w:pStyle w:val="BodyJ"/>
-        <w:keepNext w:val="false"/>
-      </w:pPr>
-      <w:r>
-        <w:t xml:space="preserve">La misma lista muestra cuánto se equivocaron. Galeno describió como humana una anatomía en parte animal; Laennec llamó patognomónico a un ruido que no lo es; Louis siguió sangrando; Bernard despreció los promedios que hoy sostienen la medicina basada en evidencia; Semmelweis tenía razón y la perdió en parte por insultar a quienes debía convencer; Ledley y Lusted dejaron fuera de la fórmula la generación de hipótesis; el modelo de Engel no dice cómo priorizar. Los fundadores del razonamiento clínico no fueron clínicos infalibles. Fueron clínicos cuyo método permitió, después, corregirlos, y ésa es la única forma de autoridad que este libro defiende (capítulo 15).</w:t>
-      </w:r>
-    </w:p>
-    <w:p>
-      <w:pPr>
-        <w:pStyle w:val="BodyJ"/>
-        <w:keepNext w:val="false"/>
-      </w:pPr>
-      <w:r>
-        <w:t xml:space="preserve">Dos advertencias impiden convertir este capítulo en un panteón. La primera: la genealogía es una selección, casi entera europea y norteamericana, porque de ahí vienen las instituciones que formaron la medicina que se practica en Chile, no porque el razonamiento clínico haya nacido sólo ahí; al-Razi está para recordarlo. La segunda: mirar el pasado buscando antepasados tiene un sesgo propio. Lo que parece anticipación genial suele ser lo que se parece a nosotros, y ninguno de estos médicos escribía para HII-D; leerlos así es útil mientras no se olvide que es una lectura.</w:t>
-      </w:r>
-    </w:p>
-    <w:p>
-      <w:pPr>
-        <w:pStyle w:val="BodyJ"/>
-        <w:keepNext w:val="false"/>
-      </w:pPr>
-      <w:r>
-        <w:t xml:space="preserve">La lección alcanza a este libro. Las cuatro capas de HII-D están en una frase de las </w:t>
+        <w:t xml:space="preserve">Puesta en fila, la genealogía muestra un patrón. Casi ninguna de estas ideas era nueva. La auscultación se conocía desde los hipocráticos; Gordon y Holmes sospecharon el contagio puerperal antes que Semmelweis (Stang et al., 2022); al-Razi comparó grupos antes que Louis; Grinker dijo «biopsicosocial» antes que Engel, y Balint escribió en su primera página que su hallazgo no era el primero. Lo que cada uno aportó fue un procedimiento que volvió verificable una intuición vieja: un cilindro de madera y la autopsia, una tabla con dos clínicas, un recuento con la advertencia de la edad, un lenguaje formal, nueve preguntas en lugar de reglas, un grupo que se reúne cada semana. Las ideas que sobreviven son las que se vuelven una práctica que otro puede repetir y que puede desmentir a quien la propuso.</w:t>
+      </w:r>
+    </w:p>
+    <w:p>
+      <w:pPr>
+        <w:pStyle w:val="BodyJ"/>
+        <w:keepNext w:val="false"/>
+      </w:pPr>
+      <w:r>
+        <w:t xml:space="preserve">La misma lista muestra cuánto se equivocaron: Galeno, con una anatomía en parte animal; Laennec, con un ruido que no es patognomónico; Louis, que siguió sangrando; Bernard, con los promedios; Semmelweis, que tenía razón y la perdió en parte por insultar a quienes debía convencer; Ledley y Lusted, que dejaron fuera la generación de hipótesis; Engel, sin modo de priorizar. No fueron clínicos infalibles, sino clínicos cuyo método permitió corregirlos después, y ésa es la única forma de autoridad que este libro defiende (capítulo 15). Dos advertencias impiden hacer de esto un panteón. La genealogía es una selección casi entera europea y norteamericana, porque de ahí vienen las instituciones que formaron la medicina que se practica en Chile, no porque el razonamiento clínico haya nacido sólo ahí; al-Razi está para recordarlo. Y buscar antepasados tiene su propio sesgo: lo que parece anticipación genial suele ser lo que se parece a nosotros.</w:t>
+      </w:r>
+    </w:p>
+    <w:p>
+      <w:pPr>
+        <w:pStyle w:val="BodyJ"/>
+        <w:keepNext w:val="false"/>
+      </w:pPr>
+      <w:r>
+        <w:t xml:space="preserve">La lección alcanza a este libro. Las cuatro capas están en una frase de las </w:t>
       </w:r>
       <w:r>
         <w:rPr>
@@ -11293,7 +11247,7 @@
         <w:t xml:space="preserve">Epidemias</w:t>
       </w:r>
       <w:r>
-        <w:t xml:space="preserve">; la incertidumbre como algo que se estima y se escribe, en Louis; la decisión separada de la inferencia, en Ledley y Lusted y en Hill; el paciente como fuente de hechos, en Engel y Balint. El capítulo siguiente no descubre nada. Intenta lo mismo que hicieron ellos, con menos genio y más modestia: convertir una distinción vieja en un procedimiento escrito —una hoja, una frase medular, una cláusula de reapertura— que otro pueda leer, repetir y refutar. Si el método vale, será por eso; y si no, el propio capítulo dice qué evidencia lo demostraría.</w:t>
+        <w:t xml:space="preserve">; la incertidumbre que se estima y se escribe, en Louis; la decisión separada de la inferencia, en Ledley y Lusted y en Hill; el paciente como fuente de hechos, en Engel y Balint. El capítulo siguiente no descubre nada. Intenta lo mismo que ellos, con menos genio: convertir una distinción vieja en un procedimiento escrito que otro pueda leer, repetir y refutar, y decir de antemano qué evidencia lo refutaría.</w:t>
       </w:r>
     </w:p>
     <w:p>
@@ -20674,6 +20628,22 @@
           <w:b/>
           <w:bCs/>
         </w:rPr>
+        <w:t xml:space="preserve">Certeza de la evidencia (certainty of evidence).</w:t>
+      </w:r>
+      <w:r>
+        <w:t xml:space="preserve"> En GRADE, la seguridad de que el efecto verdadero queda a un lado de un umbral elegido; se califica en cuatro niveles (alta, moderada, baja y muy baja) y antes se llamó «calidad de la evidencia».</w:t>
+      </w:r>
+    </w:p>
+    <w:p>
+      <w:pPr>
+        <w:pStyle w:val="BodyJ"/>
+        <w:keepNext w:val="false"/>
+      </w:pPr>
+      <w:r>
+        <w:rPr>
+          <w:b/>
+          <w:bCs/>
+        </w:rPr>
         <w:t xml:space="preserve">Cierre prematuro (premature closure).</w:t>
       </w:r>
       <w:r>
@@ -21026,6 +20996,22 @@
           <w:b/>
           <w:bCs/>
         </w:rPr>
+        <w:t xml:space="preserve">Fallas activas y condiciones latentes (active failures / latent conditions).</w:t>
+      </w:r>
+      <w:r>
+        <w:t xml:space="preserve"> En el modelo de Reason, los actos inseguros de quien está en contacto directo con el paciente y las condiciones de diseño, gestión u organización que esperan en el sistema hasta combinarse con ellos; el error ocurre cuando los agujeros de varias defensas se alinean.</w:t>
+      </w:r>
+    </w:p>
+    <w:p>
+      <w:pPr>
+        <w:pStyle w:val="BodyJ"/>
+        <w:keepNext w:val="false"/>
+      </w:pPr>
+      <w:r>
+        <w:rPr>
+          <w:b/>
+          <w:bCs/>
+        </w:rPr>
         <w:t xml:space="preserve">Ficha de proceso*.</w:t>
       </w:r>
       <w:r>
@@ -21186,6 +21172,22 @@
           <w:b/>
           <w:bCs/>
         </w:rPr>
+        <w:t xml:space="preserve">Incertidumbre de la enfermedad (uncertainty in illness).</w:t>
+      </w:r>
+      <w:r>
+        <w:t xml:space="preserve"> Para Mishel, la incapacidad del paciente de determinar el significado de lo que le ocurre con su enfermedad: síntomas ambiguos, tratamientos complejos, información insuficiente, curso imprevisible.</w:t>
+      </w:r>
+    </w:p>
+    <w:p>
+      <w:pPr>
+        <w:pStyle w:val="BodyJ"/>
+        <w:keepNext w:val="false"/>
+      </w:pPr>
+      <w:r>
+        <w:rPr>
+          <w:b/>
+          <w:bCs/>
+        </w:rPr>
         <w:t xml:space="preserve">Incertidumbre epistémica (epistemic uncertainty).</w:t>
       </w:r>
       <w:r>
@@ -21638,6 +21640,22 @@
       </w:r>
       <w:r>
         <w:t xml:space="preserve"> Estudio del conocimiento obtenido mediante informes de otros. Coady defendió la confianza por defecto como condición de todo conocimiento compartido; Lackey añadió la vigilancia activa del oyente. La anamnesis es su caso clínico paradigmático.</w:t>
+      </w:r>
+    </w:p>
+    <w:p>
+      <w:pPr>
+        <w:pStyle w:val="BodyJ"/>
+        <w:keepNext w:val="false"/>
+      </w:pPr>
+      <w:r>
+        <w:rPr>
+          <w:b/>
+          <w:bCs/>
+        </w:rPr>
+        <w:t xml:space="preserve">Tolerancia a la incertidumbre (uncertainty tolerance).</w:t>
+      </w:r>
+      <w:r>
+        <w:t xml:space="preserve"> Disposición a reconocer y sobrellevar lo que no se sabe sin cerrarlo con una certeza ficticia; en los médicos se ha medido como estrés ante la incertidumbre y renuencia a revelarla (Gerrity).</w:t>
       </w:r>
     </w:p>
     <w:p>
@@ -21958,6 +21976,19 @@
         </w:numPr>
       </w:pPr>
       <w:r>
+        <w:t xml:space="preserve">Certeza de la evidencia (GRADE) y umbral — 3</w:t>
+      </w:r>
+    </w:p>
+    <w:p>
+      <w:pPr>
+        <w:pStyle w:val="BodyJ"/>
+        <w:keepNext w:val="false"/>
+        <w:numPr>
+          <w:ilvl w:val="0"/>
+          <w:numId w:val="5"/>
+        </w:numPr>
+      </w:pPr>
+      <w:r>
         <w:t xml:space="preserve">Cierre prematuro — 2, 7, CC (viñeta 6)</w:t>
       </w:r>
     </w:p>
@@ -22296,7 +22327,7 @@
         </w:numPr>
       </w:pPr>
       <w:r>
-        <w:t xml:space="preserve">Error diagnóstico: magnitud medida y estimada — 7</w:t>
+        <w:t xml:space="preserve">Error diagnóstico: magnitud medida y estimada, hospitalaria y ambulatoria — 7</w:t>
       </w:r>
     </w:p>
     <w:p>
@@ -22426,6 +22457,19 @@
         </w:numPr>
       </w:pPr>
       <w:r>
+        <w:t xml:space="preserve">Fallas activas y condiciones latentes (Reason; el queso suizo) — 7</w:t>
+      </w:r>
+    </w:p>
+    <w:p>
+      <w:pPr>
+        <w:pStyle w:val="BodyJ"/>
+        <w:keepNext w:val="false"/>
+        <w:numPr>
+          <w:ilvl w:val="0"/>
+          <w:numId w:val="5"/>
+        </w:numPr>
+      </w:pPr>
+      <w:r>
         <w:t xml:space="preserve">Falsabilidad del método HII-D — 17</w:t>
       </w:r>
     </w:p>
@@ -22699,7 +22743,7 @@
         </w:numPr>
       </w:pPr>
       <w:r>
-        <w:t xml:space="preserve">Incertidumbre: taxonomía y cartografía — 3; epistémica y aleatoria — 3; knightiana — 3</w:t>
+        <w:t xml:space="preserve">Incertidumbre: taxonomía y cartografía — 3; epistémica y aleatoria — 3; knightiana — 3; del paciente (Mishel) — 3; de la evidencia (GRADE) — 3</w:t>
       </w:r>
     </w:p>
     <w:p>
@@ -23363,6 +23407,19 @@
       </w:pPr>
       <w:r>
         <w:t xml:space="preserve">Testimonio del paciente — 1, 15; epistemología del testimonio (Coady, Lackey) — 15; testimonio de terceros y cuidadores — CC (viñeta 7)</w:t>
+      </w:r>
+    </w:p>
+    <w:p>
+      <w:pPr>
+        <w:pStyle w:val="BodyJ"/>
+        <w:keepNext w:val="false"/>
+        <w:numPr>
+          <w:ilvl w:val="0"/>
+          <w:numId w:val="5"/>
+        </w:numPr>
+      </w:pPr>
+      <w:r>
+        <w:t xml:space="preserve">Tolerancia a la incertidumbre (escala de Gerrity; gasto; bienestar del médico) — 3</w:t>
       </w:r>
     </w:p>
     <w:p>
@@ -23797,7 +23854,7 @@
         <w:t xml:space="preserve">Verificación de las referencias.</w:t>
       </w:r>
       <w:r>
-        <w:t xml:space="preserve"> Cada referencia se cotejó contra su fuente primaria antes de citarse, y el registro de ese cotejo —cifra por cifra— acompaña a las fuentes del libro. Cinco se verificaron sólo por metadatos o por fuentes secundarias, y el lector debe saberlo: Estrada, Isen y Young (1997), cuyo texto completo no estuvo accesible, por lo que el hallazgo se enuncia tal como lo formula el título y sin cifras; la frase de Maturana (1970), tomada de su reimpresión y de </w:t>
+        <w:t xml:space="preserve"> Cada referencia se cotejó contra su fuente primaria antes de citarse, y el registro de ese cotejo —cifra por cifra— acompaña a las fuentes del libro. Seis se verificaron sólo por metadatos o por fuentes secundarias, y el lector debe saberlo: Estrada, Isen y Young (1997), cuyo texto completo no estuvo accesible, por lo que el hallazgo se enuncia tal como lo formula el título y sin cifras; la frase de Maturana (1970), tomada de su reimpresión y de </w:t>
       </w:r>
       <w:r>
         <w:rPr>
@@ -23827,7 +23884,7 @@
         <w:t xml:space="preserve">Contemporary Review</w:t>
       </w:r>
       <w:r>
-        <w:t xml:space="preserve">; y el artículo de Ledley y Lusted (1959), cuyo texto completo no estuvo accesible, por lo que se describe por su subtítulo y por lo que dicen de él sus contemporáneos. Ninguna de ellas sostiene por sí sola una cifra ni una conducta. La distribución de citas es plana: de las 210 citas del cuerpo, ningún autor supera el 4%, y Croskerry, Norman y Kahneman —las voces dominantes de la literatura sobre razonamiento clínico— suman el 8%. Las referencias con siete o más autores listan los seis primeros seguidos de «et al.»; los ensayos firmados por un grupo conservan el nombre del grupo.</w:t>
+        <w:t xml:space="preserve">; el artículo de Ledley y Lusted (1959), cuyo texto completo no estuvo accesible, por lo que se describe por su subtítulo y por lo que dicen de él sus contemporáneos; y la teoría de Mishel (1988), cuya definición se tomó de los trabajos que la citan textualmente. Ninguna de ellas sostiene por sí sola una cifra ni una conducta. La distribución de citas es plana: de las 210 citas del cuerpo, ningún autor supera el 4%, y Croskerry, Norman y Kahneman —las voces dominantes de la literatura sobre razonamiento clínico— suman el 8%. Las referencias con siete o más autores listan los seis primeros seguidos de «et al.»; los ensayos firmados por un grupo conservan el nombre del grupo.</w:t>
       </w:r>
     </w:p>
     <w:p>
@@ -23967,6 +24024,25 @@
         <w:keepNext w:val="false"/>
       </w:pPr>
       <w:r>
+        <w:t xml:space="preserve">Allison, J. J., Kiefe, C. I., Cook, E. F., Gerrity, M. S., Orav, E. J., &amp; Centor, R. (1998). The association of physician attitudes about uncertainty and risk taking with resource use in a Medicare HMO. </w:t>
+      </w:r>
+      <w:r>
+        <w:rPr>
+          <w:i/>
+          <w:iCs/>
+        </w:rPr>
+        <w:t xml:space="preserve">Medical Decision Making, 18</w:t>
+      </w:r>
+      <w:r>
+        <w:t xml:space="preserve">(3), 320–329.</w:t>
+      </w:r>
+    </w:p>
+    <w:p>
+      <w:pPr>
+        <w:pStyle w:val="BodyJ"/>
+        <w:keepNext w:val="false"/>
+      </w:pPr>
+      <w:r>
         <w:t xml:space="preserve">Alves de Lima, A. (2008). Devolución constructiva: Una estrategia para mejorar el aprendizaje. </w:t>
       </w:r>
       <w:r>
@@ -24100,6 +24176,25 @@
         <w:keepNext w:val="false"/>
       </w:pPr>
       <w:r>
+        <w:t xml:space="preserve">Balshem, H., Helfand, M., Schünemann, H. J., Oxman, A. D., Kunz, R., Brozek, J., et al. (2011). GRADE guidelines: 3. Rating the quality of evidence. </w:t>
+      </w:r>
+      <w:r>
+        <w:rPr>
+          <w:i/>
+          <w:iCs/>
+        </w:rPr>
+        <w:t xml:space="preserve">Journal of Clinical Epidemiology, 64</w:t>
+      </w:r>
+      <w:r>
+        <w:t xml:space="preserve">(4), 401–406.</w:t>
+      </w:r>
+    </w:p>
+    <w:p>
+      <w:pPr>
+        <w:pStyle w:val="BodyJ"/>
+        <w:keepNext w:val="false"/>
+      </w:pPr>
+      <w:r>
         <w:t xml:space="preserve">Barrows, H. S., &amp; Feltovich, P. J. (1987). The clinical reasoning process. </w:t>
       </w:r>
       <w:r>
@@ -25107,6 +25202,25 @@
         <w:keepNext w:val="false"/>
       </w:pPr>
       <w:r>
+        <w:t xml:space="preserve">Gerrity, M. S., DeVellis, R. F., &amp; Earp, J. A. (1990). Physicians' reactions to uncertainty in patient care: A new measure and new insights. </w:t>
+      </w:r>
+      <w:r>
+        <w:rPr>
+          <w:i/>
+          <w:iCs/>
+        </w:rPr>
+        <w:t xml:space="preserve">Medical Care, 28</w:t>
+      </w:r>
+      <w:r>
+        <w:t xml:space="preserve">(8), 724–736.</w:t>
+      </w:r>
+    </w:p>
+    <w:p>
+      <w:pPr>
+        <w:pStyle w:val="BodyJ"/>
+        <w:keepNext w:val="false"/>
+      </w:pPr>
+      <w:r>
         <w:t xml:space="preserve">Gérvas, J., &amp; Pérez Fernández, M. (2013). </w:t>
       </w:r>
       <w:r>
@@ -25392,6 +25506,25 @@
         <w:keepNext w:val="false"/>
       </w:pPr>
       <w:r>
+        <w:t xml:space="preserve">Hancock, J., &amp; Mattick, K. (2020). Tolerance of ambiguity and psychological well-being in medical training: A systematic review. </w:t>
+      </w:r>
+      <w:r>
+        <w:rPr>
+          <w:i/>
+          <w:iCs/>
+        </w:rPr>
+        <w:t xml:space="preserve">Medical Education, 54</w:t>
+      </w:r>
+      <w:r>
+        <w:t xml:space="preserve">(2), 125–137.</w:t>
+      </w:r>
+    </w:p>
+    <w:p>
+      <w:pPr>
+        <w:pStyle w:val="BodyJ"/>
+        <w:keepNext w:val="false"/>
+      </w:pPr>
+      <w:r>
         <w:t xml:space="preserve">Hempel, C. G. (1965). Science and human values. In </w:t>
       </w:r>
       <w:r>
@@ -25601,6 +25734,25 @@
         <w:keepNext w:val="false"/>
       </w:pPr>
       <w:r>
+        <w:t xml:space="preserve">Hultcrantz, M., Rind, D., Akl, E. A., Treweek, S., Mustafa, R. A., Iorio, A., et al. (2017). The GRADE Working Group clarifies the construct of certainty of evidence. </w:t>
+      </w:r>
+      <w:r>
+        <w:rPr>
+          <w:i/>
+          <w:iCs/>
+        </w:rPr>
+        <w:t xml:space="preserve">Journal of Clinical Epidemiology, 87</w:t>
+      </w:r>
+      <w:r>
+        <w:t xml:space="preserve">, 4–13.</w:t>
+      </w:r>
+    </w:p>
+    <w:p>
+      <w:pPr>
+        <w:pStyle w:val="BodyJ"/>
+        <w:keepNext w:val="false"/>
+      </w:pPr>
+      <w:r>
         <w:t xml:space="preserve">Hunter, K. M. (1991). </w:t>
       </w:r>
       <w:r>
@@ -26409,6 +26561,44 @@
         <w:keepNext w:val="false"/>
       </w:pPr>
       <w:r>
+        <w:t xml:space="preserve">Mishel, M. H. (1988). Uncertainty in illness. </w:t>
+      </w:r>
+      <w:r>
+        <w:rPr>
+          <w:i/>
+          <w:iCs/>
+        </w:rPr>
+        <w:t xml:space="preserve">Image: Journal of Nursing Scholarship, 20</w:t>
+      </w:r>
+      <w:r>
+        <w:t xml:space="preserve">(4), 225–232.</w:t>
+      </w:r>
+    </w:p>
+    <w:p>
+      <w:pPr>
+        <w:pStyle w:val="BodyJ"/>
+        <w:keepNext w:val="false"/>
+      </w:pPr>
+      <w:r>
+        <w:t xml:space="preserve">Mishel, M. H. (1990). Reconceptualization of the uncertainty in illness theory. </w:t>
+      </w:r>
+      <w:r>
+        <w:rPr>
+          <w:i/>
+          <w:iCs/>
+        </w:rPr>
+        <w:t xml:space="preserve">Image: Journal of Nursing Scholarship, 22</w:t>
+      </w:r>
+      <w:r>
+        <w:t xml:space="preserve">(4), 256–262.</w:t>
+      </w:r>
+    </w:p>
+    <w:p>
+      <w:pPr>
+        <w:pStyle w:val="BodyJ"/>
+        <w:keepNext w:val="false"/>
+      </w:pPr>
+      <w:r>
         <w:t xml:space="preserve">Monteiro, S., &amp; Norman, G. (2013). Diagnostic reasoning: Where we've been, where we're going. </w:t>
       </w:r>
       <w:r>
@@ -27055,6 +27245,25 @@
         <w:keepNext w:val="false"/>
       </w:pPr>
       <w:r>
+        <w:t xml:space="preserve">Reason, J. (2000). Human error: Models and management. </w:t>
+      </w:r>
+      <w:r>
+        <w:rPr>
+          <w:i/>
+          <w:iCs/>
+        </w:rPr>
+        <w:t xml:space="preserve">BMJ, 320</w:t>
+      </w:r>
+      <w:r>
+        <w:t xml:space="preserve">(7237), 768–770.</w:t>
+      </w:r>
+    </w:p>
+    <w:p>
+      <w:pPr>
+        <w:pStyle w:val="BodyJ"/>
+        <w:keepNext w:val="false"/>
+      </w:pPr>
+      <w:r>
         <w:t xml:space="preserve">Riquelme, A., Méndez, B., de la Fuente, P., Padilla, O., Benaglio, C., Sirhan, M., et al. (2011). Desarrollo y validación de encuesta de percepción del portafolio en estudiantes de medicina de pregrado. </w:t>
       </w:r>
       <w:r>
@@ -27454,6 +27663,25 @@
         <w:keepNext w:val="false"/>
       </w:pPr>
       <w:r>
+        <w:t xml:space="preserve">Singh, H., Meyer, A. N. D., &amp; Thomas, E. J. (2014). The frequency of diagnostic errors in outpatient care: Estimations from three large observational studies involving US adult populations. </w:t>
+      </w:r>
+      <w:r>
+        <w:rPr>
+          <w:i/>
+          <w:iCs/>
+        </w:rPr>
+        <w:t xml:space="preserve">BMJ Quality &amp; Safety, 23</w:t>
+      </w:r>
+      <w:r>
+        <w:t xml:space="preserve">(9), 727–731.</w:t>
+      </w:r>
+    </w:p>
+    <w:p>
+      <w:pPr>
+        <w:pStyle w:val="BodyJ"/>
+        <w:keepNext w:val="false"/>
+      </w:pPr>
+      <w:r>
         <w:t xml:space="preserve">Singhal, K., Azizi, S., Tu, T., Mahdavi, S. S., Wei, J., Chung, H. W., et al. (2023). Large language models encode clinical knowledge. </w:t>
       </w:r>
       <w:r>
@@ -27560,6 +27788,25 @@
       </w:r>
       <w:r>
         <w:t xml:space="preserve">(2), 164–174.</w:t>
+      </w:r>
+    </w:p>
+    <w:p>
+      <w:pPr>
+        <w:pStyle w:val="BodyJ"/>
+        <w:keepNext w:val="false"/>
+      </w:pPr>
+      <w:r>
+        <w:t xml:space="preserve">Strout, T. D., Hillen, M., Gutheil, C., Anderson, E., Hutchinson, R., Ward, H., et al. (2018). Tolerance of uncertainty: A systematic review of health and healthcare-related outcomes. </w:t>
+      </w:r>
+      <w:r>
+        <w:rPr>
+          <w:i/>
+          <w:iCs/>
+        </w:rPr>
+        <w:t xml:space="preserve">Patient Education and Counseling, 101</w:t>
+      </w:r>
+      <w:r>
+        <w:t xml:space="preserve">(9), 1518–1537.</w:t>
       </w:r>
     </w:p>
     <w:p>

</xml_diff>